<commit_message>
Docs: cite Gale & Shapley (1962) for the algorithm and for order independence
Order independence follows from their optimality theorem (the unique
student-optimal stable matching; the proof does not depend on the order of
proposals), stated explicitly by McVitie & Wilson (1970). References added to
docs/algorithm.md, so they are in the parents' and teachers' manuals too.

Co-Authored-By: Claude Opus 5.5 <noreply@anthropic.com>
Claude-Session: https://claude.ai/code/session_014bv1rucCSvWvUULong8T8B
</commit_message>
<xml_diff>
--- a/docs/Egxeiridio_Ekpaideutikoi.docx
+++ b/docs/Egxeiridio_Ekpaideutikoi.docx
@@ -1033,7 +1033,7 @@
         <w:t xml:space="preserve"> </w:t>
       </w:r>
       <w:r>
-        <w:t xml:space="preserve">— γνωστό και ως</w:t>
+        <w:t xml:space="preserve">(Gale &amp; Shapley, 1962) — γνωστό και ως</w:t>
       </w:r>
       <w:r>
         <w:t xml:space="preserve"> </w:t>
@@ -1417,7 +1417,7 @@
         <w:t xml:space="preserve"> </w:t>
       </w:r>
       <w:r>
-        <w:t xml:space="preserve">— πρώτα ο ένας όμιλος ή ο άλλος, όλοι μαζί σε γύρους, ή μία αίτηση τη φορά με οποιαδήποτε σειρά (McVitie &amp; Wilson, 1970).</w:t>
+        <w:t xml:space="preserve">— πρώτα ο ένας όμιλος ή ο άλλος, όλοι μαζί σε γύρους, ή μία αίτηση τη φορά με οποιαδήποτε σειρά.</w:t>
       </w:r>
     </w:p>
     <w:p>
@@ -1425,7 +1425,7 @@
         <w:pStyle w:val="FirstParagraph"/>
       </w:pPr>
       <w:r>
-        <w:t xml:space="preserve">Αυτό ισχύει επειδή οι αριθμοί κλήρωσης είναι σταθεροί από την αρχή. Οι γύροι είναι απλώς ένας βολικός τρόπος να γίνει ο υπολογισμός. Η πλατφόρμα ελέγχει αυτή την ιδιότητα αυτόματα σε κάθε αλλαγή του κώδικα: σε εκατοντάδες τυχαία σενάρια, ο υπολογισμός «μία αίτηση τη φορά, με τυχαία σειρά» δίνει πάντα το ίδιο αποτέλεσμα με τους γύρους.</w:t>
+        <w:t xml:space="preserve">Προκύπτει από το βασικό θεώρημα των Gale &amp; Shapley (1962): ο αλγόριθμος καταλήγει πάντα στην καλύτερη για τους μαθητές ευσταθή κατανομή, που είναι μοναδική, και η απόδειξή τους δεν εξαρτάται από τη σειρά των αιτήσεων. Ρητά: McVitie &amp; Wilson (1970). Αυτό ισχύει επειδή οι προτεραιότητες —και οι αριθμοί κλήρωσης— είναι σταθεροί από την αρχή. Οι γύροι είναι απλώς ένας βολικός τρόπος να γίνει ο υπολογισμός. Η πλατφόρμα ελέγχει αυτή την ιδιότητα αυτόματα σε κάθε αλλαγή του κώδικα: σε εκατοντάδες τυχαία σενάρια, ο υπολογισμός «μία αίτηση τη φορά, με τυχαία σειρά» δίνει πάντα το ίδιο αποτέλεσμα με τους γύρους.</w:t>
       </w:r>
     </w:p>
     <w:bookmarkEnd w:id="18"/>
@@ -3107,6 +3107,75 @@
         </w:pict>
       </w:r>
     </w:p>
+    <w:p>
+      <w:pPr>
+        <w:pStyle w:val="FirstParagraph"/>
+      </w:pPr>
+      <w:r>
+        <w:rPr>
+          <w:b/>
+          <w:bCs/>
+        </w:rPr>
+        <w:t xml:space="preserve">Βιβλιογραφία</w:t>
+      </w:r>
+    </w:p>
+    <w:p>
+      <w:pPr>
+        <w:pStyle w:val="Compact"/>
+        <w:numPr>
+          <w:ilvl w:val="0"/>
+          <w:numId w:val="1019"/>
+        </w:numPr>
+      </w:pPr>
+      <w:r>
+        <w:t xml:space="preserve">Gale, D., &amp; Shapley, L. S. (1962). College admissions and the stability of marriage.</w:t>
+      </w:r>
+      <w:r>
+        <w:t xml:space="preserve"> </w:t>
+      </w:r>
+      <w:r>
+        <w:rPr>
+          <w:i/>
+          <w:iCs/>
+        </w:rPr>
+        <w:t xml:space="preserve">The American Mathematical Monthly</w:t>
+      </w:r>
+      <w:r>
+        <w:t xml:space="preserve">, 69(1), 9–15.</w:t>
+      </w:r>
+    </w:p>
+    <w:p>
+      <w:pPr>
+        <w:pStyle w:val="Compact"/>
+        <w:numPr>
+          <w:ilvl w:val="0"/>
+          <w:numId w:val="1019"/>
+        </w:numPr>
+      </w:pPr>
+      <w:r>
+        <w:t xml:space="preserve">McVitie, D. G., &amp; Wilson, L. B. (1970). Stable marriage assignment for unequal sets.</w:t>
+      </w:r>
+      <w:r>
+        <w:t xml:space="preserve"> </w:t>
+      </w:r>
+      <w:r>
+        <w:rPr>
+          <w:i/>
+          <w:iCs/>
+        </w:rPr>
+        <w:t xml:space="preserve">BIT Numerical Mathematics</w:t>
+      </w:r>
+      <w:r>
+        <w:t xml:space="preserve">, 10(3), 295–309.</w:t>
+      </w:r>
+    </w:p>
+    <w:p>
+      <w:r>
+        <w:pict>
+          <v:rect style="width:0;height:1.5pt" o:hralign="center" o:hrstd="t" o:hr="t"/>
+        </w:pict>
+      </w:r>
+    </w:p>
     <w:bookmarkEnd w:id="24"/>
     <w:bookmarkEnd w:id="25"/>
     <w:bookmarkStart w:id="26" w:name="Xcfb0e64748ccbe51b1f22b71ff830af063577b7"/>
@@ -3303,7 +3372,7 @@
         <w:pStyle w:val="Compact"/>
         <w:numPr>
           <w:ilvl w:val="0"/>
-          <w:numId w:val="1019"/>
+          <w:numId w:val="1020"/>
         </w:numPr>
       </w:pPr>
       <w:r>
@@ -3351,7 +3420,7 @@
         <w:pStyle w:val="Compact"/>
         <w:numPr>
           <w:ilvl w:val="0"/>
-          <w:numId w:val="1019"/>
+          <w:numId w:val="1020"/>
         </w:numPr>
       </w:pPr>
       <w:r>
@@ -3379,7 +3448,7 @@
         <w:pStyle w:val="Compact"/>
         <w:numPr>
           <w:ilvl w:val="0"/>
-          <w:numId w:val="1019"/>
+          <w:numId w:val="1020"/>
         </w:numPr>
       </w:pPr>
       <w:r>
@@ -3407,7 +3476,7 @@
         <w:pStyle w:val="Compact"/>
         <w:numPr>
           <w:ilvl w:val="0"/>
-          <w:numId w:val="1019"/>
+          <w:numId w:val="1020"/>
         </w:numPr>
       </w:pPr>
       <w:r>
@@ -3462,7 +3531,7 @@
         <w:pStyle w:val="Compact"/>
         <w:numPr>
           <w:ilvl w:val="0"/>
-          <w:numId w:val="1020"/>
+          <w:numId w:val="1021"/>
         </w:numPr>
       </w:pPr>
       <w:r>
@@ -3484,7 +3553,7 @@
         <w:pStyle w:val="Compact"/>
         <w:numPr>
           <w:ilvl w:val="0"/>
-          <w:numId w:val="1020"/>
+          <w:numId w:val="1021"/>
         </w:numPr>
       </w:pPr>
       <w:r>
@@ -3506,7 +3575,7 @@
         <w:pStyle w:val="Compact"/>
         <w:numPr>
           <w:ilvl w:val="0"/>
-          <w:numId w:val="1020"/>
+          <w:numId w:val="1021"/>
         </w:numPr>
       </w:pPr>
       <w:r>
@@ -3623,7 +3692,7 @@
         <w:pStyle w:val="Compact"/>
         <w:numPr>
           <w:ilvl w:val="0"/>
-          <w:numId w:val="1021"/>
+          <w:numId w:val="1022"/>
         </w:numPr>
       </w:pPr>
       <w:r>
@@ -3661,7 +3730,7 @@
         <w:pStyle w:val="Compact"/>
         <w:numPr>
           <w:ilvl w:val="0"/>
-          <w:numId w:val="1021"/>
+          <w:numId w:val="1022"/>
         </w:numPr>
       </w:pPr>
       <w:r>
@@ -3699,7 +3768,7 @@
         <w:pStyle w:val="Compact"/>
         <w:numPr>
           <w:ilvl w:val="0"/>
-          <w:numId w:val="1021"/>
+          <w:numId w:val="1022"/>
         </w:numPr>
       </w:pPr>
       <w:r>
@@ -3719,7 +3788,7 @@
         <w:pStyle w:val="Compact"/>
         <w:numPr>
           <w:ilvl w:val="0"/>
-          <w:numId w:val="1022"/>
+          <w:numId w:val="1023"/>
         </w:numPr>
       </w:pPr>
       <w:r>
@@ -3741,7 +3810,7 @@
         <w:pStyle w:val="Compact"/>
         <w:numPr>
           <w:ilvl w:val="0"/>
-          <w:numId w:val="1022"/>
+          <w:numId w:val="1023"/>
         </w:numPr>
       </w:pPr>
       <w:r>
@@ -3771,15 +3840,15 @@
         <w:t xml:space="preserve"> </w:t>
       </w:r>
       <w:r>
-        <w:t xml:space="preserve">με την οποία εξετάζονται οι αιτήσεις — σε γύρους με όλους τους ομίλους ταυτόχρονα, ή μία αίτηση τη φορά με οποιαδήποτε σειρά (McVitie &amp; Wilson, 1970). Γι' αυτό δεν υπάρχει όμιλος που «κληρώνεται πρώτος»: οι γύροι είναι μόνο ένας τρόπος υπολογισμού ενός αποτελέσματος που καθορίζεται πλήρως από τις λίστες, τις προτεραιότητες και τις χωρητικότητες. Η ιδιότητα ελέγχεται αυτόματα: σε 200 τυχαία στιγμιότυπα, ο υπολογισμός «μία αίτηση τη φορά, με τυχαία σειρά» (τρεις διαφορετικές σειρές ανά στιγμιότυπο) δίνει πάντα το ίδιο αποτέλεσμα με τους γύρους.</w:t>
-      </w:r>
-    </w:p>
-    <w:p>
-      <w:pPr>
-        <w:pStyle w:val="Compact"/>
-        <w:numPr>
-          <w:ilvl w:val="0"/>
-          <w:numId w:val="1022"/>
+        <w:t xml:space="preserve">με την οποία εξετάζονται οι αιτήσεις — σε γύρους με όλους τους ομίλους ταυτόχρονα, ή μία αίτηση τη φορά με οποιαδήποτε σειρά. Προκύπτει από το θεώρημα βελτιστότητας των Gale &amp; Shapley (1962) —το αποτέλεσμα είναι η μοναδική βέλτιστη για τους μαθητές ευσταθής αντιστοίχιση, και η απόδειξη δεν εξαρτάται από τη σειρά των αιτήσεων— και διατυπώνεται ρητά από τους McVitie &amp; Wilson (1970). Γι' αυτό δεν υπάρχει όμιλος που «κληρώνεται πρώτος»: οι γύροι είναι μόνο ένας τρόπος υπολογισμού ενός αποτελέσματος που καθορίζεται πλήρως από τις λίστες, τις προτεραιότητες και τις χωρητικότητες. Η ιδιότητα ελέγχεται αυτόματα: σε 200 τυχαία στιγμιότυπα, ο υπολογισμός «μία αίτηση τη φορά, με τυχαία σειρά» (τρεις διαφορετικές σειρές ανά στιγμιότυπο) δίνει πάντα το ίδιο αποτέλεσμα με τους γύρους.</w:t>
+      </w:r>
+    </w:p>
+    <w:p>
+      <w:pPr>
+        <w:pStyle w:val="Compact"/>
+        <w:numPr>
+          <w:ilvl w:val="0"/>
+          <w:numId w:val="1023"/>
         </w:numPr>
       </w:pPr>
       <w:r>
@@ -3801,7 +3870,7 @@
         <w:pStyle w:val="Compact"/>
         <w:numPr>
           <w:ilvl w:val="0"/>
-          <w:numId w:val="1022"/>
+          <w:numId w:val="1023"/>
         </w:numPr>
       </w:pPr>
       <w:r>
@@ -3823,7 +3892,7 @@
         <w:pStyle w:val="Compact"/>
         <w:numPr>
           <w:ilvl w:val="0"/>
-          <w:numId w:val="1022"/>
+          <w:numId w:val="1023"/>
         </w:numPr>
       </w:pPr>
       <w:r>
@@ -4245,7 +4314,7 @@
         <w:pStyle w:val="Compact"/>
         <w:numPr>
           <w:ilvl w:val="0"/>
-          <w:numId w:val="1023"/>
+          <w:numId w:val="1024"/>
         </w:numPr>
       </w:pPr>
       <w:r>
@@ -4273,7 +4342,7 @@
         <w:pStyle w:val="Compact"/>
         <w:numPr>
           <w:ilvl w:val="0"/>
-          <w:numId w:val="1023"/>
+          <w:numId w:val="1024"/>
         </w:numPr>
       </w:pPr>
       <w:r>
@@ -4298,7 +4367,7 @@
         <w:pStyle w:val="Compact"/>
         <w:numPr>
           <w:ilvl w:val="0"/>
-          <w:numId w:val="1023"/>
+          <w:numId w:val="1024"/>
         </w:numPr>
       </w:pPr>
       <w:r>
@@ -4504,7 +4573,7 @@
         <w:pStyle w:val="Compact"/>
         <w:numPr>
           <w:ilvl w:val="0"/>
-          <w:numId w:val="1024"/>
+          <w:numId w:val="1025"/>
         </w:numPr>
       </w:pPr>
       <w:r>
@@ -4526,7 +4595,7 @@
         <w:pStyle w:val="Compact"/>
         <w:numPr>
           <w:ilvl w:val="0"/>
-          <w:numId w:val="1024"/>
+          <w:numId w:val="1025"/>
         </w:numPr>
       </w:pPr>
       <w:r>
@@ -4551,7 +4620,7 @@
         <w:pStyle w:val="Compact"/>
         <w:numPr>
           <w:ilvl w:val="0"/>
-          <w:numId w:val="1024"/>
+          <w:numId w:val="1025"/>
         </w:numPr>
       </w:pPr>
       <w:r>
@@ -4602,7 +4671,7 @@
         <w:pStyle w:val="Compact"/>
         <w:numPr>
           <w:ilvl w:val="0"/>
-          <w:numId w:val="1024"/>
+          <w:numId w:val="1025"/>
         </w:numPr>
       </w:pPr>
       <w:r>
@@ -4708,7 +4777,7 @@
         <w:pStyle w:val="Compact"/>
         <w:numPr>
           <w:ilvl w:val="0"/>
-          <w:numId w:val="1025"/>
+          <w:numId w:val="1026"/>
         </w:numPr>
       </w:pPr>
       <w:r>
@@ -4720,7 +4789,7 @@
         <w:pStyle w:val="Compact"/>
         <w:numPr>
           <w:ilvl w:val="0"/>
-          <w:numId w:val="1025"/>
+          <w:numId w:val="1026"/>
         </w:numPr>
       </w:pPr>
       <w:r>
@@ -4748,7 +4817,7 @@
         <w:pStyle w:val="Compact"/>
         <w:numPr>
           <w:ilvl w:val="0"/>
-          <w:numId w:val="1025"/>
+          <w:numId w:val="1026"/>
         </w:numPr>
       </w:pPr>
       <w:r>
@@ -4760,7 +4829,7 @@
         <w:pStyle w:val="Compact"/>
         <w:numPr>
           <w:ilvl w:val="0"/>
-          <w:numId w:val="1025"/>
+          <w:numId w:val="1026"/>
         </w:numPr>
       </w:pPr>
       <w:r>
@@ -4780,7 +4849,7 @@
         <w:pStyle w:val="Compact"/>
         <w:numPr>
           <w:ilvl w:val="0"/>
-          <w:numId w:val="1026"/>
+          <w:numId w:val="1027"/>
         </w:numPr>
       </w:pPr>
       <w:r>
@@ -4808,7 +4877,7 @@
         <w:pStyle w:val="Compact"/>
         <w:numPr>
           <w:ilvl w:val="0"/>
-          <w:numId w:val="1026"/>
+          <w:numId w:val="1027"/>
         </w:numPr>
       </w:pPr>
       <w:r>
@@ -4836,7 +4905,7 @@
         <w:pStyle w:val="Compact"/>
         <w:numPr>
           <w:ilvl w:val="0"/>
-          <w:numId w:val="1026"/>
+          <w:numId w:val="1027"/>
         </w:numPr>
       </w:pPr>
       <w:r>
@@ -4878,7 +4947,7 @@
         <w:pStyle w:val="Compact"/>
         <w:numPr>
           <w:ilvl w:val="0"/>
-          <w:numId w:val="1027"/>
+          <w:numId w:val="1028"/>
         </w:numPr>
       </w:pPr>
       <w:r>
@@ -4900,7 +4969,7 @@
         <w:pStyle w:val="Compact"/>
         <w:numPr>
           <w:ilvl w:val="0"/>
-          <w:numId w:val="1027"/>
+          <w:numId w:val="1028"/>
         </w:numPr>
       </w:pPr>
       <w:r>
@@ -4938,7 +5007,7 @@
         <w:pStyle w:val="Compact"/>
         <w:numPr>
           <w:ilvl w:val="0"/>
-          <w:numId w:val="1027"/>
+          <w:numId w:val="1028"/>
         </w:numPr>
       </w:pPr>
       <w:r>
@@ -4977,7 +5046,7 @@
         <w:pStyle w:val="Compact"/>
         <w:numPr>
           <w:ilvl w:val="0"/>
-          <w:numId w:val="1028"/>
+          <w:numId w:val="1029"/>
         </w:numPr>
       </w:pPr>
       <w:r>
@@ -5002,7 +5071,7 @@
         <w:pStyle w:val="Compact"/>
         <w:numPr>
           <w:ilvl w:val="0"/>
-          <w:numId w:val="1028"/>
+          <w:numId w:val="1029"/>
         </w:numPr>
       </w:pPr>
       <w:r>
@@ -5027,7 +5096,7 @@
         <w:pStyle w:val="Compact"/>
         <w:numPr>
           <w:ilvl w:val="0"/>
-          <w:numId w:val="1028"/>
+          <w:numId w:val="1029"/>
         </w:numPr>
       </w:pPr>
       <w:r>
@@ -5052,7 +5121,7 @@
         <w:pStyle w:val="Compact"/>
         <w:numPr>
           <w:ilvl w:val="0"/>
-          <w:numId w:val="1028"/>
+          <w:numId w:val="1029"/>
         </w:numPr>
       </w:pPr>
       <w:r>
@@ -5077,7 +5146,7 @@
         <w:pStyle w:val="Compact"/>
         <w:numPr>
           <w:ilvl w:val="0"/>
-          <w:numId w:val="1028"/>
+          <w:numId w:val="1029"/>
         </w:numPr>
       </w:pPr>
       <w:r>
@@ -5102,7 +5171,7 @@
         <w:pStyle w:val="Compact"/>
         <w:numPr>
           <w:ilvl w:val="0"/>
-          <w:numId w:val="1028"/>
+          <w:numId w:val="1029"/>
         </w:numPr>
       </w:pPr>
       <w:r>
@@ -5127,7 +5196,7 @@
         <w:pStyle w:val="Compact"/>
         <w:numPr>
           <w:ilvl w:val="0"/>
-          <w:numId w:val="1028"/>
+          <w:numId w:val="1029"/>
         </w:numPr>
       </w:pPr>
       <w:r>
@@ -5152,7 +5221,7 @@
         <w:pStyle w:val="Compact"/>
         <w:numPr>
           <w:ilvl w:val="0"/>
-          <w:numId w:val="1028"/>
+          <w:numId w:val="1029"/>
         </w:numPr>
       </w:pPr>
       <w:r>
@@ -5177,7 +5246,7 @@
         <w:pStyle w:val="Compact"/>
         <w:numPr>
           <w:ilvl w:val="0"/>
-          <w:numId w:val="1028"/>
+          <w:numId w:val="1029"/>
         </w:numPr>
       </w:pPr>
       <w:r>
@@ -5202,7 +5271,7 @@
         <w:pStyle w:val="Compact"/>
         <w:numPr>
           <w:ilvl w:val="0"/>
-          <w:numId w:val="1028"/>
+          <w:numId w:val="1029"/>
         </w:numPr>
       </w:pPr>
       <w:r>
@@ -5227,7 +5296,7 @@
         <w:pStyle w:val="Compact"/>
         <w:numPr>
           <w:ilvl w:val="0"/>
-          <w:numId w:val="1028"/>
+          <w:numId w:val="1029"/>
         </w:numPr>
       </w:pPr>
       <w:r>
@@ -5252,7 +5321,7 @@
         <w:pStyle w:val="Compact"/>
         <w:numPr>
           <w:ilvl w:val="0"/>
-          <w:numId w:val="1028"/>
+          <w:numId w:val="1029"/>
         </w:numPr>
       </w:pPr>
       <w:r>
@@ -5277,7 +5346,7 @@
         <w:pStyle w:val="Compact"/>
         <w:numPr>
           <w:ilvl w:val="0"/>
-          <w:numId w:val="1028"/>
+          <w:numId w:val="1029"/>
         </w:numPr>
       </w:pPr>
       <w:r>
@@ -5302,7 +5371,7 @@
         <w:pStyle w:val="Compact"/>
         <w:numPr>
           <w:ilvl w:val="0"/>
-          <w:numId w:val="1028"/>
+          <w:numId w:val="1029"/>
         </w:numPr>
       </w:pPr>
       <w:r>
@@ -5327,7 +5396,7 @@
         <w:pStyle w:val="Compact"/>
         <w:numPr>
           <w:ilvl w:val="0"/>
-          <w:numId w:val="1028"/>
+          <w:numId w:val="1029"/>
         </w:numPr>
       </w:pPr>
       <w:r>
@@ -5352,7 +5421,7 @@
         <w:pStyle w:val="Compact"/>
         <w:numPr>
           <w:ilvl w:val="0"/>
-          <w:numId w:val="1028"/>
+          <w:numId w:val="1029"/>
         </w:numPr>
       </w:pPr>
       <w:r>
@@ -5377,7 +5446,7 @@
         <w:pStyle w:val="Compact"/>
         <w:numPr>
           <w:ilvl w:val="0"/>
-          <w:numId w:val="1028"/>
+          <w:numId w:val="1029"/>
         </w:numPr>
       </w:pPr>
       <w:r>
@@ -5405,7 +5474,7 @@
         <w:pStyle w:val="Compact"/>
         <w:numPr>
           <w:ilvl w:val="0"/>
-          <w:numId w:val="1028"/>
+          <w:numId w:val="1029"/>
         </w:numPr>
       </w:pPr>
       <w:r>
@@ -5430,7 +5499,7 @@
         <w:pStyle w:val="Compact"/>
         <w:numPr>
           <w:ilvl w:val="0"/>
-          <w:numId w:val="1028"/>
+          <w:numId w:val="1029"/>
         </w:numPr>
       </w:pPr>
       <w:r>
@@ -5455,7 +5524,7 @@
         <w:pStyle w:val="Compact"/>
         <w:numPr>
           <w:ilvl w:val="0"/>
-          <w:numId w:val="1028"/>
+          <w:numId w:val="1029"/>
         </w:numPr>
       </w:pPr>
       <w:r>
@@ -5480,7 +5549,7 @@
         <w:pStyle w:val="Compact"/>
         <w:numPr>
           <w:ilvl w:val="0"/>
-          <w:numId w:val="1028"/>
+          <w:numId w:val="1029"/>
         </w:numPr>
       </w:pPr>
       <w:r>
@@ -5505,7 +5574,7 @@
         <w:pStyle w:val="Compact"/>
         <w:numPr>
           <w:ilvl w:val="0"/>
-          <w:numId w:val="1028"/>
+          <w:numId w:val="1029"/>
         </w:numPr>
       </w:pPr>
       <w:r>
@@ -5530,7 +5599,7 @@
         <w:pStyle w:val="Compact"/>
         <w:numPr>
           <w:ilvl w:val="0"/>
-          <w:numId w:val="1028"/>
+          <w:numId w:val="1029"/>
         </w:numPr>
       </w:pPr>
       <w:r>
@@ -5555,7 +5624,7 @@
         <w:pStyle w:val="Compact"/>
         <w:numPr>
           <w:ilvl w:val="0"/>
-          <w:numId w:val="1028"/>
+          <w:numId w:val="1029"/>
         </w:numPr>
       </w:pPr>
       <w:r>
@@ -5580,7 +5649,7 @@
         <w:pStyle w:val="Compact"/>
         <w:numPr>
           <w:ilvl w:val="0"/>
-          <w:numId w:val="1028"/>
+          <w:numId w:val="1029"/>
         </w:numPr>
       </w:pPr>
       <w:r>
@@ -5605,7 +5674,7 @@
         <w:pStyle w:val="Compact"/>
         <w:numPr>
           <w:ilvl w:val="0"/>
-          <w:numId w:val="1028"/>
+          <w:numId w:val="1029"/>
         </w:numPr>
       </w:pPr>
       <w:r>
@@ -6098,6 +6167,9 @@
     <w:abstractNumId w:val="991"/>
   </w:num>
   <w:num w:numId="1021">
+    <w:abstractNumId w:val="991"/>
+  </w:num>
+  <w:num w:numId="1022">
     <w:abstractNumId w:val="99411"/>
     <w:lvlOverride w:ilvl="0">
       <w:startOverride w:val="1"/>
@@ -6127,9 +6199,6 @@
       <w:startOverride w:val="1"/>
     </w:lvlOverride>
   </w:num>
-  <w:num w:numId="1022">
-    <w:abstractNumId w:val="991"/>
-  </w:num>
   <w:num w:numId="1023">
     <w:abstractNumId w:val="991"/>
   </w:num>
@@ -6137,6 +6206,9 @@
     <w:abstractNumId w:val="991"/>
   </w:num>
   <w:num w:numId="1025">
+    <w:abstractNumId w:val="991"/>
+  </w:num>
+  <w:num w:numId="1026">
     <w:abstractNumId w:val="99411"/>
     <w:lvlOverride w:ilvl="0">
       <w:startOverride w:val="1"/>
@@ -6166,13 +6238,13 @@
       <w:startOverride w:val="1"/>
     </w:lvlOverride>
   </w:num>
-  <w:num w:numId="1026">
-    <w:abstractNumId w:val="991"/>
-  </w:num>
   <w:num w:numId="1027">
     <w:abstractNumId w:val="991"/>
   </w:num>
   <w:num w:numId="1028">
+    <w:abstractNumId w:val="991"/>
+  </w:num>
+  <w:num w:numId="1029">
     <w:abstractNumId w:val="991"/>
   </w:num>
 </w:numbering>

</xml_diff>

<commit_message>
Teacher lists: admin-only capacity, checkbox picker, bulk Excel import
- Capacity is set only by the admin; a teacher's saved capacity is ignored.
- Teacher page: checkboxes with grade filter, search and "only selected";
  no ordering (a list never exceeds capacity, so order cannot matter).
- Admin: download one Excel per club (zip), teachers mark X or delete rows,
  upload all files back with a preview; imported lists replace existing ones.
  A combined "club code + AM" table is accepted as well.
- Help, manuals, SPEC, README and the clubs template updated; docs rebuilt.

Co-Authored-By: Claude Opus 5.5 <noreply@anthropic.com>
Claude-Session: https://claude.ai/code/session_014bv1rucCSvWvUULong8T8B
</commit_message>
<xml_diff>
--- a/docs/Egxeiridio_Ekpaideutikoi.docx
+++ b/docs/Egxeiridio_Ekpaideutikoi.docx
@@ -20,7 +20,7 @@
           <w:i/>
           <w:iCs/>
         </w:rPr>
-        <w:t xml:space="preserve">Πώς ορίζετε τη χωρητικότητα του ομίλου σας και τους μαθητές που προτιμάτε, τι σημαίνει η λίστα σας στην κατανομή — και πώς γίνεται η κατανομή.</w:t>
+        <w:t xml:space="preserve">Πώς ορίζετε τους μαθητές που προτιμάτε για τον όμιλό σας, τι σημαίνει η λίστα σας στην κατανομή — και πώς γίνεται η κατανομή.</w:t>
       </w:r>
     </w:p>
     <w:p>
@@ -57,19 +57,28 @@
         <w:t xml:space="preserve">πριν ανοίξουν οι δηλώσεις των γονέων</w:t>
       </w:r>
       <w:r>
-        <w:t xml:space="preserve">:</w:t>
-      </w:r>
-    </w:p>
-    <w:p>
-      <w:pPr>
-        <w:pStyle w:val="Compact"/>
-        <w:numPr>
-          <w:ilvl w:val="0"/>
-          <w:numId w:val="1001"/>
-        </w:numPr>
-      </w:pPr>
-      <w:r>
-        <w:t xml:space="preserve">τη</w:t>
+        <w:t xml:space="preserve">, προαιρετικά, τους</w:t>
+      </w:r>
+      <w:r>
+        <w:t xml:space="preserve"> </w:t>
+      </w:r>
+      <w:r>
+        <w:rPr>
+          <w:b/>
+          <w:bCs/>
+        </w:rPr>
+        <w:t xml:space="preserve">μαθητές που προτιμάτε</w:t>
+      </w:r>
+      <w:r>
+        <w:t xml:space="preserve">.</w:t>
+      </w:r>
+    </w:p>
+    <w:p>
+      <w:pPr>
+        <w:pStyle w:val="BodyText"/>
+      </w:pPr>
+      <w:r>
+        <w:t xml:space="preserve">Τη</w:t>
       </w:r>
       <w:r>
         <w:t xml:space="preserve"> </w:t>
@@ -82,37 +91,15 @@
         <w:t xml:space="preserve">χωρητικότητα</w:t>
       </w:r>
       <w:r>
-        <w:t xml:space="preserve">: πόσοι μαθητές χωρούν·</w:t>
-      </w:r>
-    </w:p>
-    <w:p>
-      <w:pPr>
-        <w:pStyle w:val="Compact"/>
-        <w:numPr>
-          <w:ilvl w:val="0"/>
-          <w:numId w:val="1001"/>
-        </w:numPr>
-      </w:pPr>
-      <w:r>
-        <w:t xml:space="preserve">προαιρετικά,</w:t>
-      </w:r>
-      <w:r>
-        <w:t xml:space="preserve"> </w:t>
-      </w:r>
-      <w:r>
-        <w:rPr>
-          <w:b/>
-          <w:bCs/>
-        </w:rPr>
-        <w:t xml:space="preserve">μαθητές που προτιμάτε</w:t>
-      </w:r>
-      <w:r>
-        <w:t xml:space="preserve">, με σειρά προτίμησης.</w:t>
-      </w:r>
-    </w:p>
-    <w:p>
-      <w:pPr>
-        <w:pStyle w:val="FirstParagraph"/>
+        <w:t xml:space="preserve"> </w:t>
+      </w:r>
+      <w:r>
+        <w:t xml:space="preserve">(πόσοι μαθητές χωρούν) την ορίζει ο υπεύθυνος των ομίλων· τη βλέπετε στην κάρτα του ομίλου. Αν χρειάζεται αλλαγή, επικοινωνήστε μαζί του.</w:t>
+      </w:r>
+    </w:p>
+    <w:p>
+      <w:pPr>
+        <w:pStyle w:val="BodyText"/>
       </w:pPr>
       <w:r>
         <w:t xml:space="preserve">Τα υπόλοιπα (δηλώσεις γονέων, κλήρωση, κατανομή) γίνονται αυτόματα.</w:t>
@@ -140,7 +127,7 @@
         <w:pStyle w:val="Compact"/>
         <w:numPr>
           <w:ilvl w:val="0"/>
-          <w:numId w:val="1002"/>
+          <w:numId w:val="1001"/>
         </w:numPr>
       </w:pPr>
       <w:r>
@@ -168,7 +155,7 @@
         <w:pStyle w:val="Compact"/>
         <w:numPr>
           <w:ilvl w:val="0"/>
-          <w:numId w:val="1002"/>
+          <w:numId w:val="1001"/>
         </w:numPr>
       </w:pPr>
       <w:r>
@@ -209,7 +196,7 @@
         <w:pStyle w:val="Compact"/>
         <w:numPr>
           <w:ilvl w:val="0"/>
-          <w:numId w:val="1002"/>
+          <w:numId w:val="1001"/>
         </w:numPr>
       </w:pPr>
       <w:r>
@@ -237,13 +224,13 @@
       </w:r>
     </w:p>
     <w:bookmarkEnd w:id="10"/>
-    <w:bookmarkStart w:id="11" w:name="X25fc7ebc014df04491be2a8f14e99e6a73b8c18"/>
+    <w:bookmarkStart w:id="11" w:name="X151b037e41586d1519dd031419fab78947117d6"/>
     <w:p>
       <w:pPr>
         <w:pStyle w:val="Heading2"/>
       </w:pPr>
       <w:r>
-        <w:t xml:space="preserve">3. Χωρητικότητα και προτιμώμενοι μαθητές</w:t>
+        <w:t xml:space="preserve">3. Προτιμώμενοι μαθητές</w:t>
       </w:r>
     </w:p>
     <w:p>
@@ -251,67 +238,127 @@
         <w:pStyle w:val="FirstParagraph"/>
       </w:pPr>
       <w:r>
-        <w:t xml:space="preserve">Για κάθε όμιλό σας εμφανίζεται μια κάρτα με τις ημέρες και τις τάξεις του.</w:t>
-      </w:r>
-    </w:p>
-    <w:p>
-      <w:pPr>
-        <w:pStyle w:val="Compact"/>
-        <w:numPr>
-          <w:ilvl w:val="0"/>
+        <w:t xml:space="preserve">Για κάθε όμιλό σας εμφανίζεται μια κάρτα με τις ημέρες, τις τάξεις και τις θέσεις του, και από κάτω οι μαθητές των τάξεων του ομίλου.</w:t>
+      </w:r>
+    </w:p>
+    <w:p>
+      <w:pPr>
+        <w:pStyle w:val="Compact"/>
+        <w:numPr>
+          <w:ilvl w:val="0"/>
+          <w:numId w:val="1002"/>
+        </w:numPr>
+      </w:pPr>
+      <w:r>
+        <w:rPr>
+          <w:b/>
+          <w:bCs/>
+        </w:rPr>
+        <w:t xml:space="preserve">Τσεκάρετε</w:t>
+      </w:r>
+      <w:r>
+        <w:t xml:space="preserve"> </w:t>
+      </w:r>
+      <w:r>
+        <w:t xml:space="preserve">τα κουτάκια των μαθητών που προτιμάτε.</w:t>
+      </w:r>
+    </w:p>
+    <w:p>
+      <w:pPr>
+        <w:pStyle w:val="Compact"/>
+        <w:numPr>
+          <w:ilvl w:val="1"/>
           <w:numId w:val="1003"/>
         </w:numPr>
       </w:pPr>
       <w:r>
-        <w:rPr>
-          <w:b/>
-          <w:bCs/>
-        </w:rPr>
-        <w:t xml:space="preserve">Χωρητικότητα:</w:t>
-      </w:r>
-      <w:r>
-        <w:t xml:space="preserve"> </w:t>
-      </w:r>
-      <w:r>
-        <w:t xml:space="preserve">γράψτε πόσοι μαθητές χωρούν.</w:t>
-      </w:r>
-    </w:p>
-    <w:p>
-      <w:pPr>
-        <w:pStyle w:val="Compact"/>
-        <w:numPr>
-          <w:ilvl w:val="0"/>
+        <w:t xml:space="preserve">Για να βρείτε γρήγορα έναν μαθητή:</w:t>
+      </w:r>
+      <w:r>
+        <w:t xml:space="preserve"> </w:t>
+      </w:r>
+      <w:r>
+        <w:rPr>
+          <w:b/>
+          <w:bCs/>
+        </w:rPr>
+        <w:t xml:space="preserve">φίλτρο τάξης</w:t>
+      </w:r>
+      <w:r>
+        <w:t xml:space="preserve">,</w:t>
+      </w:r>
+      <w:r>
+        <w:t xml:space="preserve"> </w:t>
+      </w:r>
+      <w:r>
+        <w:rPr>
+          <w:b/>
+          <w:bCs/>
+        </w:rPr>
+        <w:t xml:space="preserve">αναζήτηση</w:t>
+      </w:r>
+      <w:r>
+        <w:t xml:space="preserve"> </w:t>
+      </w:r>
+      <w:r>
+        <w:t xml:space="preserve">με όνομα ή ΑΜ, και</w:t>
+      </w:r>
+      <w:r>
+        <w:t xml:space="preserve"> </w:t>
+      </w:r>
+      <w:r>
+        <w:rPr>
+          <w:b/>
+          <w:bCs/>
+        </w:rPr>
+        <w:t xml:space="preserve">«μόνο οι επιλεγμένοι»</w:t>
+      </w:r>
+      <w:r>
+        <w:t xml:space="preserve"> </w:t>
+      </w:r>
+      <w:r>
+        <w:t xml:space="preserve">για να δείτε όσους έχετε ήδη τσεκάρει.</w:t>
+      </w:r>
+    </w:p>
+    <w:p>
+      <w:pPr>
+        <w:pStyle w:val="Compact"/>
+        <w:numPr>
+          <w:ilvl w:val="1"/>
           <w:numId w:val="1003"/>
         </w:numPr>
       </w:pPr>
       <w:r>
-        <w:rPr>
-          <w:b/>
-          <w:bCs/>
-        </w:rPr>
-        <w:t xml:space="preserve">Προτιμώμενοι μαθητές</w:t>
-      </w:r>
-      <w:r>
-        <w:t xml:space="preserve"> </w:t>
-      </w:r>
-      <w:r>
-        <w:t xml:space="preserve">(προαιρετικά): στο</w:t>
-      </w:r>
-      <w:r>
-        <w:t xml:space="preserve"> </w:t>
-      </w:r>
-      <w:r>
-        <w:rPr>
-          <w:b/>
-          <w:bCs/>
-        </w:rPr>
-        <w:t xml:space="preserve">«Προσθήκη μαθητή»</w:t>
-      </w:r>
-      <w:r>
-        <w:t xml:space="preserve"> </w:t>
-      </w:r>
-      <w:r>
-        <w:t xml:space="preserve">αναζητήστε με όνομα ή ΑΜ και πατήστε τον μαθητή για να μπει στη λίστα.</w:t>
+        <w:t xml:space="preserve">Έως</w:t>
+      </w:r>
+      <w:r>
+        <w:t xml:space="preserve"> </w:t>
+      </w:r>
+      <w:r>
+        <w:rPr>
+          <w:b/>
+          <w:bCs/>
+        </w:rPr>
+        <w:t xml:space="preserve">τόσους μαθητές όσες οι θέσεις</w:t>
+      </w:r>
+      <w:r>
+        <w:t xml:space="preserve"> </w:t>
+      </w:r>
+      <w:r>
+        <w:t xml:space="preserve">του ομίλου· μετά τα κουτάκια δεν τσεκάρονται άλλο. Αφαιρείτε έναν μαθητή ξετσεκάροντάς τον ή με το</w:t>
+      </w:r>
+      <w:r>
+        <w:t xml:space="preserve"> </w:t>
+      </w:r>
+      <w:r>
+        <w:rPr>
+          <w:b/>
+          <w:bCs/>
+        </w:rPr>
+        <w:t xml:space="preserve">✕</w:t>
+      </w:r>
+      <w:r>
+        <w:t xml:space="preserve">.</w:t>
       </w:r>
     </w:p>
     <w:p>
@@ -319,89 +366,32 @@
         <w:pStyle w:val="Compact"/>
         <w:numPr>
           <w:ilvl w:val="1"/>
-          <w:numId w:val="1004"/>
-        </w:numPr>
-      </w:pPr>
-      <w:r>
-        <w:t xml:space="preserve">Η σειρά της λίστας</w:t>
-      </w:r>
-      <w:r>
-        <w:t xml:space="preserve"> </w:t>
-      </w:r>
-      <w:r>
-        <w:rPr>
-          <w:b/>
-          <w:bCs/>
-        </w:rPr>
-        <w:t xml:space="preserve">μετράει</w:t>
-      </w:r>
-      <w:r>
-        <w:t xml:space="preserve">: ο 1ος προηγείται του 2ου κ.ο.κ. Αλλάζετε τη σειρά με</w:t>
-      </w:r>
-      <w:r>
-        <w:t xml:space="preserve"> </w:t>
-      </w:r>
-      <w:r>
-        <w:rPr>
-          <w:b/>
-          <w:bCs/>
-        </w:rPr>
-        <w:t xml:space="preserve">↑ / ↓</w:t>
-      </w:r>
-      <w:r>
-        <w:t xml:space="preserve"> </w:t>
-      </w:r>
-      <w:r>
-        <w:t xml:space="preserve">και αφαιρείτε με</w:t>
-      </w:r>
-      <w:r>
-        <w:t xml:space="preserve"> </w:t>
-      </w:r>
-      <w:r>
-        <w:rPr>
-          <w:b/>
-          <w:bCs/>
-        </w:rPr>
-        <w:t xml:space="preserve">✕</w:t>
-      </w:r>
-      <w:r>
-        <w:t xml:space="preserve">.</w:t>
-      </w:r>
-    </w:p>
-    <w:p>
-      <w:pPr>
-        <w:pStyle w:val="Compact"/>
-        <w:numPr>
-          <w:ilvl w:val="1"/>
-          <w:numId w:val="1004"/>
-        </w:numPr>
-      </w:pPr>
-      <w:r>
-        <w:t xml:space="preserve">Έως</w:t>
-      </w:r>
-      <w:r>
-        <w:t xml:space="preserve"> </w:t>
-      </w:r>
-      <w:r>
-        <w:rPr>
-          <w:b/>
-          <w:bCs/>
-        </w:rPr>
-        <w:t xml:space="preserve">τόσους μαθητές όσες οι θέσεις</w:t>
-      </w:r>
-      <w:r>
-        <w:t xml:space="preserve"> </w:t>
-      </w:r>
-      <w:r>
-        <w:t xml:space="preserve">του ομίλου, και μόνο μαθητές των τάξεων του ομίλου.</w:t>
-      </w:r>
-    </w:p>
-    <w:p>
-      <w:pPr>
-        <w:pStyle w:val="Compact"/>
-        <w:numPr>
-          <w:ilvl w:val="0"/>
           <w:numId w:val="1003"/>
+        </w:numPr>
+      </w:pPr>
+      <w:r>
+        <w:t xml:space="preserve">Η</w:t>
+      </w:r>
+      <w:r>
+        <w:t xml:space="preserve"> </w:t>
+      </w:r>
+      <w:r>
+        <w:rPr>
+          <w:b/>
+          <w:bCs/>
+        </w:rPr>
+        <w:t xml:space="preserve">σειρά δεν έχει σημασία</w:t>
+      </w:r>
+      <w:r>
+        <w:t xml:space="preserve">: αφού η λίστα δεν ξεπερνά τις θέσεις, όσοι από τη λίστα δηλώσουν τον όμιλο χωρούν όλοι.</w:t>
+      </w:r>
+    </w:p>
+    <w:p>
+      <w:pPr>
+        <w:pStyle w:val="Compact"/>
+        <w:numPr>
+          <w:ilvl w:val="0"/>
+          <w:numId w:val="1002"/>
         </w:numPr>
       </w:pPr>
       <w:r>
@@ -508,7 +498,7 @@
         <w:pStyle w:val="Compact"/>
         <w:numPr>
           <w:ilvl w:val="0"/>
-          <w:numId w:val="1005"/>
+          <w:numId w:val="1004"/>
         </w:numPr>
       </w:pPr>
       <w:r>
@@ -549,7 +539,7 @@
         <w:pStyle w:val="Compact"/>
         <w:numPr>
           <w:ilvl w:val="0"/>
-          <w:numId w:val="1005"/>
+          <w:numId w:val="1004"/>
         </w:numPr>
       </w:pPr>
       <w:r>
@@ -577,7 +567,7 @@
         <w:pStyle w:val="Compact"/>
         <w:numPr>
           <w:ilvl w:val="0"/>
-          <w:numId w:val="1005"/>
+          <w:numId w:val="1004"/>
         </w:numPr>
       </w:pPr>
       <w:r>
@@ -605,7 +595,7 @@
         <w:pStyle w:val="Compact"/>
         <w:numPr>
           <w:ilvl w:val="0"/>
-          <w:numId w:val="1005"/>
+          <w:numId w:val="1004"/>
         </w:numPr>
       </w:pPr>
       <w:r>
@@ -716,43 +706,483 @@
         <w:pStyle w:val="Compact"/>
         <w:numPr>
           <w:ilvl w:val="0"/>
+          <w:numId w:val="1005"/>
+        </w:numPr>
+      </w:pPr>
+      <w:r>
+        <w:t xml:space="preserve">τον</w:t>
+      </w:r>
+      <w:r>
+        <w:t xml:space="preserve"> </w:t>
+      </w:r>
+      <w:r>
+        <w:rPr>
+          <w:b/>
+          <w:bCs/>
+        </w:rPr>
+        <w:t xml:space="preserve">κωδικό</w:t>
+      </w:r>
+      <w:r>
+        <w:t xml:space="preserve"> </w:t>
+      </w:r>
+      <w:r>
+        <w:t xml:space="preserve">του ομίλου σας·</w:t>
+      </w:r>
+    </w:p>
+    <w:p>
+      <w:pPr>
+        <w:pStyle w:val="Compact"/>
+        <w:numPr>
+          <w:ilvl w:val="0"/>
+          <w:numId w:val="1005"/>
+        </w:numPr>
+      </w:pPr>
+      <w:r>
+        <w:t xml:space="preserve">τους</w:t>
+      </w:r>
+      <w:r>
+        <w:t xml:space="preserve"> </w:t>
+      </w:r>
+      <w:r>
+        <w:rPr>
+          <w:b/>
+          <w:bCs/>
+        </w:rPr>
+        <w:t xml:space="preserve">προτιμώμενους μαθητές</w:t>
+      </w:r>
+      <w:r>
+        <w:t xml:space="preserve">:</w:t>
+      </w:r>
+      <w:r>
+        <w:t xml:space="preserve"> </w:t>
+      </w:r>
+      <w:r>
+        <w:rPr>
+          <w:b/>
+          <w:bCs/>
+        </w:rPr>
+        <w:t xml:space="preserve">ΑΜ</w:t>
+      </w:r>
+      <w:r>
+        <w:t xml:space="preserve"> </w:t>
+      </w:r>
+      <w:r>
+        <w:t xml:space="preserve">(απαραίτητο) και ονοματεπώνυμο για έλεγχο,</w:t>
+      </w:r>
+      <w:r>
+        <w:t xml:space="preserve"> </w:t>
+      </w:r>
+      <w:r>
+        <w:rPr>
+          <w:b/>
+          <w:bCs/>
+        </w:rPr>
+        <w:t xml:space="preserve">έναν ανά γραμμή</w:t>
+      </w:r>
+      <w:r>
+        <w:t xml:space="preserve"> </w:t>
+      </w:r>
+      <w:r>
+        <w:t xml:space="preserve">(η σειρά δεν έχει σημασία).</w:t>
+      </w:r>
+    </w:p>
+    <w:p>
+      <w:pPr>
+        <w:pStyle w:val="FirstParagraph"/>
+      </w:pPr>
+      <w:r>
+        <w:t xml:space="preserve">Ο ΑΜ είναι απαραίτητος, γιατί με αυτόν ταυτίζεται ο μαθητής με τη δήλωσή του.</w:t>
+      </w:r>
+    </w:p>
+    <w:p>
+      <w:pPr>
+        <w:pStyle w:val="BodyText"/>
+      </w:pPr>
+      <w:r>
+        <w:rPr>
+          <w:b/>
+          <w:bCs/>
+        </w:rPr>
+        <w:t xml:space="preserve">Το ίδιο Excel χρησιμοποιείται και όταν η πλατφόρμα λειτουργεί</w:t>
+      </w:r>
+      <w:r>
+        <w:t xml:space="preserve"> </w:t>
+      </w:r>
+      <w:r>
+        <w:t xml:space="preserve">αλλά προτιμάτε να μη συνδεθείτε: ο υπεύθυνος σας στέλνει ένα αρχείο για τον όμιλό σας με τους μαθητές των τάξεών του. Βάζετε</w:t>
+      </w:r>
+      <w:r>
+        <w:t xml:space="preserve"> </w:t>
+      </w:r>
+      <w:r>
+        <w:rPr>
+          <w:b/>
+          <w:bCs/>
+        </w:rPr>
+        <w:t xml:space="preserve">Χ</w:t>
+      </w:r>
+      <w:r>
+        <w:t xml:space="preserve"> </w:t>
+      </w:r>
+      <w:r>
+        <w:t xml:space="preserve">στη στήλη «Επιλογή» δίπλα σε όσους προτιμάτε (ή σβήνετε τις γραμμές όσων δεν θέλετε) και του το επιστρέφετε. Μην αλλάζετε τις πρώτες γραμμές (κωδικός, όμιλος, θέσεις) ούτε τις στήλες.</w:t>
+      </w:r>
+    </w:p>
+    <w:p>
+      <w:pPr>
+        <w:pStyle w:val="BodyText"/>
+      </w:pPr>
+      <w:r>
+        <w:t xml:space="preserve">Παράδειγμα:</w:t>
+      </w:r>
+    </w:p>
+    <w:tbl>
+      <w:tblPr>
+        <w:tblStyle w:val="Table"/>
+        <w:tblW w:type="auto" w:w="0"/>
+        <w:tblLook w:firstRow="1" w:lastRow="0" w:firstColumn="0" w:lastColumn="0" w:noHBand="0" w:noVBand="0" w:val="0020"/>
+      </w:tblPr>
+      <w:tblGrid>
+        <w:gridCol w:w="1584"/>
+        <w:gridCol w:w="1584"/>
+        <w:gridCol w:w="1584"/>
+        <w:gridCol w:w="1584"/>
+        <w:gridCol w:w="1584"/>
+      </w:tblGrid>
+      <w:tr>
+        <w:trPr>
+          <w:tblHeader w:val="on"/>
+        </w:trPr>
+        <w:tc>
+          <w:tcPr/>
+          <w:p>
+            <w:pPr>
+              <w:pStyle w:val="Compact"/>
+            </w:pPr>
+            <w:r>
+              <w:t xml:space="preserve">Επιλογή</w:t>
+            </w:r>
+          </w:p>
+        </w:tc>
+        <w:tc>
+          <w:tcPr/>
+          <w:p>
+            <w:pPr>
+              <w:pStyle w:val="Compact"/>
+            </w:pPr>
+            <w:r>
+              <w:t xml:space="preserve">ΑΜ</w:t>
+            </w:r>
+          </w:p>
+        </w:tc>
+        <w:tc>
+          <w:tcPr/>
+          <w:p>
+            <w:pPr>
+              <w:pStyle w:val="Compact"/>
+            </w:pPr>
+            <w:r>
+              <w:t xml:space="preserve">Επώνυμο</w:t>
+            </w:r>
+          </w:p>
+        </w:tc>
+        <w:tc>
+          <w:tcPr/>
+          <w:p>
+            <w:pPr>
+              <w:pStyle w:val="Compact"/>
+            </w:pPr>
+            <w:r>
+              <w:t xml:space="preserve">Όνομα</w:t>
+            </w:r>
+          </w:p>
+        </w:tc>
+        <w:tc>
+          <w:tcPr/>
+          <w:p>
+            <w:pPr>
+              <w:pStyle w:val="Compact"/>
+            </w:pPr>
+            <w:r>
+              <w:t xml:space="preserve">Τάξη</w:t>
+            </w:r>
+          </w:p>
+        </w:tc>
+      </w:tr>
+      <w:tr>
+        <w:tc>
+          <w:tcPr/>
+          <w:p>
+            <w:pPr>
+              <w:pStyle w:val="Compact"/>
+            </w:pPr>
+            <w:r>
+              <w:t xml:space="preserve">Χ</w:t>
+            </w:r>
+          </w:p>
+        </w:tc>
+        <w:tc>
+          <w:tcPr/>
+          <w:p>
+            <w:pPr>
+              <w:pStyle w:val="Compact"/>
+            </w:pPr>
+            <w:r>
+              <w:t xml:space="preserve">7215</w:t>
+            </w:r>
+          </w:p>
+        </w:tc>
+        <w:tc>
+          <w:tcPr/>
+          <w:p>
+            <w:pPr>
+              <w:pStyle w:val="Compact"/>
+            </w:pPr>
+            <w:r>
+              <w:t xml:space="preserve">ΠΑΠΑΔΟΠΟΥΛΟΥ</w:t>
+            </w:r>
+          </w:p>
+        </w:tc>
+        <w:tc>
+          <w:tcPr/>
+          <w:p>
+            <w:pPr>
+              <w:pStyle w:val="Compact"/>
+            </w:pPr>
+            <w:r>
+              <w:t xml:space="preserve">ΜΑΡΙΑ</w:t>
+            </w:r>
+          </w:p>
+        </w:tc>
+        <w:tc>
+          <w:tcPr/>
+          <w:p>
+            <w:pPr>
+              <w:pStyle w:val="Compact"/>
+            </w:pPr>
+            <w:r>
+              <w:t xml:space="preserve">Α</w:t>
+            </w:r>
+          </w:p>
+        </w:tc>
+      </w:tr>
+      <w:tr>
+        <w:tc>
+          <w:tcPr/>
+          <w:p>
+            <w:pPr>
+              <w:pStyle w:val="Compact"/>
+            </w:pPr>
+          </w:p>
+        </w:tc>
+        <w:tc>
+          <w:tcPr/>
+          <w:p>
+            <w:pPr>
+              <w:pStyle w:val="Compact"/>
+            </w:pPr>
+            <w:r>
+              <w:t xml:space="preserve">7288</w:t>
+            </w:r>
+          </w:p>
+        </w:tc>
+        <w:tc>
+          <w:tcPr/>
+          <w:p>
+            <w:pPr>
+              <w:pStyle w:val="Compact"/>
+            </w:pPr>
+            <w:r>
+              <w:t xml:space="preserve">ΙΩΑΝΝΟΥ</w:t>
+            </w:r>
+          </w:p>
+        </w:tc>
+        <w:tc>
+          <w:tcPr/>
+          <w:p>
+            <w:pPr>
+              <w:pStyle w:val="Compact"/>
+            </w:pPr>
+            <w:r>
+              <w:t xml:space="preserve">ΠΕΤΡΟΣ</w:t>
+            </w:r>
+          </w:p>
+        </w:tc>
+        <w:tc>
+          <w:tcPr/>
+          <w:p>
+            <w:pPr>
+              <w:pStyle w:val="Compact"/>
+            </w:pPr>
+            <w:r>
+              <w:t xml:space="preserve">Α</w:t>
+            </w:r>
+          </w:p>
+        </w:tc>
+      </w:tr>
+      <w:tr>
+        <w:tc>
+          <w:tcPr/>
+          <w:p>
+            <w:pPr>
+              <w:pStyle w:val="Compact"/>
+            </w:pPr>
+            <w:r>
+              <w:t xml:space="preserve">Χ</w:t>
+            </w:r>
+          </w:p>
+        </w:tc>
+        <w:tc>
+          <w:tcPr/>
+          <w:p>
+            <w:pPr>
+              <w:pStyle w:val="Compact"/>
+            </w:pPr>
+            <w:r>
+              <w:t xml:space="preserve">7342</w:t>
+            </w:r>
+          </w:p>
+        </w:tc>
+        <w:tc>
+          <w:tcPr/>
+          <w:p>
+            <w:pPr>
+              <w:pStyle w:val="Compact"/>
+            </w:pPr>
+            <w:r>
+              <w:t xml:space="preserve">ΓΕΩΡΓΙΟΥ</w:t>
+            </w:r>
+          </w:p>
+        </w:tc>
+        <w:tc>
+          <w:tcPr/>
+          <w:p>
+            <w:pPr>
+              <w:pStyle w:val="Compact"/>
+            </w:pPr>
+            <w:r>
+              <w:t xml:space="preserve">ΝΙΚΟΛΑΟΣ</w:t>
+            </w:r>
+          </w:p>
+        </w:tc>
+        <w:tc>
+          <w:tcPr/>
+          <w:p>
+            <w:pPr>
+              <w:pStyle w:val="Compact"/>
+            </w:pPr>
+            <w:r>
+              <w:t xml:space="preserve">Β</w:t>
+            </w:r>
+          </w:p>
+        </w:tc>
+      </w:tr>
+    </w:tbl>
+    <w:p>
+      <w:r>
+        <w:pict>
+          <v:rect style="width:0;height:1.5pt" o:hralign="center" o:hrstd="t" o:hr="t"/>
+        </w:pict>
+      </w:r>
+    </w:p>
+    <w:bookmarkEnd w:id="14"/>
+    <w:bookmarkStart w:id="26" w:name="X270eb55045cef7eb4a5a55158511e01421f1085"/>
+    <w:p>
+      <w:pPr>
+        <w:pStyle w:val="Heading2"/>
+      </w:pPr>
+      <w:r>
+        <w:t xml:space="preserve">7. Πώς γίνεται η κατανομή</w:t>
+      </w:r>
+    </w:p>
+    <w:p>
+      <w:pPr>
+        <w:pStyle w:val="FirstParagraph"/>
+      </w:pPr>
+      <w:r>
+        <w:t xml:space="preserve">Η κατανομή γίνεται</w:t>
+      </w:r>
+      <w:r>
+        <w:t xml:space="preserve"> </w:t>
+      </w:r>
+      <w:r>
+        <w:rPr>
+          <w:b/>
+          <w:bCs/>
+        </w:rPr>
+        <w:t xml:space="preserve">ξεχωριστά για κάθε ημέρα</w:t>
+      </w:r>
+      <w:r>
+        <w:t xml:space="preserve">, με τη σειρά Δευτέρα → Παρασκευή, με τον αλγόριθμο</w:t>
+      </w:r>
+      <w:r>
+        <w:t xml:space="preserve"> </w:t>
+      </w:r>
+      <w:r>
+        <w:rPr>
+          <w:b/>
+          <w:bCs/>
+        </w:rPr>
+        <w:t xml:space="preserve">Gale–Shapley</w:t>
+      </w:r>
+      <w:r>
+        <w:t xml:space="preserve"> </w:t>
+      </w:r>
+      <w:r>
+        <w:t xml:space="preserve">(Gale &amp; Shapley, 1962) — γνωστό και ως</w:t>
+      </w:r>
+      <w:r>
+        <w:t xml:space="preserve"> </w:t>
+      </w:r>
+      <w:r>
+        <w:rPr>
+          <w:b/>
+          <w:bCs/>
+        </w:rPr>
+        <w:t xml:space="preserve">Deferred Acceptance</w:t>
+      </w:r>
+      <w:r>
+        <w:t xml:space="preserve"> </w:t>
+      </w:r>
+      <w:r>
+        <w:t xml:space="preserve">(«αναβαλλόμενη αποδοχή»). Τον ίδιο αλγόριθμο χρησιμοποιούν για τις εισαγωγές στα σχολεία τους η Νέα Υόρκη, η Βοστώνη και πολλές άλλες πόλεις.</w:t>
+      </w:r>
+    </w:p>
+    <w:bookmarkStart w:id="15" w:name="η-ιδέα-σε-τρεις-γραμμές"/>
+    <w:p>
+      <w:pPr>
+        <w:pStyle w:val="Heading3"/>
+      </w:pPr>
+      <w:r>
+        <w:t xml:space="preserve">Η ιδέα σε τρεις γραμμές</w:t>
+      </w:r>
+    </w:p>
+    <w:p>
+      <w:pPr>
+        <w:pStyle w:val="Compact"/>
+        <w:numPr>
+          <w:ilvl w:val="0"/>
           <w:numId w:val="1006"/>
         </w:numPr>
       </w:pPr>
       <w:r>
-        <w:t xml:space="preserve">τον</w:t>
-      </w:r>
-      <w:r>
-        <w:t xml:space="preserve"> </w:t>
-      </w:r>
-      <w:r>
-        <w:rPr>
-          <w:b/>
-          <w:bCs/>
-        </w:rPr>
-        <w:t xml:space="preserve">κωδικό</w:t>
-      </w:r>
-      <w:r>
-        <w:t xml:space="preserve"> </w:t>
-      </w:r>
-      <w:r>
-        <w:t xml:space="preserve">και τη</w:t>
-      </w:r>
-      <w:r>
-        <w:t xml:space="preserve"> </w:t>
-      </w:r>
-      <w:r>
-        <w:rPr>
-          <w:b/>
-          <w:bCs/>
-        </w:rPr>
-        <w:t xml:space="preserve">χωρητικότητα</w:t>
-      </w:r>
-      <w:r>
-        <w:t xml:space="preserve"> </w:t>
-      </w:r>
-      <w:r>
-        <w:t xml:space="preserve">του ομίλου σας·</w:t>
+        <w:t xml:space="preserve">Κάθε μαθητής κάνει</w:t>
+      </w:r>
+      <w:r>
+        <w:t xml:space="preserve"> </w:t>
+      </w:r>
+      <w:r>
+        <w:rPr>
+          <w:b/>
+          <w:bCs/>
+        </w:rPr>
+        <w:t xml:space="preserve">αίτηση</w:t>
+      </w:r>
+      <w:r>
+        <w:t xml:space="preserve"> </w:t>
+      </w:r>
+      <w:r>
+        <w:t xml:space="preserve">στον όμιλο που έχει πρώτο στη λίστα του.</w:t>
       </w:r>
     </w:p>
     <w:p>
@@ -764,52 +1194,51 @@
         </w:numPr>
       </w:pPr>
       <w:r>
-        <w:t xml:space="preserve">τους</w:t>
-      </w:r>
-      <w:r>
-        <w:t xml:space="preserve"> </w:t>
-      </w:r>
-      <w:r>
-        <w:rPr>
-          <w:b/>
-          <w:bCs/>
-        </w:rPr>
-        <w:t xml:space="preserve">προτιμώμενους μαθητές</w:t>
-      </w:r>
-      <w:r>
-        <w:t xml:space="preserve"> </w:t>
-      </w:r>
-      <w:r>
-        <w:t xml:space="preserve">με τη σειρά σας:</w:t>
-      </w:r>
-      <w:r>
-        <w:t xml:space="preserve"> </w:t>
-      </w:r>
-      <w:r>
-        <w:rPr>
-          <w:b/>
-          <w:bCs/>
-        </w:rPr>
-        <w:t xml:space="preserve">ΑΜ</w:t>
-      </w:r>
-      <w:r>
-        <w:t xml:space="preserve"> </w:t>
-      </w:r>
-      <w:r>
-        <w:t xml:space="preserve">(απαραίτητο) και ονοματεπώνυμο για έλεγχο,</w:t>
-      </w:r>
-      <w:r>
-        <w:t xml:space="preserve"> </w:t>
-      </w:r>
-      <w:r>
-        <w:rPr>
-          <w:b/>
-          <w:bCs/>
-        </w:rPr>
-        <w:t xml:space="preserve">έναν ανά γραμμή, με σειρά</w:t>
-      </w:r>
-      <w:r>
-        <w:t xml:space="preserve">.</w:t>
+        <w:t xml:space="preserve">Κάθε όμιλος κρατά</w:t>
+      </w:r>
+      <w:r>
+        <w:t xml:space="preserve"> </w:t>
+      </w:r>
+      <w:r>
+        <w:rPr>
+          <w:b/>
+          <w:bCs/>
+        </w:rPr>
+        <w:t xml:space="preserve">προσωρινά</w:t>
+      </w:r>
+      <w:r>
+        <w:t xml:space="preserve"> </w:t>
+      </w:r>
+      <w:r>
+        <w:t xml:space="preserve">όσους χωρούν, με βάση την προτεραιότητα (παρακάτω), και απορρίπτει τους υπόλοιπους.</w:t>
+      </w:r>
+    </w:p>
+    <w:p>
+      <w:pPr>
+        <w:pStyle w:val="Compact"/>
+        <w:numPr>
+          <w:ilvl w:val="0"/>
+          <w:numId w:val="1006"/>
+        </w:numPr>
+      </w:pPr>
+      <w:r>
+        <w:t xml:space="preserve">Όποιος απορρίφθηκε κάνει αίτηση στον</w:t>
+      </w:r>
+      <w:r>
+        <w:t xml:space="preserve"> </w:t>
+      </w:r>
+      <w:r>
+        <w:rPr>
+          <w:b/>
+          <w:bCs/>
+        </w:rPr>
+        <w:t xml:space="preserve">επόμενο</w:t>
+      </w:r>
+      <w:r>
+        <w:t xml:space="preserve"> </w:t>
+      </w:r>
+      <w:r>
+        <w:t xml:space="preserve">όμιλο της λίστας του. Και ξανά από την αρχή, μέχρι να μην υπάρχει καμία νέα αίτηση.</w:t>
       </w:r>
     </w:p>
     <w:p>
@@ -817,7 +1246,336 @@
         <w:pStyle w:val="FirstParagraph"/>
       </w:pPr>
       <w:r>
-        <w:t xml:space="preserve">Παράδειγμα:</w:t>
+        <w:t xml:space="preserve">Η λέξη-κλειδί είναι το</w:t>
+      </w:r>
+      <w:r>
+        <w:t xml:space="preserve"> </w:t>
+      </w:r>
+      <w:r>
+        <w:rPr>
+          <w:b/>
+          <w:bCs/>
+        </w:rPr>
+        <w:t xml:space="preserve">«προσωρινά»</w:t>
+      </w:r>
+      <w:r>
+        <w:t xml:space="preserve">: καμία θέση δεν είναι οριστική πριν τελειώσει η διαδικασία. Ένας μαθητής που κρατήθηκε σε έναν γύρο μπορεί να «εκτοπιστεί» αργότερα από κάποιον με μεγαλύτερη προτεραιότητα που έφτασε στον όμιλο αργότερα· τότε συνεχίζει με τον επόμενο όμιλο της λίστας του.</w:t>
+      </w:r>
+    </w:p>
+    <w:bookmarkEnd w:id="15"/>
+    <w:bookmarkStart w:id="16" w:name="τι-κάνει-η-σειρά-που-δίνετε"/>
+    <w:p>
+      <w:pPr>
+        <w:pStyle w:val="Heading3"/>
+      </w:pPr>
+      <w:r>
+        <w:t xml:space="preserve">Τι κάνει η σειρά που δίνετε</w:t>
+      </w:r>
+    </w:p>
+    <w:p>
+      <w:pPr>
+        <w:pStyle w:val="FirstParagraph"/>
+      </w:pPr>
+      <w:r>
+        <w:t xml:space="preserve">Η σειρά σας καθορίζει</w:t>
+      </w:r>
+      <w:r>
+        <w:t xml:space="preserve"> </w:t>
+      </w:r>
+      <w:r>
+        <w:rPr>
+          <w:b/>
+          <w:bCs/>
+        </w:rPr>
+        <w:t xml:space="preserve">σε ποιους ομίλους και με ποια σειρά</w:t>
+      </w:r>
+      <w:r>
+        <w:t xml:space="preserve"> </w:t>
+      </w:r>
+      <w:r>
+        <w:t xml:space="preserve">κάνει αίτηση το παιδί: πρώτα στην 1η επιλογή· στη 2η</w:t>
+      </w:r>
+      <w:r>
+        <w:t xml:space="preserve"> </w:t>
+      </w:r>
+      <w:r>
+        <w:rPr>
+          <w:b/>
+          <w:bCs/>
+        </w:rPr>
+        <w:t xml:space="preserve">μόνο αν</w:t>
+      </w:r>
+      <w:r>
+        <w:t xml:space="preserve"> </w:t>
+      </w:r>
+      <w:r>
+        <w:t xml:space="preserve">δεν χωρέσει στην 1η· κ.ο.κ. Ένα παιδί δεν πηγαίνει ποτέ σε όμιλο που βάλατε χαμηλότερα, αν χωράει σε κάποιον που βάλατε ψηλότερα.</w:t>
+      </w:r>
+    </w:p>
+    <w:p>
+      <w:pPr>
+        <w:pStyle w:val="BodyText"/>
+      </w:pPr>
+      <w:r>
+        <w:t xml:space="preserve">Η σειρά σας</w:t>
+      </w:r>
+      <w:r>
+        <w:t xml:space="preserve"> </w:t>
+      </w:r>
+      <w:r>
+        <w:rPr>
+          <w:b/>
+          <w:bCs/>
+        </w:rPr>
+        <w:t xml:space="preserve">δεν</w:t>
+      </w:r>
+      <w:r>
+        <w:t xml:space="preserve"> </w:t>
+      </w:r>
+      <w:r>
+        <w:t xml:space="preserve">δίνει προτεραιότητα απέναντι σε άλλους μαθητές: σε έναν όμιλο, όποιος τον έβαλε 1ο και όποιος τον έβαλε 5ο έχουν την ίδια προτεραιότητα.</w:t>
+      </w:r>
+    </w:p>
+    <w:bookmarkEnd w:id="16"/>
+    <w:bookmarkStart w:id="17" w:name="ποιος-προηγείται-σε-έναν-όμιλο"/>
+    <w:p>
+      <w:pPr>
+        <w:pStyle w:val="Heading3"/>
+      </w:pPr>
+      <w:r>
+        <w:t xml:space="preserve">Ποιος προηγείται σε έναν όμιλο</w:t>
+      </w:r>
+    </w:p>
+    <w:p>
+      <w:pPr>
+        <w:pStyle w:val="FirstParagraph"/>
+      </w:pPr>
+      <w:r>
+        <w:t xml:space="preserve">Όταν ένας όμιλος έχει περισσότερες αιτήσεις από θέσεις, προηγούνται με αυτή τη σειρά:</w:t>
+      </w:r>
+    </w:p>
+    <w:p>
+      <w:pPr>
+        <w:pStyle w:val="Compact"/>
+        <w:numPr>
+          <w:ilvl w:val="0"/>
+          <w:numId w:val="1007"/>
+        </w:numPr>
+      </w:pPr>
+      <w:r>
+        <w:rPr>
+          <w:b/>
+          <w:bCs/>
+        </w:rPr>
+        <w:t xml:space="preserve">Οι μαθητές που επέλεξε ο/η εκπαιδευτικός</w:t>
+      </w:r>
+      <w:r>
+        <w:t xml:space="preserve"> </w:t>
+      </w:r>
+      <w:r>
+        <w:t xml:space="preserve">του ομίλου. (Η σειρά τους δεν έχει σημασία: η λίστα έχει το πολύ τόσους μαθητές όσες οι θέσεις, οπότε όσοι από αυτούς κάνουν αίτηση χωρούν όλοι.)</w:t>
+      </w:r>
+    </w:p>
+    <w:p>
+      <w:pPr>
+        <w:pStyle w:val="Compact"/>
+        <w:numPr>
+          <w:ilvl w:val="0"/>
+          <w:numId w:val="1007"/>
+        </w:numPr>
+      </w:pPr>
+      <w:r>
+        <w:rPr>
+          <w:b/>
+          <w:bCs/>
+        </w:rPr>
+        <w:t xml:space="preserve">Οι μαθητές των τάξεων όπου η ένταξη σε όμιλο είναι υποχρεωτική</w:t>
+      </w:r>
+      <w:r>
+        <w:t xml:space="preserve"> </w:t>
+      </w:r>
+      <w:r>
+        <w:t xml:space="preserve">(όπως ορίζει το σχολείο).</w:t>
+      </w:r>
+    </w:p>
+    <w:p>
+      <w:pPr>
+        <w:pStyle w:val="Compact"/>
+        <w:numPr>
+          <w:ilvl w:val="0"/>
+          <w:numId w:val="1007"/>
+        </w:numPr>
+      </w:pPr>
+      <w:r>
+        <w:rPr>
+          <w:b/>
+          <w:bCs/>
+        </w:rPr>
+        <w:t xml:space="preserve">Κλήρωση</w:t>
+      </w:r>
+      <w:r>
+        <w:t xml:space="preserve"> </w:t>
+      </w:r>
+      <w:r>
+        <w:t xml:space="preserve">για όλους τους υπόλοιπους.</w:t>
+      </w:r>
+    </w:p>
+    <w:p>
+      <w:pPr>
+        <w:pStyle w:val="FirstParagraph"/>
+      </w:pPr>
+      <w:r>
+        <w:rPr>
+          <w:b/>
+          <w:bCs/>
+        </w:rPr>
+        <w:t xml:space="preserve">Η κλήρωση γίνεται μία φορά, πριν ξεκινήσει η κατανομή:</w:t>
+      </w:r>
+      <w:r>
+        <w:t xml:space="preserve"> </w:t>
+      </w:r>
+      <w:r>
+        <w:t xml:space="preserve">κάθε μαθητής παίρνει</w:t>
+      </w:r>
+      <w:r>
+        <w:t xml:space="preserve"> </w:t>
+      </w:r>
+      <w:r>
+        <w:rPr>
+          <w:b/>
+          <w:bCs/>
+        </w:rPr>
+        <w:t xml:space="preserve">έναν αριθμό</w:t>
+      </w:r>
+      <w:r>
+        <w:t xml:space="preserve">, ίδιο για όλους τους ομίλους και όλη την εβδομάδα. Όποτε δύο μαθητές διεκδικούν την ίδια θέση, κερδίζει ο μικρότερος αριθμός. Οι αριθμοί βγαίνουν από ένα</w:t>
+      </w:r>
+      <w:r>
+        <w:t xml:space="preserve"> </w:t>
+      </w:r>
+      <w:r>
+        <w:rPr>
+          <w:b/>
+          <w:bCs/>
+        </w:rPr>
+        <w:t xml:space="preserve">seed</w:t>
+      </w:r>
+      <w:r>
+        <w:t xml:space="preserve"> </w:t>
+      </w:r>
+      <w:r>
+        <w:t xml:space="preserve">(λέξη ή αριθμό) που ανακοινώνεται· με το ίδιο seed οποιοσδήποτε ξαναβγάζει την ίδια κλήρωση.</w:t>
+      </w:r>
+    </w:p>
+    <w:bookmarkEnd w:id="17"/>
+    <w:bookmarkStart w:id="18" w:name="Xae750527521076382f29d925854f907432cb050"/>
+    <w:p>
+      <w:pPr>
+        <w:pStyle w:val="Heading3"/>
+      </w:pPr>
+      <w:r>
+        <w:t xml:space="preserve">Η σειρά δεν μετράει: δεν υπάρχει κλήρωση «πρώτη»</w:t>
+      </w:r>
+    </w:p>
+    <w:p>
+      <w:pPr>
+        <w:pStyle w:val="FirstParagraph"/>
+      </w:pPr>
+      <w:r>
+        <w:t xml:space="preserve">Όλοι οι όμιλοι εξετάζουν τις αιτήσεις τους</w:t>
+      </w:r>
+      <w:r>
+        <w:t xml:space="preserve"> </w:t>
+      </w:r>
+      <w:r>
+        <w:rPr>
+          <w:b/>
+          <w:bCs/>
+        </w:rPr>
+        <w:t xml:space="preserve">ταυτόχρονα</w:t>
+      </w:r>
+      <w:r>
+        <w:t xml:space="preserve">. Δεν χρειάζεται να αποφασίσει κανείς ποιος όμιλος θα «κληρωθεί πρώτος», γιατί:</w:t>
+      </w:r>
+    </w:p>
+    <w:p>
+      <w:pPr>
+        <w:pStyle w:val="BlockText"/>
+      </w:pPr>
+      <w:r>
+        <w:rPr>
+          <w:b/>
+          <w:bCs/>
+        </w:rPr>
+        <w:t xml:space="preserve">Είναι μαθηματικά αποδεδειγμένο ότι ο Gale–Shapley δίνει το ίδιο αποτέλεσμα όποια σειρά κι αν ακολουθηθεί</w:t>
+      </w:r>
+      <w:r>
+        <w:t xml:space="preserve"> </w:t>
+      </w:r>
+      <w:r>
+        <w:t xml:space="preserve">— πρώτα ο ένας όμιλος ή ο άλλος, όλοι μαζί σε γύρους, ή μία αίτηση τη φορά με οποιαδήποτε σειρά.</w:t>
+      </w:r>
+    </w:p>
+    <w:p>
+      <w:pPr>
+        <w:pStyle w:val="FirstParagraph"/>
+      </w:pPr>
+      <w:r>
+        <w:t xml:space="preserve">Προκύπτει από το βασικό θεώρημα των Gale &amp; Shapley (1962): ο αλγόριθμος καταλήγει πάντα στην καλύτερη για τους μαθητές ευσταθή κατανομή, που είναι μοναδική, και η απόδειξή τους δεν εξαρτάται από τη σειρά των αιτήσεων. Ρητά: McVitie &amp; Wilson (1970). Αυτό ισχύει επειδή οι προτεραιότητες —και οι αριθμοί κλήρωσης— είναι σταθεροί από την αρχή. Οι γύροι είναι απλώς ένας βολικός τρόπος να γίνει ο υπολογισμός. Η πλατφόρμα ελέγχει αυτή την ιδιότητα αυτόματα σε κάθε αλλαγή του κώδικα: σε εκατοντάδες τυχαία σενάρια, ο υπολογισμός «μία αίτηση τη φορά, με τυχαία σειρά» δίνει πάντα το ίδιο αποτέλεσμα με τους γύρους.</w:t>
+      </w:r>
+    </w:p>
+    <w:bookmarkEnd w:id="18"/>
+    <w:bookmarkStart w:id="19" w:name="ένας-απλός-τρόπος-να-το-δείτε"/>
+    <w:p>
+      <w:pPr>
+        <w:pStyle w:val="Heading3"/>
+      </w:pPr>
+      <w:r>
+        <w:t xml:space="preserve">Ένας απλός τρόπος να το δείτε</w:t>
+      </w:r>
+    </w:p>
+    <w:p>
+      <w:pPr>
+        <w:pStyle w:val="FirstParagraph"/>
+      </w:pPr>
+      <w:r>
+        <w:t xml:space="preserve">Όταν</w:t>
+      </w:r>
+      <w:r>
+        <w:t xml:space="preserve"> </w:t>
+      </w:r>
+      <w:r>
+        <w:rPr>
+          <w:b/>
+          <w:bCs/>
+        </w:rPr>
+        <w:t xml:space="preserve">δεν</w:t>
+      </w:r>
+      <w:r>
+        <w:t xml:space="preserve"> </w:t>
+      </w:r>
+      <w:r>
+        <w:t xml:space="preserve">υπάρχουν λίστες εκπαιδευτικών και υποχρεωτικές τάξεις, το αποτέλεσμα του αλγορίθμου είναι ακριβώς το ίδιο με αυτό:</w:t>
+      </w:r>
+    </w:p>
+    <w:p>
+      <w:pPr>
+        <w:pStyle w:val="BlockText"/>
+      </w:pPr>
+      <w:r>
+        <w:rPr>
+          <w:b/>
+          <w:bCs/>
+        </w:rPr>
+        <w:t xml:space="preserve">Οι μαθητές διαλέγουν με τη σειρά του αριθμού κλήρωσης. Ο καθένας παίρνει την καλύτερη επιλογή του που έχει ακόμα θέση.</w:t>
+      </w:r>
+    </w:p>
+    <w:p>
+      <w:pPr>
+        <w:pStyle w:val="FirstParagraph"/>
+      </w:pPr>
+      <w:r>
+        <w:t xml:space="preserve">Παράδειγμα: μία θέση στη Ρομποτική, μία στο Σκάκι.</w:t>
       </w:r>
     </w:p>
     <w:tbl>
@@ -843,40 +1601,40 @@
               <w:pStyle w:val="Compact"/>
             </w:pPr>
             <w:r>
-              <w:t xml:space="preserve">Κωδικός ομίλου</w:t>
-            </w:r>
-          </w:p>
-        </w:tc>
-        <w:tc>
-          <w:tcPr/>
-          <w:p>
-            <w:pPr>
-              <w:pStyle w:val="Compact"/>
-            </w:pPr>
-            <w:r>
-              <w:t xml:space="preserve">Σειρά</w:t>
-            </w:r>
-          </w:p>
-        </w:tc>
-        <w:tc>
-          <w:tcPr/>
-          <w:p>
-            <w:pPr>
-              <w:pStyle w:val="Compact"/>
-            </w:pPr>
-            <w:r>
-              <w:t xml:space="preserve">ΑΜ</w:t>
-            </w:r>
-          </w:p>
-        </w:tc>
-        <w:tc>
-          <w:tcPr/>
-          <w:p>
-            <w:pPr>
-              <w:pStyle w:val="Compact"/>
-            </w:pPr>
-            <w:r>
-              <w:t xml:space="preserve">Ονοματεπώνυμο (για έλεγχο)</w:t>
+              <w:t xml:space="preserve">Μαθητής</w:t>
+            </w:r>
+          </w:p>
+        </w:tc>
+        <w:tc>
+          <w:tcPr/>
+          <w:p>
+            <w:pPr>
+              <w:pStyle w:val="Compact"/>
+            </w:pPr>
+            <w:r>
+              <w:t xml:space="preserve">1η</w:t>
+            </w:r>
+          </w:p>
+        </w:tc>
+        <w:tc>
+          <w:tcPr/>
+          <w:p>
+            <w:pPr>
+              <w:pStyle w:val="Compact"/>
+            </w:pPr>
+            <w:r>
+              <w:t xml:space="preserve">2η</w:t>
+            </w:r>
+          </w:p>
+        </w:tc>
+        <w:tc>
+          <w:tcPr/>
+          <w:p>
+            <w:pPr>
+              <w:pStyle w:val="Compact"/>
+            </w:pPr>
+            <w:r>
+              <w:t xml:space="preserve">Αριθμός κλήρωσης</w:t>
             </w:r>
           </w:p>
         </w:tc>
@@ -889,7 +1647,29 @@
               <w:pStyle w:val="Compact"/>
             </w:pPr>
             <w:r>
-              <w:t xml:space="preserve">102</w:t>
+              <w:t xml:space="preserve">Νίκος</w:t>
+            </w:r>
+          </w:p>
+        </w:tc>
+        <w:tc>
+          <w:tcPr/>
+          <w:p>
+            <w:pPr>
+              <w:pStyle w:val="Compact"/>
+            </w:pPr>
+            <w:r>
+              <w:t xml:space="preserve">Ρομποτική</w:t>
+            </w:r>
+          </w:p>
+        </w:tc>
+        <w:tc>
+          <w:tcPr/>
+          <w:p>
+            <w:pPr>
+              <w:pStyle w:val="Compact"/>
+            </w:pPr>
+            <w:r>
+              <w:t xml:space="preserve">Σκάκι</w:t>
             </w:r>
           </w:p>
         </w:tc>
@@ -901,28 +1681,6 @@
             </w:pPr>
             <w:r>
               <w:t xml:space="preserve">1</w:t>
-            </w:r>
-          </w:p>
-        </w:tc>
-        <w:tc>
-          <w:tcPr/>
-          <w:p>
-            <w:pPr>
-              <w:pStyle w:val="Compact"/>
-            </w:pPr>
-            <w:r>
-              <w:t xml:space="preserve">7215</w:t>
-            </w:r>
-          </w:p>
-        </w:tc>
-        <w:tc>
-          <w:tcPr/>
-          <w:p>
-            <w:pPr>
-              <w:pStyle w:val="Compact"/>
-            </w:pPr>
-            <w:r>
-              <w:t xml:space="preserve">ΠΑΠΑΔΟΠΟΥΛΟΥ ΜΑΡΙΑ</w:t>
             </w:r>
           </w:p>
         </w:tc>
@@ -935,7 +1693,29 @@
               <w:pStyle w:val="Compact"/>
             </w:pPr>
             <w:r>
-              <w:t xml:space="preserve">102</w:t>
+              <w:t xml:space="preserve">Γιώργος</w:t>
+            </w:r>
+          </w:p>
+        </w:tc>
+        <w:tc>
+          <w:tcPr/>
+          <w:p>
+            <w:pPr>
+              <w:pStyle w:val="Compact"/>
+            </w:pPr>
+            <w:r>
+              <w:t xml:space="preserve">Ρομποτική</w:t>
+            </w:r>
+          </w:p>
+        </w:tc>
+        <w:tc>
+          <w:tcPr/>
+          <w:p>
+            <w:pPr>
+              <w:pStyle w:val="Compact"/>
+            </w:pPr>
+            <w:r>
+              <w:t xml:space="preserve">Σκάκι</w:t>
             </w:r>
           </w:p>
         </w:tc>
@@ -950,25 +1730,49 @@
             </w:r>
           </w:p>
         </w:tc>
-        <w:tc>
-          <w:tcPr/>
-          <w:p>
-            <w:pPr>
-              <w:pStyle w:val="Compact"/>
-            </w:pPr>
-            <w:r>
-              <w:t xml:space="preserve">7342</w:t>
-            </w:r>
-          </w:p>
-        </w:tc>
-        <w:tc>
-          <w:tcPr/>
-          <w:p>
-            <w:pPr>
-              <w:pStyle w:val="Compact"/>
-            </w:pPr>
-            <w:r>
-              <w:t xml:space="preserve">ΓΕΩΡΓΙΟΥ ΝΙΚΟΛΑΟΣ</w:t>
+      </w:tr>
+      <w:tr>
+        <w:tc>
+          <w:tcPr/>
+          <w:p>
+            <w:pPr>
+              <w:pStyle w:val="Compact"/>
+            </w:pPr>
+            <w:r>
+              <w:t xml:space="preserve">Σοφία</w:t>
+            </w:r>
+          </w:p>
+        </w:tc>
+        <w:tc>
+          <w:tcPr/>
+          <w:p>
+            <w:pPr>
+              <w:pStyle w:val="Compact"/>
+            </w:pPr>
+            <w:r>
+              <w:t xml:space="preserve">Σκάκι</w:t>
+            </w:r>
+          </w:p>
+        </w:tc>
+        <w:tc>
+          <w:tcPr/>
+          <w:p>
+            <w:pPr>
+              <w:pStyle w:val="Compact"/>
+            </w:pPr>
+            <w:r>
+              <w:t xml:space="preserve">Ρομποτική</w:t>
+            </w:r>
+          </w:p>
+        </w:tc>
+        <w:tc>
+          <w:tcPr/>
+          <w:p>
+            <w:pPr>
+              <w:pStyle w:val="Compact"/>
+            </w:pPr>
+            <w:r>
+              <w:t xml:space="preserve">3</w:t>
             </w:r>
           </w:p>
         </w:tc>
@@ -976,290 +1780,6 @@
     </w:tbl>
     <w:p>
       <w:pPr>
-        <w:pStyle w:val="BodyText"/>
-      </w:pPr>
-      <w:r>
-        <w:t xml:space="preserve">Ο ΑΜ είναι απαραίτητος, γιατί με αυτόν ταυτίζεται ο μαθητής με τη δήλωσή του.</w:t>
-      </w:r>
-    </w:p>
-    <w:p>
-      <w:r>
-        <w:pict>
-          <v:rect style="width:0;height:1.5pt" o:hralign="center" o:hrstd="t" o:hr="t"/>
-        </w:pict>
-      </w:r>
-    </w:p>
-    <w:bookmarkEnd w:id="14"/>
-    <w:bookmarkStart w:id="26" w:name="X270eb55045cef7eb4a5a55158511e01421f1085"/>
-    <w:p>
-      <w:pPr>
-        <w:pStyle w:val="Heading2"/>
-      </w:pPr>
-      <w:r>
-        <w:t xml:space="preserve">7. Πώς γίνεται η κατανομή</w:t>
-      </w:r>
-    </w:p>
-    <w:p>
-      <w:pPr>
-        <w:pStyle w:val="FirstParagraph"/>
-      </w:pPr>
-      <w:r>
-        <w:t xml:space="preserve">Η κατανομή γίνεται</w:t>
-      </w:r>
-      <w:r>
-        <w:t xml:space="preserve"> </w:t>
-      </w:r>
-      <w:r>
-        <w:rPr>
-          <w:b/>
-          <w:bCs/>
-        </w:rPr>
-        <w:t xml:space="preserve">ξεχωριστά για κάθε ημέρα</w:t>
-      </w:r>
-      <w:r>
-        <w:t xml:space="preserve">, με τη σειρά Δευτέρα → Παρασκευή, με τον αλγόριθμο</w:t>
-      </w:r>
-      <w:r>
-        <w:t xml:space="preserve"> </w:t>
-      </w:r>
-      <w:r>
-        <w:rPr>
-          <w:b/>
-          <w:bCs/>
-        </w:rPr>
-        <w:t xml:space="preserve">Gale–Shapley</w:t>
-      </w:r>
-      <w:r>
-        <w:t xml:space="preserve"> </w:t>
-      </w:r>
-      <w:r>
-        <w:t xml:space="preserve">(Gale &amp; Shapley, 1962) — γνωστό και ως</w:t>
-      </w:r>
-      <w:r>
-        <w:t xml:space="preserve"> </w:t>
-      </w:r>
-      <w:r>
-        <w:rPr>
-          <w:b/>
-          <w:bCs/>
-        </w:rPr>
-        <w:t xml:space="preserve">Deferred Acceptance</w:t>
-      </w:r>
-      <w:r>
-        <w:t xml:space="preserve"> </w:t>
-      </w:r>
-      <w:r>
-        <w:t xml:space="preserve">(«αναβαλλόμενη αποδοχή»). Τον ίδιο αλγόριθμο χρησιμοποιούν για τις εισαγωγές στα σχολεία τους η Νέα Υόρκη, η Βοστώνη και πολλές άλλες πόλεις.</w:t>
-      </w:r>
-    </w:p>
-    <w:bookmarkStart w:id="15" w:name="η-ιδέα-σε-τρεις-γραμμές"/>
-    <w:p>
-      <w:pPr>
-        <w:pStyle w:val="Heading3"/>
-      </w:pPr>
-      <w:r>
-        <w:t xml:space="preserve">Η ιδέα σε τρεις γραμμές</w:t>
-      </w:r>
-    </w:p>
-    <w:p>
-      <w:pPr>
-        <w:pStyle w:val="Compact"/>
-        <w:numPr>
-          <w:ilvl w:val="0"/>
-          <w:numId w:val="1007"/>
-        </w:numPr>
-      </w:pPr>
-      <w:r>
-        <w:t xml:space="preserve">Κάθε μαθητής κάνει</w:t>
-      </w:r>
-      <w:r>
-        <w:t xml:space="preserve"> </w:t>
-      </w:r>
-      <w:r>
-        <w:rPr>
-          <w:b/>
-          <w:bCs/>
-        </w:rPr>
-        <w:t xml:space="preserve">αίτηση</w:t>
-      </w:r>
-      <w:r>
-        <w:t xml:space="preserve"> </w:t>
-      </w:r>
-      <w:r>
-        <w:t xml:space="preserve">στον όμιλο που έχει πρώτο στη λίστα του.</w:t>
-      </w:r>
-    </w:p>
-    <w:p>
-      <w:pPr>
-        <w:pStyle w:val="Compact"/>
-        <w:numPr>
-          <w:ilvl w:val="0"/>
-          <w:numId w:val="1007"/>
-        </w:numPr>
-      </w:pPr>
-      <w:r>
-        <w:t xml:space="preserve">Κάθε όμιλος κρατά</w:t>
-      </w:r>
-      <w:r>
-        <w:t xml:space="preserve"> </w:t>
-      </w:r>
-      <w:r>
-        <w:rPr>
-          <w:b/>
-          <w:bCs/>
-        </w:rPr>
-        <w:t xml:space="preserve">προσωρινά</w:t>
-      </w:r>
-      <w:r>
-        <w:t xml:space="preserve"> </w:t>
-      </w:r>
-      <w:r>
-        <w:t xml:space="preserve">όσους χωρούν, με βάση την προτεραιότητα (παρακάτω), και απορρίπτει τους υπόλοιπους.</w:t>
-      </w:r>
-    </w:p>
-    <w:p>
-      <w:pPr>
-        <w:pStyle w:val="Compact"/>
-        <w:numPr>
-          <w:ilvl w:val="0"/>
-          <w:numId w:val="1007"/>
-        </w:numPr>
-      </w:pPr>
-      <w:r>
-        <w:t xml:space="preserve">Όποιος απορρίφθηκε κάνει αίτηση στον</w:t>
-      </w:r>
-      <w:r>
-        <w:t xml:space="preserve"> </w:t>
-      </w:r>
-      <w:r>
-        <w:rPr>
-          <w:b/>
-          <w:bCs/>
-        </w:rPr>
-        <w:t xml:space="preserve">επόμενο</w:t>
-      </w:r>
-      <w:r>
-        <w:t xml:space="preserve"> </w:t>
-      </w:r>
-      <w:r>
-        <w:t xml:space="preserve">όμιλο της λίστας του. Και ξανά από την αρχή, μέχρι να μην υπάρχει καμία νέα αίτηση.</w:t>
-      </w:r>
-    </w:p>
-    <w:p>
-      <w:pPr>
-        <w:pStyle w:val="FirstParagraph"/>
-      </w:pPr>
-      <w:r>
-        <w:t xml:space="preserve">Η λέξη-κλειδί είναι το</w:t>
-      </w:r>
-      <w:r>
-        <w:t xml:space="preserve"> </w:t>
-      </w:r>
-      <w:r>
-        <w:rPr>
-          <w:b/>
-          <w:bCs/>
-        </w:rPr>
-        <w:t xml:space="preserve">«προσωρινά»</w:t>
-      </w:r>
-      <w:r>
-        <w:t xml:space="preserve">: καμία θέση δεν είναι οριστική πριν τελειώσει η διαδικασία. Ένας μαθητής που κρατήθηκε σε έναν γύρο μπορεί να «εκτοπιστεί» αργότερα από κάποιον με μεγαλύτερη προτεραιότητα που έφτασε στον όμιλο αργότερα· τότε συνεχίζει με τον επόμενο όμιλο της λίστας του.</w:t>
-      </w:r>
-    </w:p>
-    <w:bookmarkEnd w:id="15"/>
-    <w:bookmarkStart w:id="16" w:name="τι-κάνει-η-σειρά-που-δίνετε"/>
-    <w:p>
-      <w:pPr>
-        <w:pStyle w:val="Heading3"/>
-      </w:pPr>
-      <w:r>
-        <w:t xml:space="preserve">Τι κάνει η σειρά που δίνετε</w:t>
-      </w:r>
-    </w:p>
-    <w:p>
-      <w:pPr>
-        <w:pStyle w:val="FirstParagraph"/>
-      </w:pPr>
-      <w:r>
-        <w:t xml:space="preserve">Η σειρά σας καθορίζει</w:t>
-      </w:r>
-      <w:r>
-        <w:t xml:space="preserve"> </w:t>
-      </w:r>
-      <w:r>
-        <w:rPr>
-          <w:b/>
-          <w:bCs/>
-        </w:rPr>
-        <w:t xml:space="preserve">σε ποιους ομίλους και με ποια σειρά</w:t>
-      </w:r>
-      <w:r>
-        <w:t xml:space="preserve"> </w:t>
-      </w:r>
-      <w:r>
-        <w:t xml:space="preserve">κάνει αίτηση το παιδί: πρώτα στην 1η επιλογή· στη 2η</w:t>
-      </w:r>
-      <w:r>
-        <w:t xml:space="preserve"> </w:t>
-      </w:r>
-      <w:r>
-        <w:rPr>
-          <w:b/>
-          <w:bCs/>
-        </w:rPr>
-        <w:t xml:space="preserve">μόνο αν</w:t>
-      </w:r>
-      <w:r>
-        <w:t xml:space="preserve"> </w:t>
-      </w:r>
-      <w:r>
-        <w:t xml:space="preserve">δεν χωρέσει στην 1η· κ.ο.κ. Ένα παιδί δεν πηγαίνει ποτέ σε όμιλο που βάλατε χαμηλότερα, αν χωράει σε κάποιον που βάλατε ψηλότερα.</w:t>
-      </w:r>
-    </w:p>
-    <w:p>
-      <w:pPr>
-        <w:pStyle w:val="BodyText"/>
-      </w:pPr>
-      <w:r>
-        <w:t xml:space="preserve">Η σειρά σας</w:t>
-      </w:r>
-      <w:r>
-        <w:t xml:space="preserve"> </w:t>
-      </w:r>
-      <w:r>
-        <w:rPr>
-          <w:b/>
-          <w:bCs/>
-        </w:rPr>
-        <w:t xml:space="preserve">δεν</w:t>
-      </w:r>
-      <w:r>
-        <w:t xml:space="preserve"> </w:t>
-      </w:r>
-      <w:r>
-        <w:t xml:space="preserve">δίνει προτεραιότητα απέναντι σε άλλους μαθητές: σε έναν όμιλο, όποιος τον έβαλε 1ο και όποιος τον έβαλε 5ο έχουν την ίδια προτεραιότητα.</w:t>
-      </w:r>
-    </w:p>
-    <w:bookmarkEnd w:id="16"/>
-    <w:bookmarkStart w:id="17" w:name="ποιος-προηγείται-σε-έναν-όμιλο"/>
-    <w:p>
-      <w:pPr>
-        <w:pStyle w:val="Heading3"/>
-      </w:pPr>
-      <w:r>
-        <w:t xml:space="preserve">Ποιος προηγείται σε έναν όμιλο</w:t>
-      </w:r>
-    </w:p>
-    <w:p>
-      <w:pPr>
-        <w:pStyle w:val="FirstParagraph"/>
-      </w:pPr>
-      <w:r>
-        <w:t xml:space="preserve">Όταν ένας όμιλος έχει περισσότερες αιτήσεις από θέσεις, προηγούνται με αυτή τη σειρά:</w:t>
-      </w:r>
-    </w:p>
-    <w:p>
-      <w:pPr>
         <w:pStyle w:val="Compact"/>
         <w:numPr>
           <w:ilvl w:val="0"/>
@@ -1271,13 +1791,13 @@
           <w:b/>
           <w:bCs/>
         </w:rPr>
-        <w:t xml:space="preserve">Οι μαθητές που επέλεξε ο/η εκπαιδευτικός</w:t>
-      </w:r>
-      <w:r>
-        <w:t xml:space="preserve"> </w:t>
-      </w:r>
-      <w:r>
-        <w:t xml:space="preserve">του ομίλου, με τη σειρά της λίστας του/της.</w:t>
+        <w:t xml:space="preserve">Νίκος (1):</w:t>
+      </w:r>
+      <w:r>
+        <w:t xml:space="preserve"> </w:t>
+      </w:r>
+      <w:r>
+        <w:t xml:space="preserve">διαλέγει Ρομποτική.</w:t>
       </w:r>
     </w:p>
     <w:p>
@@ -1293,13 +1813,13 @@
           <w:b/>
           <w:bCs/>
         </w:rPr>
-        <w:t xml:space="preserve">Οι μαθητές των τάξεων όπου η ένταξη σε όμιλο είναι υποχρεωτική</w:t>
-      </w:r>
-      <w:r>
-        <w:t xml:space="preserve"> </w:t>
-      </w:r>
-      <w:r>
-        <w:t xml:space="preserve">(όπως ορίζει το σχολείο).</w:t>
+        <w:t xml:space="preserve">Γιώργος (2):</w:t>
+      </w:r>
+      <w:r>
+        <w:t xml:space="preserve"> </w:t>
+      </w:r>
+      <w:r>
+        <w:t xml:space="preserve">η Ρομποτική γέμισε → παίρνει τη 2η του επιλογή, Σκάκι.</w:t>
       </w:r>
     </w:p>
     <w:p>
@@ -1308,430 +1828,6 @@
         <w:numPr>
           <w:ilvl w:val="0"/>
           <w:numId w:val="1008"/>
-        </w:numPr>
-      </w:pPr>
-      <w:r>
-        <w:rPr>
-          <w:b/>
-          <w:bCs/>
-        </w:rPr>
-        <w:t xml:space="preserve">Κλήρωση</w:t>
-      </w:r>
-      <w:r>
-        <w:t xml:space="preserve"> </w:t>
-      </w:r>
-      <w:r>
-        <w:t xml:space="preserve">για όλους τους υπόλοιπους.</w:t>
-      </w:r>
-    </w:p>
-    <w:p>
-      <w:pPr>
-        <w:pStyle w:val="FirstParagraph"/>
-      </w:pPr>
-      <w:r>
-        <w:rPr>
-          <w:b/>
-          <w:bCs/>
-        </w:rPr>
-        <w:t xml:space="preserve">Η κλήρωση γίνεται μία φορά, πριν ξεκινήσει η κατανομή:</w:t>
-      </w:r>
-      <w:r>
-        <w:t xml:space="preserve"> </w:t>
-      </w:r>
-      <w:r>
-        <w:t xml:space="preserve">κάθε μαθητής παίρνει</w:t>
-      </w:r>
-      <w:r>
-        <w:t xml:space="preserve"> </w:t>
-      </w:r>
-      <w:r>
-        <w:rPr>
-          <w:b/>
-          <w:bCs/>
-        </w:rPr>
-        <w:t xml:space="preserve">έναν αριθμό</w:t>
-      </w:r>
-      <w:r>
-        <w:t xml:space="preserve">, ίδιο για όλους τους ομίλους και όλη την εβδομάδα. Όποτε δύο μαθητές διεκδικούν την ίδια θέση, κερδίζει ο μικρότερος αριθμός. Οι αριθμοί βγαίνουν από ένα</w:t>
-      </w:r>
-      <w:r>
-        <w:t xml:space="preserve"> </w:t>
-      </w:r>
-      <w:r>
-        <w:rPr>
-          <w:b/>
-          <w:bCs/>
-        </w:rPr>
-        <w:t xml:space="preserve">seed</w:t>
-      </w:r>
-      <w:r>
-        <w:t xml:space="preserve"> </w:t>
-      </w:r>
-      <w:r>
-        <w:t xml:space="preserve">(λέξη ή αριθμό) που ανακοινώνεται· με το ίδιο seed οποιοσδήποτε ξαναβγάζει την ίδια κλήρωση.</w:t>
-      </w:r>
-    </w:p>
-    <w:bookmarkEnd w:id="17"/>
-    <w:bookmarkStart w:id="18" w:name="Xae750527521076382f29d925854f907432cb050"/>
-    <w:p>
-      <w:pPr>
-        <w:pStyle w:val="Heading3"/>
-      </w:pPr>
-      <w:r>
-        <w:t xml:space="preserve">Η σειρά δεν μετράει: δεν υπάρχει κλήρωση «πρώτη»</w:t>
-      </w:r>
-    </w:p>
-    <w:p>
-      <w:pPr>
-        <w:pStyle w:val="FirstParagraph"/>
-      </w:pPr>
-      <w:r>
-        <w:t xml:space="preserve">Όλοι οι όμιλοι εξετάζουν τις αιτήσεις τους</w:t>
-      </w:r>
-      <w:r>
-        <w:t xml:space="preserve"> </w:t>
-      </w:r>
-      <w:r>
-        <w:rPr>
-          <w:b/>
-          <w:bCs/>
-        </w:rPr>
-        <w:t xml:space="preserve">ταυτόχρονα</w:t>
-      </w:r>
-      <w:r>
-        <w:t xml:space="preserve">. Δεν χρειάζεται να αποφασίσει κανείς ποιος όμιλος θα «κληρωθεί πρώτος», γιατί:</w:t>
-      </w:r>
-    </w:p>
-    <w:p>
-      <w:pPr>
-        <w:pStyle w:val="BlockText"/>
-      </w:pPr>
-      <w:r>
-        <w:rPr>
-          <w:b/>
-          <w:bCs/>
-        </w:rPr>
-        <w:t xml:space="preserve">Είναι μαθηματικά αποδεδειγμένο ότι ο Gale–Shapley δίνει το ίδιο αποτέλεσμα όποια σειρά κι αν ακολουθηθεί</w:t>
-      </w:r>
-      <w:r>
-        <w:t xml:space="preserve"> </w:t>
-      </w:r>
-      <w:r>
-        <w:t xml:space="preserve">— πρώτα ο ένας όμιλος ή ο άλλος, όλοι μαζί σε γύρους, ή μία αίτηση τη φορά με οποιαδήποτε σειρά.</w:t>
-      </w:r>
-    </w:p>
-    <w:p>
-      <w:pPr>
-        <w:pStyle w:val="FirstParagraph"/>
-      </w:pPr>
-      <w:r>
-        <w:t xml:space="preserve">Προκύπτει από το βασικό θεώρημα των Gale &amp; Shapley (1962): ο αλγόριθμος καταλήγει πάντα στην καλύτερη για τους μαθητές ευσταθή κατανομή, που είναι μοναδική, και η απόδειξή τους δεν εξαρτάται από τη σειρά των αιτήσεων. Ρητά: McVitie &amp; Wilson (1970). Αυτό ισχύει επειδή οι προτεραιότητες —και οι αριθμοί κλήρωσης— είναι σταθεροί από την αρχή. Οι γύροι είναι απλώς ένας βολικός τρόπος να γίνει ο υπολογισμός. Η πλατφόρμα ελέγχει αυτή την ιδιότητα αυτόματα σε κάθε αλλαγή του κώδικα: σε εκατοντάδες τυχαία σενάρια, ο υπολογισμός «μία αίτηση τη φορά, με τυχαία σειρά» δίνει πάντα το ίδιο αποτέλεσμα με τους γύρους.</w:t>
-      </w:r>
-    </w:p>
-    <w:bookmarkEnd w:id="18"/>
-    <w:bookmarkStart w:id="19" w:name="ένας-απλός-τρόπος-να-το-δείτε"/>
-    <w:p>
-      <w:pPr>
-        <w:pStyle w:val="Heading3"/>
-      </w:pPr>
-      <w:r>
-        <w:t xml:space="preserve">Ένας απλός τρόπος να το δείτε</w:t>
-      </w:r>
-    </w:p>
-    <w:p>
-      <w:pPr>
-        <w:pStyle w:val="FirstParagraph"/>
-      </w:pPr>
-      <w:r>
-        <w:t xml:space="preserve">Όταν</w:t>
-      </w:r>
-      <w:r>
-        <w:t xml:space="preserve"> </w:t>
-      </w:r>
-      <w:r>
-        <w:rPr>
-          <w:b/>
-          <w:bCs/>
-        </w:rPr>
-        <w:t xml:space="preserve">δεν</w:t>
-      </w:r>
-      <w:r>
-        <w:t xml:space="preserve"> </w:t>
-      </w:r>
-      <w:r>
-        <w:t xml:space="preserve">υπάρχουν λίστες εκπαιδευτικών και υποχρεωτικές τάξεις, το αποτέλεσμα του αλγορίθμου είναι ακριβώς το ίδιο με αυτό:</w:t>
-      </w:r>
-    </w:p>
-    <w:p>
-      <w:pPr>
-        <w:pStyle w:val="BlockText"/>
-      </w:pPr>
-      <w:r>
-        <w:rPr>
-          <w:b/>
-          <w:bCs/>
-        </w:rPr>
-        <w:t xml:space="preserve">Οι μαθητές διαλέγουν με τη σειρά του αριθμού κλήρωσης. Ο καθένας παίρνει την καλύτερη επιλογή του που έχει ακόμα θέση.</w:t>
-      </w:r>
-    </w:p>
-    <w:p>
-      <w:pPr>
-        <w:pStyle w:val="FirstParagraph"/>
-      </w:pPr>
-      <w:r>
-        <w:t xml:space="preserve">Παράδειγμα: μία θέση στη Ρομποτική, μία στο Σκάκι.</w:t>
-      </w:r>
-    </w:p>
-    <w:tbl>
-      <w:tblPr>
-        <w:tblStyle w:val="Table"/>
-        <w:tblW w:type="auto" w:w="0"/>
-        <w:tblLook w:firstRow="1" w:lastRow="0" w:firstColumn="0" w:lastColumn="0" w:noHBand="0" w:noVBand="0" w:val="0020"/>
-      </w:tblPr>
-      <w:tblGrid>
-        <w:gridCol w:w="1980"/>
-        <w:gridCol w:w="1980"/>
-        <w:gridCol w:w="1980"/>
-        <w:gridCol w:w="1980"/>
-      </w:tblGrid>
-      <w:tr>
-        <w:trPr>
-          <w:tblHeader w:val="on"/>
-        </w:trPr>
-        <w:tc>
-          <w:tcPr/>
-          <w:p>
-            <w:pPr>
-              <w:pStyle w:val="Compact"/>
-            </w:pPr>
-            <w:r>
-              <w:t xml:space="preserve">Μαθητής</w:t>
-            </w:r>
-          </w:p>
-        </w:tc>
-        <w:tc>
-          <w:tcPr/>
-          <w:p>
-            <w:pPr>
-              <w:pStyle w:val="Compact"/>
-            </w:pPr>
-            <w:r>
-              <w:t xml:space="preserve">1η</w:t>
-            </w:r>
-          </w:p>
-        </w:tc>
-        <w:tc>
-          <w:tcPr/>
-          <w:p>
-            <w:pPr>
-              <w:pStyle w:val="Compact"/>
-            </w:pPr>
-            <w:r>
-              <w:t xml:space="preserve">2η</w:t>
-            </w:r>
-          </w:p>
-        </w:tc>
-        <w:tc>
-          <w:tcPr/>
-          <w:p>
-            <w:pPr>
-              <w:pStyle w:val="Compact"/>
-            </w:pPr>
-            <w:r>
-              <w:t xml:space="preserve">Αριθμός κλήρωσης</w:t>
-            </w:r>
-          </w:p>
-        </w:tc>
-      </w:tr>
-      <w:tr>
-        <w:tc>
-          <w:tcPr/>
-          <w:p>
-            <w:pPr>
-              <w:pStyle w:val="Compact"/>
-            </w:pPr>
-            <w:r>
-              <w:t xml:space="preserve">Νίκος</w:t>
-            </w:r>
-          </w:p>
-        </w:tc>
-        <w:tc>
-          <w:tcPr/>
-          <w:p>
-            <w:pPr>
-              <w:pStyle w:val="Compact"/>
-            </w:pPr>
-            <w:r>
-              <w:t xml:space="preserve">Ρομποτική</w:t>
-            </w:r>
-          </w:p>
-        </w:tc>
-        <w:tc>
-          <w:tcPr/>
-          <w:p>
-            <w:pPr>
-              <w:pStyle w:val="Compact"/>
-            </w:pPr>
-            <w:r>
-              <w:t xml:space="preserve">Σκάκι</w:t>
-            </w:r>
-          </w:p>
-        </w:tc>
-        <w:tc>
-          <w:tcPr/>
-          <w:p>
-            <w:pPr>
-              <w:pStyle w:val="Compact"/>
-            </w:pPr>
-            <w:r>
-              <w:t xml:space="preserve">1</w:t>
-            </w:r>
-          </w:p>
-        </w:tc>
-      </w:tr>
-      <w:tr>
-        <w:tc>
-          <w:tcPr/>
-          <w:p>
-            <w:pPr>
-              <w:pStyle w:val="Compact"/>
-            </w:pPr>
-            <w:r>
-              <w:t xml:space="preserve">Γιώργος</w:t>
-            </w:r>
-          </w:p>
-        </w:tc>
-        <w:tc>
-          <w:tcPr/>
-          <w:p>
-            <w:pPr>
-              <w:pStyle w:val="Compact"/>
-            </w:pPr>
-            <w:r>
-              <w:t xml:space="preserve">Ρομποτική</w:t>
-            </w:r>
-          </w:p>
-        </w:tc>
-        <w:tc>
-          <w:tcPr/>
-          <w:p>
-            <w:pPr>
-              <w:pStyle w:val="Compact"/>
-            </w:pPr>
-            <w:r>
-              <w:t xml:space="preserve">Σκάκι</w:t>
-            </w:r>
-          </w:p>
-        </w:tc>
-        <w:tc>
-          <w:tcPr/>
-          <w:p>
-            <w:pPr>
-              <w:pStyle w:val="Compact"/>
-            </w:pPr>
-            <w:r>
-              <w:t xml:space="preserve">2</w:t>
-            </w:r>
-          </w:p>
-        </w:tc>
-      </w:tr>
-      <w:tr>
-        <w:tc>
-          <w:tcPr/>
-          <w:p>
-            <w:pPr>
-              <w:pStyle w:val="Compact"/>
-            </w:pPr>
-            <w:r>
-              <w:t xml:space="preserve">Σοφία</w:t>
-            </w:r>
-          </w:p>
-        </w:tc>
-        <w:tc>
-          <w:tcPr/>
-          <w:p>
-            <w:pPr>
-              <w:pStyle w:val="Compact"/>
-            </w:pPr>
-            <w:r>
-              <w:t xml:space="preserve">Σκάκι</w:t>
-            </w:r>
-          </w:p>
-        </w:tc>
-        <w:tc>
-          <w:tcPr/>
-          <w:p>
-            <w:pPr>
-              <w:pStyle w:val="Compact"/>
-            </w:pPr>
-            <w:r>
-              <w:t xml:space="preserve">Ρομποτική</w:t>
-            </w:r>
-          </w:p>
-        </w:tc>
-        <w:tc>
-          <w:tcPr/>
-          <w:p>
-            <w:pPr>
-              <w:pStyle w:val="Compact"/>
-            </w:pPr>
-            <w:r>
-              <w:t xml:space="preserve">3</w:t>
-            </w:r>
-          </w:p>
-        </w:tc>
-      </w:tr>
-    </w:tbl>
-    <w:p>
-      <w:pPr>
-        <w:pStyle w:val="Compact"/>
-        <w:numPr>
-          <w:ilvl w:val="0"/>
-          <w:numId w:val="1009"/>
-        </w:numPr>
-      </w:pPr>
-      <w:r>
-        <w:rPr>
-          <w:b/>
-          <w:bCs/>
-        </w:rPr>
-        <w:t xml:space="preserve">Νίκος (1):</w:t>
-      </w:r>
-      <w:r>
-        <w:t xml:space="preserve"> </w:t>
-      </w:r>
-      <w:r>
-        <w:t xml:space="preserve">διαλέγει Ρομποτική.</w:t>
-      </w:r>
-    </w:p>
-    <w:p>
-      <w:pPr>
-        <w:pStyle w:val="Compact"/>
-        <w:numPr>
-          <w:ilvl w:val="0"/>
-          <w:numId w:val="1009"/>
-        </w:numPr>
-      </w:pPr>
-      <w:r>
-        <w:rPr>
-          <w:b/>
-          <w:bCs/>
-        </w:rPr>
-        <w:t xml:space="preserve">Γιώργος (2):</w:t>
-      </w:r>
-      <w:r>
-        <w:t xml:space="preserve"> </w:t>
-      </w:r>
-      <w:r>
-        <w:t xml:space="preserve">η Ρομποτική γέμισε → παίρνει τη 2η του επιλογή, Σκάκι.</w:t>
-      </w:r>
-    </w:p>
-    <w:p>
-      <w:pPr>
-        <w:pStyle w:val="Compact"/>
-        <w:numPr>
-          <w:ilvl w:val="0"/>
-          <w:numId w:val="1009"/>
         </w:numPr>
       </w:pPr>
       <w:r>
@@ -2255,24 +2351,102 @@
         <w:pStyle w:val="Compact"/>
         <w:numPr>
           <w:ilvl w:val="0"/>
+          <w:numId w:val="1009"/>
+        </w:numPr>
+      </w:pPr>
+      <w:r>
+        <w:t xml:space="preserve">Ρομποτική (1 θέση): Άννα (3) και Γιώργος (2). Κλήρωση:</w:t>
+      </w:r>
+      <w:r>
+        <w:t xml:space="preserve"> </w:t>
+      </w:r>
+      <w:r>
+        <w:rPr>
+          <w:b/>
+          <w:bCs/>
+        </w:rPr>
+        <w:t xml:space="preserve">κρατά προσωρινά τον Γιώργο</w:t>
+      </w:r>
+      <w:r>
+        <w:t xml:space="preserve">, απορρίπτει την Άννα.</w:t>
+      </w:r>
+    </w:p>
+    <w:p>
+      <w:pPr>
+        <w:pStyle w:val="Compact"/>
+        <w:numPr>
+          <w:ilvl w:val="0"/>
+          <w:numId w:val="1009"/>
+        </w:numPr>
+      </w:pPr>
+      <w:r>
+        <w:t xml:space="preserve">Θέατρο (1 θέση): Βασίλης (1) και Δήμητρα (4).</w:t>
+      </w:r>
+      <w:r>
+        <w:t xml:space="preserve"> </w:t>
+      </w:r>
+      <w:r>
+        <w:rPr>
+          <w:b/>
+          <w:bCs/>
+        </w:rPr>
+        <w:t xml:space="preserve">Κρατά προσωρινά τον Βασίλη</w:t>
+      </w:r>
+      <w:r>
+        <w:t xml:space="preserve">, απορρίπτει τη Δήμητρα.</w:t>
+      </w:r>
+    </w:p>
+    <w:p>
+      <w:pPr>
+        <w:pStyle w:val="FirstParagraph"/>
+      </w:pPr>
+      <w:r>
+        <w:rPr>
+          <w:b/>
+          <w:bCs/>
+        </w:rPr>
+        <w:t xml:space="preserve">Γύρος 2</w:t>
+      </w:r>
+      <w:r>
+        <w:t xml:space="preserve"> </w:t>
+      </w:r>
+      <w:r>
+        <w:t xml:space="preserve">— όσοι απορρίφθηκαν πάνε στη 2η επιλογή τους.</w:t>
+      </w:r>
+    </w:p>
+    <w:p>
+      <w:pPr>
+        <w:pStyle w:val="Compact"/>
+        <w:numPr>
+          <w:ilvl w:val="0"/>
           <w:numId w:val="1010"/>
         </w:numPr>
       </w:pPr>
       <w:r>
-        <w:t xml:space="preserve">Ρομποτική (1 θέση): Άννα (3) και Γιώργος (2). Κλήρωση:</w:t>
-      </w:r>
-      <w:r>
-        <w:t xml:space="preserve"> </w:t>
-      </w:r>
-      <w:r>
-        <w:rPr>
-          <w:b/>
-          <w:bCs/>
-        </w:rPr>
-        <w:t xml:space="preserve">κρατά προσωρινά τον Γιώργο</w:t>
-      </w:r>
-      <w:r>
-        <w:t xml:space="preserve">, απορρίπτει την Άννα.</w:t>
+        <w:t xml:space="preserve">Άννα → Θέατρο. Εκεί κρατιέται ο Βασίλης, όμως η Άννα είναι στη</w:t>
+      </w:r>
+      <w:r>
+        <w:t xml:space="preserve"> </w:t>
+      </w:r>
+      <w:r>
+        <w:rPr>
+          <w:b/>
+          <w:bCs/>
+        </w:rPr>
+        <w:t xml:space="preserve">λίστα της εκπαιδευτικού</w:t>
+      </w:r>
+      <w:r>
+        <w:t xml:space="preserve">:</w:t>
+      </w:r>
+      <w:r>
+        <w:t xml:space="preserve"> </w:t>
+      </w:r>
+      <w:r>
+        <w:rPr>
+          <w:b/>
+          <w:bCs/>
+        </w:rPr>
+        <w:t xml:space="preserve">το Θέατρο κρατά την Άννα και εκτοπίζει τον Βασίλη.</w:t>
       </w:r>
     </w:p>
     <w:p>
@@ -2284,20 +2458,20 @@
         </w:numPr>
       </w:pPr>
       <w:r>
-        <w:t xml:space="preserve">Θέατρο (1 θέση): Βασίλης (1) και Δήμητρα (4).</w:t>
-      </w:r>
-      <w:r>
-        <w:t xml:space="preserve"> </w:t>
-      </w:r>
-      <w:r>
-        <w:rPr>
-          <w:b/>
-          <w:bCs/>
-        </w:rPr>
-        <w:t xml:space="preserve">Κρατά προσωρινά τον Βασίλη</w:t>
-      </w:r>
-      <w:r>
-        <w:t xml:space="preserve">, απορρίπτει τη Δήμητρα.</w:t>
+        <w:t xml:space="preserve">Δήμητρα → Σκάκι. Υπάρχουν ελεύθερες θέσεις:</w:t>
+      </w:r>
+      <w:r>
+        <w:t xml:space="preserve"> </w:t>
+      </w:r>
+      <w:r>
+        <w:rPr>
+          <w:b/>
+          <w:bCs/>
+        </w:rPr>
+        <w:t xml:space="preserve">κρατιέται</w:t>
+      </w:r>
+      <w:r>
+        <w:t xml:space="preserve">.</w:t>
       </w:r>
     </w:p>
     <w:p>
@@ -2309,13 +2483,13 @@
           <w:b/>
           <w:bCs/>
         </w:rPr>
-        <w:t xml:space="preserve">Γύρος 2</w:t>
-      </w:r>
-      <w:r>
-        <w:t xml:space="preserve"> </w:t>
-      </w:r>
-      <w:r>
-        <w:t xml:space="preserve">— όσοι απορρίφθηκαν πάνε στη 2η επιλογή τους.</w:t>
+        <w:t xml:space="preserve">Γύρος 3</w:t>
+      </w:r>
+      <w:r>
+        <w:t xml:space="preserve"> </w:t>
+      </w:r>
+      <w:r>
+        <w:t xml:space="preserve">— ο Βασίλης πάει στη 2η επιλογή του.</w:t>
       </w:r>
     </w:p>
     <w:p>
@@ -2327,52 +2501,57 @@
         </w:numPr>
       </w:pPr>
       <w:r>
-        <w:t xml:space="preserve">Άννα → Θέατρο. Εκεί κρατιέται ο Βασίλης, όμως η Άννα είναι στη</w:t>
-      </w:r>
-      <w:r>
-        <w:t xml:space="preserve"> </w:t>
-      </w:r>
-      <w:r>
-        <w:rPr>
-          <w:b/>
-          <w:bCs/>
-        </w:rPr>
-        <w:t xml:space="preserve">λίστα της εκπαιδευτικού</w:t>
-      </w:r>
-      <w:r>
-        <w:t xml:space="preserve">:</w:t>
-      </w:r>
-      <w:r>
-        <w:t xml:space="preserve"> </w:t>
-      </w:r>
-      <w:r>
-        <w:rPr>
-          <w:b/>
-          <w:bCs/>
-        </w:rPr>
-        <w:t xml:space="preserve">το Θέατρο κρατά την Άννα και εκτοπίζει τον Βασίλη.</w:t>
-      </w:r>
-    </w:p>
-    <w:p>
-      <w:pPr>
-        <w:pStyle w:val="Compact"/>
-        <w:numPr>
-          <w:ilvl w:val="0"/>
-          <w:numId w:val="1011"/>
-        </w:numPr>
-      </w:pPr>
-      <w:r>
-        <w:t xml:space="preserve">Δήμητρα → Σκάκι. Υπάρχουν ελεύθερες θέσεις:</w:t>
-      </w:r>
-      <w:r>
-        <w:t xml:space="preserve"> </w:t>
-      </w:r>
-      <w:r>
-        <w:rPr>
-          <w:b/>
-          <w:bCs/>
-        </w:rPr>
-        <w:t xml:space="preserve">κρατιέται</w:t>
+        <w:t xml:space="preserve">Βασίλης → Ρομποτική. Εκεί κρατιέται ο Γιώργος (2). Ο Βασίλης έχει καλύτερο αριθμό (1):</w:t>
+      </w:r>
+      <w:r>
+        <w:t xml:space="preserve"> </w:t>
+      </w:r>
+      <w:r>
+        <w:rPr>
+          <w:b/>
+          <w:bCs/>
+        </w:rPr>
+        <w:t xml:space="preserve">η Ρομποτική κρατά τον Βασίλη και εκτοπίζει τον Γιώργο</w:t>
+      </w:r>
+      <w:r>
+        <w:t xml:space="preserve"> </w:t>
+      </w:r>
+      <w:r>
+        <w:t xml:space="preserve">— παρότι ο Γιώργος την είχε 1η επιλογή και ο Βασίλης 2η. Η θέση στη λίστα δεν δίνει προτεραιότητα.</w:t>
+      </w:r>
+    </w:p>
+    <w:p>
+      <w:pPr>
+        <w:pStyle w:val="FirstParagraph"/>
+      </w:pPr>
+      <w:r>
+        <w:rPr>
+          <w:b/>
+          <w:bCs/>
+        </w:rPr>
+        <w:t xml:space="preserve">Γύρος 4</w:t>
+      </w:r>
+    </w:p>
+    <w:p>
+      <w:pPr>
+        <w:pStyle w:val="Compact"/>
+        <w:numPr>
+          <w:ilvl w:val="0"/>
+          <w:numId w:val="1012"/>
+        </w:numPr>
+      </w:pPr>
+      <w:r>
+        <w:t xml:space="preserve">Γιώργος → Θέατρο (2η επιλογή). Εκεί είναι η Άννα, από τη λίστα της εκπαιδευτικού:</w:t>
+      </w:r>
+      <w:r>
+        <w:t xml:space="preserve"> </w:t>
+      </w:r>
+      <w:r>
+        <w:rPr>
+          <w:b/>
+          <w:bCs/>
+        </w:rPr>
+        <w:t xml:space="preserve">ο Γιώργος απορρίπτεται</w:t>
       </w:r>
       <w:r>
         <w:t xml:space="preserve">.</w:t>
@@ -2387,53 +2566,7 @@
           <w:b/>
           <w:bCs/>
         </w:rPr>
-        <w:t xml:space="preserve">Γύρος 3</w:t>
-      </w:r>
-      <w:r>
-        <w:t xml:space="preserve"> </w:t>
-      </w:r>
-      <w:r>
-        <w:t xml:space="preserve">— ο Βασίλης πάει στη 2η επιλογή του.</w:t>
-      </w:r>
-    </w:p>
-    <w:p>
-      <w:pPr>
-        <w:pStyle w:val="Compact"/>
-        <w:numPr>
-          <w:ilvl w:val="0"/>
-          <w:numId w:val="1012"/>
-        </w:numPr>
-      </w:pPr>
-      <w:r>
-        <w:t xml:space="preserve">Βασίλης → Ρομποτική. Εκεί κρατιέται ο Γιώργος (2). Ο Βασίλης έχει καλύτερο αριθμό (1):</w:t>
-      </w:r>
-      <w:r>
-        <w:t xml:space="preserve"> </w:t>
-      </w:r>
-      <w:r>
-        <w:rPr>
-          <w:b/>
-          <w:bCs/>
-        </w:rPr>
-        <w:t xml:space="preserve">η Ρομποτική κρατά τον Βασίλη και εκτοπίζει τον Γιώργο</w:t>
-      </w:r>
-      <w:r>
-        <w:t xml:space="preserve"> </w:t>
-      </w:r>
-      <w:r>
-        <w:t xml:space="preserve">— παρότι ο Γιώργος την είχε 1η επιλογή και ο Βασίλης 2η. Η θέση στη λίστα δεν δίνει προτεραιότητα.</w:t>
-      </w:r>
-    </w:p>
-    <w:p>
-      <w:pPr>
-        <w:pStyle w:val="FirstParagraph"/>
-      </w:pPr>
-      <w:r>
-        <w:rPr>
-          <w:b/>
-          <w:bCs/>
-        </w:rPr>
-        <w:t xml:space="preserve">Γύρος 4</w:t>
+        <w:t xml:space="preserve">Γύρος 5</w:t>
       </w:r>
     </w:p>
     <w:p>
@@ -2442,43 +2575,6 @@
         <w:numPr>
           <w:ilvl w:val="0"/>
           <w:numId w:val="1013"/>
-        </w:numPr>
-      </w:pPr>
-      <w:r>
-        <w:t xml:space="preserve">Γιώργος → Θέατρο (2η επιλογή). Εκεί είναι η Άννα, από τη λίστα της εκπαιδευτικού:</w:t>
-      </w:r>
-      <w:r>
-        <w:t xml:space="preserve"> </w:t>
-      </w:r>
-      <w:r>
-        <w:rPr>
-          <w:b/>
-          <w:bCs/>
-        </w:rPr>
-        <w:t xml:space="preserve">ο Γιώργος απορρίπτεται</w:t>
-      </w:r>
-      <w:r>
-        <w:t xml:space="preserve">.</w:t>
-      </w:r>
-    </w:p>
-    <w:p>
-      <w:pPr>
-        <w:pStyle w:val="FirstParagraph"/>
-      </w:pPr>
-      <w:r>
-        <w:rPr>
-          <w:b/>
-          <w:bCs/>
-        </w:rPr>
-        <w:t xml:space="preserve">Γύρος 5</w:t>
-      </w:r>
-    </w:p>
-    <w:p>
-      <w:pPr>
-        <w:pStyle w:val="Compact"/>
-        <w:numPr>
-          <w:ilvl w:val="0"/>
-          <w:numId w:val="1014"/>
         </w:numPr>
       </w:pPr>
       <w:r>
@@ -2748,7 +2844,7 @@
         <w:pStyle w:val="Compact"/>
         <w:numPr>
           <w:ilvl w:val="0"/>
-          <w:numId w:val="1015"/>
+          <w:numId w:val="1014"/>
         </w:numPr>
       </w:pPr>
       <w:r>
@@ -2786,7 +2882,7 @@
         <w:pStyle w:val="Compact"/>
         <w:numPr>
           <w:ilvl w:val="0"/>
-          <w:numId w:val="1015"/>
+          <w:numId w:val="1014"/>
         </w:numPr>
       </w:pPr>
       <w:r>
@@ -2808,7 +2904,7 @@
         <w:pStyle w:val="Compact"/>
         <w:numPr>
           <w:ilvl w:val="0"/>
-          <w:numId w:val="1015"/>
+          <w:numId w:val="1014"/>
         </w:numPr>
       </w:pPr>
       <w:r>
@@ -2830,7 +2926,7 @@
         <w:pStyle w:val="Compact"/>
         <w:numPr>
           <w:ilvl w:val="0"/>
-          <w:numId w:val="1015"/>
+          <w:numId w:val="1014"/>
         </w:numPr>
       </w:pPr>
       <w:r>
@@ -2852,7 +2948,7 @@
         <w:pStyle w:val="Compact"/>
         <w:numPr>
           <w:ilvl w:val="0"/>
-          <w:numId w:val="1015"/>
+          <w:numId w:val="1014"/>
         </w:numPr>
       </w:pPr>
       <w:r>
@@ -2884,7 +2980,7 @@
         <w:pStyle w:val="Compact"/>
         <w:numPr>
           <w:ilvl w:val="0"/>
-          <w:numId w:val="1016"/>
+          <w:numId w:val="1015"/>
         </w:numPr>
       </w:pPr>
       <w:r>
@@ -2909,7 +3005,7 @@
         <w:pStyle w:val="Compact"/>
         <w:numPr>
           <w:ilvl w:val="0"/>
-          <w:numId w:val="1016"/>
+          <w:numId w:val="1015"/>
         </w:numPr>
       </w:pPr>
       <w:r>
@@ -2968,7 +3064,7 @@
         <w:pStyle w:val="Compact"/>
         <w:numPr>
           <w:ilvl w:val="0"/>
-          <w:numId w:val="1017"/>
+          <w:numId w:val="1016"/>
         </w:numPr>
       </w:pPr>
       <w:r>
@@ -2996,7 +3092,7 @@
         <w:pStyle w:val="Compact"/>
         <w:numPr>
           <w:ilvl w:val="0"/>
-          <w:numId w:val="1017"/>
+          <w:numId w:val="1016"/>
         </w:numPr>
       </w:pPr>
       <w:r>
@@ -3008,7 +3104,7 @@
         <w:pStyle w:val="Compact"/>
         <w:numPr>
           <w:ilvl w:val="0"/>
-          <w:numId w:val="1017"/>
+          <w:numId w:val="1016"/>
         </w:numPr>
       </w:pPr>
       <w:r>
@@ -3096,7 +3192,7 @@
         <w:pStyle w:val="Compact"/>
         <w:numPr>
           <w:ilvl w:val="0"/>
-          <w:numId w:val="1018"/>
+          <w:numId w:val="1017"/>
         </w:numPr>
       </w:pPr>
       <w:r>
@@ -3124,7 +3220,7 @@
         <w:pStyle w:val="Compact"/>
         <w:numPr>
           <w:ilvl w:val="0"/>
-          <w:numId w:val="1018"/>
+          <w:numId w:val="1017"/>
         </w:numPr>
       </w:pPr>
       <w:r>
@@ -3152,7 +3248,7 @@
         <w:pStyle w:val="Compact"/>
         <w:numPr>
           <w:ilvl w:val="0"/>
-          <w:numId w:val="1018"/>
+          <w:numId w:val="1017"/>
         </w:numPr>
       </w:pPr>
       <w:r>
@@ -3182,7 +3278,7 @@
         <w:pStyle w:val="Compact"/>
         <w:numPr>
           <w:ilvl w:val="0"/>
-          <w:numId w:val="1019"/>
+          <w:numId w:val="1018"/>
         </w:numPr>
       </w:pPr>
       <w:r>
@@ -3223,7 +3319,7 @@
         <w:pStyle w:val="Compact"/>
         <w:numPr>
           <w:ilvl w:val="0"/>
-          <w:numId w:val="1019"/>
+          <w:numId w:val="1018"/>
         </w:numPr>
       </w:pPr>
       <w:r>
@@ -3235,7 +3331,7 @@
         <w:pStyle w:val="Compact"/>
         <w:numPr>
           <w:ilvl w:val="0"/>
-          <w:numId w:val="1019"/>
+          <w:numId w:val="1018"/>
         </w:numPr>
       </w:pPr>
       <w:r>
@@ -3266,7 +3362,7 @@
         <w:pStyle w:val="Compact"/>
         <w:numPr>
           <w:ilvl w:val="0"/>
-          <w:numId w:val="1020"/>
+          <w:numId w:val="1019"/>
         </w:numPr>
       </w:pPr>
       <w:r>
@@ -3291,7 +3387,7 @@
         <w:pStyle w:val="Compact"/>
         <w:numPr>
           <w:ilvl w:val="0"/>
-          <w:numId w:val="1020"/>
+          <w:numId w:val="1019"/>
         </w:numPr>
       </w:pPr>
       <w:r>
@@ -3374,6 +3470,42 @@
           <w:b/>
           <w:bCs/>
         </w:rPr>
+        <w:t xml:space="preserve">Έχει σημασία με ποια σειρά τσεκάρω τους μαθητές;</w:t>
+      </w:r>
+      <w:r>
+        <w:t xml:space="preserve"> </w:t>
+      </w:r>
+      <w:r>
+        <w:t xml:space="preserve">Όχι. Η λίστα δεν ξεπερνά τις θέσεις, άρα όσοι από αυτήν δηλώσουν τον όμιλο χωρούν όλοι.</w:t>
+      </w:r>
+    </w:p>
+    <w:p>
+      <w:pPr>
+        <w:pStyle w:val="BodyText"/>
+      </w:pPr>
+      <w:r>
+        <w:rPr>
+          <w:b/>
+          <w:bCs/>
+        </w:rPr>
+        <w:t xml:space="preserve">Μπορώ να αλλάξω τη χωρητικότητα;</w:t>
+      </w:r>
+      <w:r>
+        <w:t xml:space="preserve"> </w:t>
+      </w:r>
+      <w:r>
+        <w:t xml:space="preserve">Όχι από την πλατφόρμα· την ορίζει ο υπεύθυνος των ομίλων. Αν χρειάζεται αλλαγή, επικοινωνήστε μαζί του.</w:t>
+      </w:r>
+    </w:p>
+    <w:p>
+      <w:pPr>
+        <w:pStyle w:val="BodyText"/>
+      </w:pPr>
+      <w:r>
+        <w:rPr>
+          <w:b/>
+          <w:bCs/>
+        </w:rPr>
         <w:t xml:space="preserve">Ένας μαθητής έβαλε τον όμιλό μου 1ο και δεν μπήκε, ενώ άλλος τον έβαλε 4ο και μπήκε. Γιατί;</w:t>
       </w:r>
       <w:r>
@@ -3514,6 +3646,165 @@
         <w:pStyle w:val="Compact"/>
         <w:numPr>
           <w:ilvl w:val="0"/>
+          <w:numId w:val="1020"/>
+        </w:numPr>
+      </w:pPr>
+      <w:r>
+        <w:rPr>
+          <w:b/>
+          <w:bCs/>
+        </w:rPr>
+        <w:t xml:space="preserve">I</w:t>
+      </w:r>
+      <w:r>
+        <w:t xml:space="preserve">: οι μαθητές·</w:t>
+      </w:r>
+      <w:r>
+        <w:t xml:space="preserve"> </w:t>
+      </w:r>
+      <w:r>
+        <w:rPr>
+          <w:b/>
+          <w:bCs/>
+        </w:rPr>
+        <w:t xml:space="preserve">C</w:t>
+      </w:r>
+      <w:r>
+        <w:t xml:space="preserve">: οι όμιλοι της ημέρας· κάθε όμιλος c έχει</w:t>
+      </w:r>
+      <w:r>
+        <w:t xml:space="preserve"> </w:t>
+      </w:r>
+      <w:r>
+        <w:rPr>
+          <w:b/>
+          <w:bCs/>
+        </w:rPr>
+        <w:t xml:space="preserve">χωρητικότητα</w:t>
+      </w:r>
+      <w:r>
+        <w:t xml:space="preserve"> </w:t>
+      </w:r>
+      <w:r>
+        <w:t xml:space="preserve">q_c.</w:t>
+      </w:r>
+    </w:p>
+    <w:p>
+      <w:pPr>
+        <w:pStyle w:val="Compact"/>
+        <w:numPr>
+          <w:ilvl w:val="0"/>
+          <w:numId w:val="1020"/>
+        </w:numPr>
+      </w:pPr>
+      <w:r>
+        <w:t xml:space="preserve">Κάθε μαθητής i έχει μια</w:t>
+      </w:r>
+      <w:r>
+        <w:t xml:space="preserve"> </w:t>
+      </w:r>
+      <w:r>
+        <w:rPr>
+          <w:b/>
+          <w:bCs/>
+        </w:rPr>
+        <w:t xml:space="preserve">αυστηρή σειρά προτίμησης</w:t>
+      </w:r>
+      <w:r>
+        <w:t xml:space="preserve"> </w:t>
+      </w:r>
+      <w:r>
+        <w:t xml:space="preserve">P_i πάνω στους ομίλους της ημέρας που αφορούν την τάξη του (η φόρμα απαιτεί πλήρη κατάταξη).</w:t>
+      </w:r>
+    </w:p>
+    <w:p>
+      <w:pPr>
+        <w:pStyle w:val="Compact"/>
+        <w:numPr>
+          <w:ilvl w:val="0"/>
+          <w:numId w:val="1020"/>
+        </w:numPr>
+      </w:pPr>
+      <w:r>
+        <w:t xml:space="preserve">Κάθε όμιλος c έχει μια</w:t>
+      </w:r>
+      <w:r>
+        <w:t xml:space="preserve"> </w:t>
+      </w:r>
+      <w:r>
+        <w:rPr>
+          <w:b/>
+          <w:bCs/>
+        </w:rPr>
+        <w:t xml:space="preserve">αυστηρή σειρά προτεραιότητας</w:t>
+      </w:r>
+      <w:r>
+        <w:t xml:space="preserve"> </w:t>
+      </w:r>
+      <w:r>
+        <w:t xml:space="preserve">≻_c πάνω στους μαθητές (§3).</w:t>
+      </w:r>
+    </w:p>
+    <w:p>
+      <w:pPr>
+        <w:pStyle w:val="Compact"/>
+        <w:numPr>
+          <w:ilvl w:val="0"/>
+          <w:numId w:val="1020"/>
+        </w:numPr>
+      </w:pPr>
+      <w:r>
+        <w:rPr>
+          <w:b/>
+          <w:bCs/>
+        </w:rPr>
+        <w:t xml:space="preserve">Αντιστοίχιση</w:t>
+      </w:r>
+      <w:r>
+        <w:t xml:space="preserve"> </w:t>
+      </w:r>
+      <w:r>
+        <w:t xml:space="preserve">μ: κάθε μαθητής παίρνει το πολύ έναν όμιλο και κάθε όμιλος c το πολύ q_c μαθητές.</w:t>
+      </w:r>
+    </w:p>
+    <w:p>
+      <w:pPr>
+        <w:pStyle w:val="FirstParagraph"/>
+      </w:pPr>
+      <w:r>
+        <w:t xml:space="preserve">Όπως στο school choice, οι όμιλοι δεν είναι «παίκτες» με δικές τους προτιμήσεις: η σειρά ≻_c είναι</w:t>
+      </w:r>
+      <w:r>
+        <w:t xml:space="preserve"> </w:t>
+      </w:r>
+      <w:r>
+        <w:rPr>
+          <w:b/>
+          <w:bCs/>
+        </w:rPr>
+        <w:t xml:space="preserve">κανόνας προτεραιότητας</w:t>
+      </w:r>
+      <w:r>
+        <w:t xml:space="preserve"> </w:t>
+      </w:r>
+      <w:r>
+        <w:t xml:space="preserve">που ορίζει το σχολείο (Abdulkadiroğlu &amp; Sönmez, 2003).</w:t>
+      </w:r>
+    </w:p>
+    <w:bookmarkStart w:id="28" w:name="ιδιότητες-που-ζητάμε"/>
+    <w:p>
+      <w:pPr>
+        <w:pStyle w:val="Heading4"/>
+      </w:pPr>
+      <w:r>
+        <w:t xml:space="preserve">Ιδιότητες που ζητάμε</w:t>
+      </w:r>
+    </w:p>
+    <w:p>
+      <w:pPr>
+        <w:pStyle w:val="Compact"/>
+        <w:numPr>
+          <w:ilvl w:val="0"/>
           <w:numId w:val="1021"/>
         </w:numPr>
       </w:pPr>
@@ -3522,39 +3813,13 @@
           <w:b/>
           <w:bCs/>
         </w:rPr>
-        <w:t xml:space="preserve">I</w:t>
-      </w:r>
-      <w:r>
-        <w:t xml:space="preserve">: οι μαθητές·</w:t>
-      </w:r>
-      <w:r>
-        <w:t xml:space="preserve"> </w:t>
-      </w:r>
-      <w:r>
-        <w:rPr>
-          <w:b/>
-          <w:bCs/>
-        </w:rPr>
-        <w:t xml:space="preserve">C</w:t>
-      </w:r>
-      <w:r>
-        <w:t xml:space="preserve">: οι όμιλοι της ημέρας· κάθε όμιλος c έχει</w:t>
-      </w:r>
-      <w:r>
-        <w:t xml:space="preserve"> </w:t>
-      </w:r>
-      <w:r>
-        <w:rPr>
-          <w:b/>
-          <w:bCs/>
-        </w:rPr>
-        <w:t xml:space="preserve">χωρητικότητα</w:t>
-      </w:r>
-      <w:r>
-        <w:t xml:space="preserve"> </w:t>
-      </w:r>
-      <w:r>
-        <w:t xml:space="preserve">q_c.</w:t>
+        <w:t xml:space="preserve">Ατομική ορθολογικότητα:</w:t>
+      </w:r>
+      <w:r>
+        <w:t xml:space="preserve"> </w:t>
+      </w:r>
+      <w:r>
+        <w:t xml:space="preserve">κανείς δεν τοποθετείται σε όμιλο που δεν δήλωσε.</w:t>
       </w:r>
     </w:p>
     <w:p>
@@ -3566,23 +3831,17 @@
         </w:numPr>
       </w:pPr>
       <w:r>
-        <w:t xml:space="preserve">Κάθε μαθητής i έχει μια</w:t>
-      </w:r>
-      <w:r>
-        <w:t xml:space="preserve"> </w:t>
-      </w:r>
-      <w:r>
-        <w:rPr>
-          <w:b/>
-          <w:bCs/>
-        </w:rPr>
-        <w:t xml:space="preserve">αυστηρή σειρά προτίμησης</w:t>
-      </w:r>
-      <w:r>
-        <w:t xml:space="preserve"> </w:t>
-      </w:r>
-      <w:r>
-        <w:t xml:space="preserve">P_i πάνω στους ομίλους της ημέρας που αφορούν την τάξη του (η φόρμα απαιτεί πλήρη κατάταξη).</w:t>
+        <w:rPr>
+          <w:b/>
+          <w:bCs/>
+        </w:rPr>
+        <w:t xml:space="preserve">Μη σπατάλη (non-wastefulness):</w:t>
+      </w:r>
+      <w:r>
+        <w:t xml:space="preserve"> </w:t>
+      </w:r>
+      <w:r>
+        <w:t xml:space="preserve">αν ο i προτιμά τον όμιλο c από αυτόν που πήρε, τότε ο c είναι γεμάτος.</w:t>
       </w:r>
     </w:p>
     <w:p>
@@ -3591,133 +3850,6 @@
         <w:numPr>
           <w:ilvl w:val="0"/>
           <w:numId w:val="1021"/>
-        </w:numPr>
-      </w:pPr>
-      <w:r>
-        <w:t xml:space="preserve">Κάθε όμιλος c έχει μια</w:t>
-      </w:r>
-      <w:r>
-        <w:t xml:space="preserve"> </w:t>
-      </w:r>
-      <w:r>
-        <w:rPr>
-          <w:b/>
-          <w:bCs/>
-        </w:rPr>
-        <w:t xml:space="preserve">αυστηρή σειρά προτεραιότητας</w:t>
-      </w:r>
-      <w:r>
-        <w:t xml:space="preserve"> </w:t>
-      </w:r>
-      <w:r>
-        <w:t xml:space="preserve">≻_c πάνω στους μαθητές (§3).</w:t>
-      </w:r>
-    </w:p>
-    <w:p>
-      <w:pPr>
-        <w:pStyle w:val="Compact"/>
-        <w:numPr>
-          <w:ilvl w:val="0"/>
-          <w:numId w:val="1021"/>
-        </w:numPr>
-      </w:pPr>
-      <w:r>
-        <w:rPr>
-          <w:b/>
-          <w:bCs/>
-        </w:rPr>
-        <w:t xml:space="preserve">Αντιστοίχιση</w:t>
-      </w:r>
-      <w:r>
-        <w:t xml:space="preserve"> </w:t>
-      </w:r>
-      <w:r>
-        <w:t xml:space="preserve">μ: κάθε μαθητής παίρνει το πολύ έναν όμιλο και κάθε όμιλος c το πολύ q_c μαθητές.</w:t>
-      </w:r>
-    </w:p>
-    <w:p>
-      <w:pPr>
-        <w:pStyle w:val="FirstParagraph"/>
-      </w:pPr>
-      <w:r>
-        <w:t xml:space="preserve">Όπως στο school choice, οι όμιλοι δεν είναι «παίκτες» με δικές τους προτιμήσεις: η σειρά ≻_c είναι</w:t>
-      </w:r>
-      <w:r>
-        <w:t xml:space="preserve"> </w:t>
-      </w:r>
-      <w:r>
-        <w:rPr>
-          <w:b/>
-          <w:bCs/>
-        </w:rPr>
-        <w:t xml:space="preserve">κανόνας προτεραιότητας</w:t>
-      </w:r>
-      <w:r>
-        <w:t xml:space="preserve"> </w:t>
-      </w:r>
-      <w:r>
-        <w:t xml:space="preserve">που ορίζει το σχολείο (Abdulkadiroğlu &amp; Sönmez, 2003).</w:t>
-      </w:r>
-    </w:p>
-    <w:bookmarkStart w:id="28" w:name="ιδιότητες-που-ζητάμε"/>
-    <w:p>
-      <w:pPr>
-        <w:pStyle w:val="Heading4"/>
-      </w:pPr>
-      <w:r>
-        <w:t xml:space="preserve">Ιδιότητες που ζητάμε</w:t>
-      </w:r>
-    </w:p>
-    <w:p>
-      <w:pPr>
-        <w:pStyle w:val="Compact"/>
-        <w:numPr>
-          <w:ilvl w:val="0"/>
-          <w:numId w:val="1022"/>
-        </w:numPr>
-      </w:pPr>
-      <w:r>
-        <w:rPr>
-          <w:b/>
-          <w:bCs/>
-        </w:rPr>
-        <w:t xml:space="preserve">Ατομική ορθολογικότητα:</w:t>
-      </w:r>
-      <w:r>
-        <w:t xml:space="preserve"> </w:t>
-      </w:r>
-      <w:r>
-        <w:t xml:space="preserve">κανείς δεν τοποθετείται σε όμιλο που δεν δήλωσε.</w:t>
-      </w:r>
-    </w:p>
-    <w:p>
-      <w:pPr>
-        <w:pStyle w:val="Compact"/>
-        <w:numPr>
-          <w:ilvl w:val="0"/>
-          <w:numId w:val="1022"/>
-        </w:numPr>
-      </w:pPr>
-      <w:r>
-        <w:rPr>
-          <w:b/>
-          <w:bCs/>
-        </w:rPr>
-        <w:t xml:space="preserve">Μη σπατάλη (non-wastefulness):</w:t>
-      </w:r>
-      <w:r>
-        <w:t xml:space="preserve"> </w:t>
-      </w:r>
-      <w:r>
-        <w:t xml:space="preserve">αν ο i προτιμά τον όμιλο c από αυτόν που πήρε, τότε ο c είναι γεμάτος.</w:t>
-      </w:r>
-    </w:p>
-    <w:p>
-      <w:pPr>
-        <w:pStyle w:val="Compact"/>
-        <w:numPr>
-          <w:ilvl w:val="0"/>
-          <w:numId w:val="1022"/>
         </w:numPr>
       </w:pPr>
       <w:r>
@@ -3834,6 +3966,102 @@
         <w:pStyle w:val="Compact"/>
         <w:numPr>
           <w:ilvl w:val="0"/>
+          <w:numId w:val="1022"/>
+        </w:numPr>
+      </w:pPr>
+      <w:r>
+        <w:rPr>
+          <w:b/>
+          <w:bCs/>
+        </w:rPr>
+        <w:t xml:space="preserve">Γύρος 1:</w:t>
+      </w:r>
+      <w:r>
+        <w:t xml:space="preserve"> </w:t>
+      </w:r>
+      <w:r>
+        <w:t xml:space="preserve">κάθε μαθητής κάνει αίτηση στην 1η επιλογή του. Κάθε όμιλος c κρατά</w:t>
+      </w:r>
+      <w:r>
+        <w:t xml:space="preserve"> </w:t>
+      </w:r>
+      <w:r>
+        <w:rPr>
+          <w:b/>
+          <w:bCs/>
+        </w:rPr>
+        <w:t xml:space="preserve">προσωρινά</w:t>
+      </w:r>
+      <w:r>
+        <w:t xml:space="preserve"> </w:t>
+      </w:r>
+      <w:r>
+        <w:t xml:space="preserve">τους q_c καλύτερους κατά ≻_c και απορρίπτει τους υπόλοιπους.</w:t>
+      </w:r>
+    </w:p>
+    <w:p>
+      <w:pPr>
+        <w:pStyle w:val="Compact"/>
+        <w:numPr>
+          <w:ilvl w:val="0"/>
+          <w:numId w:val="1022"/>
+        </w:numPr>
+      </w:pPr>
+      <w:r>
+        <w:rPr>
+          <w:b/>
+          <w:bCs/>
+        </w:rPr>
+        <w:t xml:space="preserve">Γύρος k:</w:t>
+      </w:r>
+      <w:r>
+        <w:t xml:space="preserve"> </w:t>
+      </w:r>
+      <w:r>
+        <w:t xml:space="preserve">κάθε μαθητής που απορρίφθηκε στον προηγούμενο γύρο κάνει αίτηση στην επόμενη επιλογή του. Κάθε όμιλος εξετάζει</w:t>
+      </w:r>
+      <w:r>
+        <w:t xml:space="preserve"> </w:t>
+      </w:r>
+      <w:r>
+        <w:rPr>
+          <w:b/>
+          <w:bCs/>
+        </w:rPr>
+        <w:t xml:space="preserve">μαζί</w:t>
+      </w:r>
+      <w:r>
+        <w:t xml:space="preserve"> </w:t>
+      </w:r>
+      <w:r>
+        <w:t xml:space="preserve">τους προσωρινά κρατημένους και τους νέους αιτούντες, κρατά τους q_c καλύτερους και απορρίπτει τους υπόλοιπους.</w:t>
+      </w:r>
+    </w:p>
+    <w:p>
+      <w:pPr>
+        <w:pStyle w:val="Compact"/>
+        <w:numPr>
+          <w:ilvl w:val="0"/>
+          <w:numId w:val="1022"/>
+        </w:numPr>
+      </w:pPr>
+      <w:r>
+        <w:t xml:space="preserve">Η διαδικασία τελειώνει όταν δεν γίνεται καμία νέα αίτηση· οι προσωρινές θέσεις γίνονται οριστικές.</w:t>
+      </w:r>
+    </w:p>
+    <w:p>
+      <w:pPr>
+        <w:pStyle w:val="FirstParagraph"/>
+      </w:pPr>
+      <w:r>
+        <w:t xml:space="preserve">Βασικά αποτελέσματα:</w:t>
+      </w:r>
+    </w:p>
+    <w:p>
+      <w:pPr>
+        <w:pStyle w:val="Compact"/>
+        <w:numPr>
+          <w:ilvl w:val="0"/>
           <w:numId w:val="1023"/>
         </w:numPr>
       </w:pPr>
@@ -3842,29 +4070,13 @@
           <w:b/>
           <w:bCs/>
         </w:rPr>
-        <w:t xml:space="preserve">Γύρος 1:</w:t>
-      </w:r>
-      <w:r>
-        <w:t xml:space="preserve"> </w:t>
-      </w:r>
-      <w:r>
-        <w:t xml:space="preserve">κάθε μαθητής κάνει αίτηση στην 1η επιλογή του. Κάθε όμιλος c κρατά</w:t>
-      </w:r>
-      <w:r>
-        <w:t xml:space="preserve"> </w:t>
-      </w:r>
-      <w:r>
-        <w:rPr>
-          <w:b/>
-          <w:bCs/>
-        </w:rPr>
-        <w:t xml:space="preserve">προσωρινά</w:t>
-      </w:r>
-      <w:r>
-        <w:t xml:space="preserve"> </w:t>
-      </w:r>
-      <w:r>
-        <w:t xml:space="preserve">τους q_c καλύτερους κατά ≻_c και απορρίπτει τους υπόλοιπους.</w:t>
+        <w:t xml:space="preserve">Τερματισμός:</w:t>
+      </w:r>
+      <w:r>
+        <w:t xml:space="preserve"> </w:t>
+      </w:r>
+      <w:r>
+        <w:t xml:space="preserve">κάθε μαθητής κάνει αίτηση σε κάθε όμιλο το πολύ μία φορά, άρα οι αιτήσεις —και επομένως και οι γύροι— είναι το πολύ Σ_i |P_i|.</w:t>
       </w:r>
     </w:p>
     <w:p>
@@ -3880,29 +4092,29 @@
           <w:b/>
           <w:bCs/>
         </w:rPr>
-        <w:t xml:space="preserve">Γύρος k:</w:t>
-      </w:r>
-      <w:r>
-        <w:t xml:space="preserve"> </w:t>
-      </w:r>
-      <w:r>
-        <w:t xml:space="preserve">κάθε μαθητής που απορρίφθηκε στον προηγούμενο γύρο κάνει αίτηση στην επόμενη επιλογή του. Κάθε όμιλος εξετάζει</w:t>
-      </w:r>
-      <w:r>
-        <w:t xml:space="preserve"> </w:t>
-      </w:r>
-      <w:r>
-        <w:rPr>
-          <w:b/>
-          <w:bCs/>
-        </w:rPr>
-        <w:t xml:space="preserve">μαζί</w:t>
-      </w:r>
-      <w:r>
-        <w:t xml:space="preserve"> </w:t>
-      </w:r>
-      <w:r>
-        <w:t xml:space="preserve">τους προσωρινά κρατημένους και τους νέους αιτούντες, κρατά τους q_c καλύτερους και απορρίπτει τους υπόλοιπους.</w:t>
+        <w:t xml:space="preserve">Ανεξαρτησία από τη σειρά:</w:t>
+      </w:r>
+      <w:r>
+        <w:t xml:space="preserve"> </w:t>
+      </w:r>
+      <w:r>
+        <w:t xml:space="preserve">το αποτέλεσμα</w:t>
+      </w:r>
+      <w:r>
+        <w:t xml:space="preserve"> </w:t>
+      </w:r>
+      <w:r>
+        <w:rPr>
+          <w:b/>
+          <w:bCs/>
+        </w:rPr>
+        <w:t xml:space="preserve">δεν εξαρτάται από τη σειρά</w:t>
+      </w:r>
+      <w:r>
+        <w:t xml:space="preserve"> </w:t>
+      </w:r>
+      <w:r>
+        <w:t xml:space="preserve">με την οποία εξετάζονται οι αιτήσεις — σε γύρους με όλους τους ομίλους ταυτόχρονα, ή μία αίτηση τη φορά με οποιαδήποτε σειρά. Προκύπτει από το θεώρημα βελτιστότητας των Gale &amp; Shapley (1962) —το αποτέλεσμα είναι η μοναδική βέλτιστη για τους μαθητές ευσταθής αντιστοίχιση, και η απόδειξη δεν εξαρτάται από τη σειρά των αιτήσεων— και διατυπώνεται ρητά από τους McVitie &amp; Wilson (1970). Γι' αυτό δεν υπάρχει όμιλος που «κληρώνεται πρώτος»: οι γύροι είναι μόνο ένας τρόπος υπολογισμού ενός αποτελέσματος που καθορίζεται πλήρως από τις λίστες, τις προτεραιότητες και τις χωρητικότητες. Η ιδιότητα ελέγχεται αυτόματα: σε 200 τυχαία στιγμιότυπα, ο υπολογισμός «μία αίτηση τη φορά, με τυχαία σειρά» (τρεις διαφορετικές σειρές ανά στιγμιότυπο) δίνει πάντα το ίδιο αποτέλεσμα με τους γύρους.</w:t>
       </w:r>
     </w:p>
     <w:p>
@@ -3914,86 +4126,6 @@
         </w:numPr>
       </w:pPr>
       <w:r>
-        <w:t xml:space="preserve">Η διαδικασία τελειώνει όταν δεν γίνεται καμία νέα αίτηση· οι προσωρινές θέσεις γίνονται οριστικές.</w:t>
-      </w:r>
-    </w:p>
-    <w:p>
-      <w:pPr>
-        <w:pStyle w:val="FirstParagraph"/>
-      </w:pPr>
-      <w:r>
-        <w:t xml:space="preserve">Βασικά αποτελέσματα:</w:t>
-      </w:r>
-    </w:p>
-    <w:p>
-      <w:pPr>
-        <w:pStyle w:val="Compact"/>
-        <w:numPr>
-          <w:ilvl w:val="0"/>
-          <w:numId w:val="1024"/>
-        </w:numPr>
-      </w:pPr>
-      <w:r>
-        <w:rPr>
-          <w:b/>
-          <w:bCs/>
-        </w:rPr>
-        <w:t xml:space="preserve">Τερματισμός:</w:t>
-      </w:r>
-      <w:r>
-        <w:t xml:space="preserve"> </w:t>
-      </w:r>
-      <w:r>
-        <w:t xml:space="preserve">κάθε μαθητής κάνει αίτηση σε κάθε όμιλο το πολύ μία φορά, άρα οι αιτήσεις —και επομένως και οι γύροι— είναι το πολύ Σ_i |P_i|.</w:t>
-      </w:r>
-    </w:p>
-    <w:p>
-      <w:pPr>
-        <w:pStyle w:val="Compact"/>
-        <w:numPr>
-          <w:ilvl w:val="0"/>
-          <w:numId w:val="1024"/>
-        </w:numPr>
-      </w:pPr>
-      <w:r>
-        <w:rPr>
-          <w:b/>
-          <w:bCs/>
-        </w:rPr>
-        <w:t xml:space="preserve">Ανεξαρτησία από τη σειρά:</w:t>
-      </w:r>
-      <w:r>
-        <w:t xml:space="preserve"> </w:t>
-      </w:r>
-      <w:r>
-        <w:t xml:space="preserve">το αποτέλεσμα</w:t>
-      </w:r>
-      <w:r>
-        <w:t xml:space="preserve"> </w:t>
-      </w:r>
-      <w:r>
-        <w:rPr>
-          <w:b/>
-          <w:bCs/>
-        </w:rPr>
-        <w:t xml:space="preserve">δεν εξαρτάται από τη σειρά</w:t>
-      </w:r>
-      <w:r>
-        <w:t xml:space="preserve"> </w:t>
-      </w:r>
-      <w:r>
-        <w:t xml:space="preserve">με την οποία εξετάζονται οι αιτήσεις — σε γύρους με όλους τους ομίλους ταυτόχρονα, ή μία αίτηση τη φορά με οποιαδήποτε σειρά. Προκύπτει από το θεώρημα βελτιστότητας των Gale &amp; Shapley (1962) —το αποτέλεσμα είναι η μοναδική βέλτιστη για τους μαθητές ευσταθής αντιστοίχιση, και η απόδειξη δεν εξαρτάται από τη σειρά των αιτήσεων— και διατυπώνεται ρητά από τους McVitie &amp; Wilson (1970). Γι' αυτό δεν υπάρχει όμιλος που «κληρώνεται πρώτος»: οι γύροι είναι μόνο ένας τρόπος υπολογισμού ενός αποτελέσματος που καθορίζεται πλήρως από τις λίστες, τις προτεραιότητες και τις χωρητικότητες. Η ιδιότητα ελέγχεται αυτόματα: σε 200 τυχαία στιγμιότυπα, ο υπολογισμός «μία αίτηση τη φορά, με τυχαία σειρά» (τρεις διαφορετικές σειρές ανά στιγμιότυπο) δίνει πάντα το ίδιο αποτέλεσμα με τους γύρους.</w:t>
-      </w:r>
-    </w:p>
-    <w:p>
-      <w:pPr>
-        <w:pStyle w:val="Compact"/>
-        <w:numPr>
-          <w:ilvl w:val="0"/>
-          <w:numId w:val="1024"/>
-        </w:numPr>
-      </w:pPr>
-      <w:r>
         <w:rPr>
           <w:b/>
           <w:bCs/>
@@ -4012,7 +4144,7 @@
         <w:pStyle w:val="Compact"/>
         <w:numPr>
           <w:ilvl w:val="0"/>
-          <w:numId w:val="1024"/>
+          <w:numId w:val="1023"/>
         </w:numPr>
       </w:pPr>
       <w:r>
@@ -4034,7 +4166,7 @@
         <w:pStyle w:val="Compact"/>
         <w:numPr>
           <w:ilvl w:val="0"/>
-          <w:numId w:val="1024"/>
+          <w:numId w:val="1023"/>
         </w:numPr>
       </w:pPr>
       <w:r>
@@ -4456,7 +4588,7 @@
         <w:pStyle w:val="Compact"/>
         <w:numPr>
           <w:ilvl w:val="0"/>
-          <w:numId w:val="1025"/>
+          <w:numId w:val="1024"/>
         </w:numPr>
       </w:pPr>
       <w:r>
@@ -4484,7 +4616,7 @@
         <w:pStyle w:val="Compact"/>
         <w:numPr>
           <w:ilvl w:val="0"/>
-          <w:numId w:val="1025"/>
+          <w:numId w:val="1024"/>
         </w:numPr>
       </w:pPr>
       <w:r>
@@ -4509,7 +4641,7 @@
         <w:pStyle w:val="Compact"/>
         <w:numPr>
           <w:ilvl w:val="0"/>
-          <w:numId w:val="1025"/>
+          <w:numId w:val="1024"/>
         </w:numPr>
       </w:pPr>
       <w:r>
@@ -4715,7 +4847,7 @@
         <w:pStyle w:val="Compact"/>
         <w:numPr>
           <w:ilvl w:val="0"/>
-          <w:numId w:val="1026"/>
+          <w:numId w:val="1025"/>
         </w:numPr>
       </w:pPr>
       <w:r>
@@ -4737,7 +4869,7 @@
         <w:pStyle w:val="Compact"/>
         <w:numPr>
           <w:ilvl w:val="0"/>
-          <w:numId w:val="1026"/>
+          <w:numId w:val="1025"/>
         </w:numPr>
       </w:pPr>
       <w:r>
@@ -4762,7 +4894,7 @@
         <w:pStyle w:val="Compact"/>
         <w:numPr>
           <w:ilvl w:val="0"/>
-          <w:numId w:val="1026"/>
+          <w:numId w:val="1025"/>
         </w:numPr>
       </w:pPr>
       <w:r>
@@ -4813,7 +4945,7 @@
         <w:pStyle w:val="Compact"/>
         <w:numPr>
           <w:ilvl w:val="0"/>
-          <w:numId w:val="1026"/>
+          <w:numId w:val="1025"/>
         </w:numPr>
       </w:pPr>
       <w:r>
@@ -4919,11 +5051,121 @@
         <w:pStyle w:val="Compact"/>
         <w:numPr>
           <w:ilvl w:val="0"/>
+          <w:numId w:val="1026"/>
+        </w:numPr>
+      </w:pPr>
+      <w:r>
+        <w:t xml:space="preserve">Οι ημέρες εξετάζονται με τη σειρά Δευτέρα → Παρασκευή, με έναν DA ανά ημέρα.</w:t>
+      </w:r>
+    </w:p>
+    <w:p>
+      <w:pPr>
+        <w:pStyle w:val="Compact"/>
+        <w:numPr>
+          <w:ilvl w:val="0"/>
+          <w:numId w:val="1026"/>
+        </w:numPr>
+      </w:pPr>
+      <w:r>
+        <w:t xml:space="preserve">Ένας πολυήμερος όμιλος συμμετέχει μόνο στον DA της</w:t>
+      </w:r>
+      <w:r>
+        <w:t xml:space="preserve"> </w:t>
+      </w:r>
+      <w:r>
+        <w:rPr>
+          <w:b/>
+          <w:bCs/>
+        </w:rPr>
+        <w:t xml:space="preserve">1ης</w:t>
+      </w:r>
+      <w:r>
+        <w:t xml:space="preserve"> </w:t>
+      </w:r>
+      <w:r>
+        <w:t xml:space="preserve">του ημέρας· όσοι τοποθετούνται εκεί έχουν θέση και τις επόμενες ημέρες του και δεν συμμετέχουν στον DA εκείνων των ημερών.</w:t>
+      </w:r>
+    </w:p>
+    <w:p>
+      <w:pPr>
+        <w:pStyle w:val="Compact"/>
+        <w:numPr>
+          <w:ilvl w:val="0"/>
+          <w:numId w:val="1026"/>
+        </w:numPr>
+      </w:pPr>
+      <w:r>
+        <w:t xml:space="preserve">Για τους υπόλοιπους, ο όμιλος αφαιρείται από τις λίστες των επόμενων ημερών και οι υπόλοιπες επιλογές τους ανεβαίνουν μία θέση.</w:t>
+      </w:r>
+    </w:p>
+    <w:p>
+      <w:pPr>
+        <w:pStyle w:val="Compact"/>
+        <w:numPr>
+          <w:ilvl w:val="0"/>
+          <w:numId w:val="1026"/>
+        </w:numPr>
+      </w:pPr>
+      <w:r>
+        <w:t xml:space="preserve">Αν ένας πολυήμερος όμιλος συγκρούεται με θέση που ο μαθητής ήδη κατέχει (κοινή ημέρα με πολυήμερο όμιλο προηγούμενης ημέρας), αφαιρείται κι αυτός από τη λίστα.</w:t>
+      </w:r>
+    </w:p>
+    <w:p>
+      <w:pPr>
+        <w:pStyle w:val="Compact"/>
+        <w:numPr>
+          <w:ilvl w:val="0"/>
+          <w:numId w:val="1026"/>
+        </w:numPr>
+      </w:pPr>
+      <w:r>
+        <w:rPr>
+          <w:b/>
+          <w:bCs/>
+        </w:rPr>
+        <w:t xml:space="preserve">Παρεμφερείς όμιλοι:</w:t>
+      </w:r>
+      <w:r>
+        <w:t xml:space="preserve"> </w:t>
+      </w:r>
+      <w:r>
+        <w:t xml:space="preserve">όμιλοι διαφορετικών ημερών που το σχολείο δηλώνει ως παρεμφερείς σχηματίζουν μια ομάδα από την οποία κάθε μαθητής παίρνει το πολύ έναν όμιλο την εβδομάδα. Μόλις ο μαθητής τοποθετηθεί σε έναν, οι υπόλοιποι της ομάδας αφαιρούνται από τις λίστες των επόμενων ημερών του. Είναι ένας περιορισμός «το πολύ ένα από κάθε κατηγορία» πάνω στο σύνολο των ομίλων της εβδομάδας, που η διαδοχική κατανομή εφαρμόζει με τη σειρά των ημερών.</w:t>
+      </w:r>
+    </w:p>
+    <w:p>
+      <w:pPr>
+        <w:pStyle w:val="FirstParagraph"/>
+      </w:pPr>
+      <w:r>
+        <w:t xml:space="preserve">Ιδιότητες και όρια:</w:t>
+      </w:r>
+    </w:p>
+    <w:p>
+      <w:pPr>
+        <w:pStyle w:val="Compact"/>
+        <w:numPr>
+          <w:ilvl w:val="0"/>
           <w:numId w:val="1027"/>
         </w:numPr>
       </w:pPr>
       <w:r>
-        <w:t xml:space="preserve">Οι ημέρες εξετάζονται με τη σειρά Δευτέρα → Παρασκευή, με έναν DA ανά ημέρα.</w:t>
+        <w:t xml:space="preserve">Η αντιστοίχιση</w:t>
+      </w:r>
+      <w:r>
+        <w:t xml:space="preserve"> </w:t>
+      </w:r>
+      <w:r>
+        <w:rPr>
+          <w:b/>
+          <w:bCs/>
+        </w:rPr>
+        <w:t xml:space="preserve">κάθε ημέρας</w:t>
+      </w:r>
+      <w:r>
+        <w:t xml:space="preserve"> </w:t>
+      </w:r>
+      <w:r>
+        <w:t xml:space="preserve">είναι ευσταθής ως προς τις λίστες και τις θέσεις που απομένουν εκείνη την ημέρα.</w:t>
       </w:r>
     </w:p>
     <w:p>
@@ -4935,23 +5177,23 @@
         </w:numPr>
       </w:pPr>
       <w:r>
-        <w:t xml:space="preserve">Ένας πολυήμερος όμιλος συμμετέχει μόνο στον DA της</w:t>
-      </w:r>
-      <w:r>
-        <w:t xml:space="preserve"> </w:t>
-      </w:r>
-      <w:r>
-        <w:rPr>
-          <w:b/>
-          <w:bCs/>
-        </w:rPr>
-        <w:t xml:space="preserve">1ης</w:t>
-      </w:r>
-      <w:r>
-        <w:t xml:space="preserve"> </w:t>
-      </w:r>
-      <w:r>
-        <w:t xml:space="preserve">του ημέρας· όσοι τοποθετούνται εκεί έχουν θέση και τις επόμενες ημέρες του και δεν συμμετέχουν στον DA εκείνων των ημερών.</w:t>
+        <w:t xml:space="preserve">Η</w:t>
+      </w:r>
+      <w:r>
+        <w:t xml:space="preserve"> </w:t>
+      </w:r>
+      <w:r>
+        <w:rPr>
+          <w:b/>
+          <w:bCs/>
+        </w:rPr>
+        <w:t xml:space="preserve">εβδομάδα ως σύνολο</w:t>
+      </w:r>
+      <w:r>
+        <w:t xml:space="preserve"> </w:t>
+      </w:r>
+      <w:r>
+        <w:t xml:space="preserve">δεν έχει εγγύηση ευστάθειας ή φιλαλήθειας: όπως δείχνουν οι Dur &amp; Kesten (2019), τα διαδοχικά συστήματα γενικά χάνουν αυτές τις ιδιότητες σε σχέση με ένα ενιαίο (ταυτόχρονο) σύστημα. Π.χ. ένας γονέας θα μπορούσε θεωρητικά να προτιμήσει να «θυσιάσει» έναν πολυήμερο όμιλο της Δευτέρας για να διεκδικήσει καλύτερα την Τετάρτη.</w:t>
       </w:r>
     </w:p>
     <w:p>
@@ -4960,116 +5202,6 @@
         <w:numPr>
           <w:ilvl w:val="0"/>
           <w:numId w:val="1027"/>
-        </w:numPr>
-      </w:pPr>
-      <w:r>
-        <w:t xml:space="preserve">Για τους υπόλοιπους, ο όμιλος αφαιρείται από τις λίστες των επόμενων ημερών και οι υπόλοιπες επιλογές τους ανεβαίνουν μία θέση.</w:t>
-      </w:r>
-    </w:p>
-    <w:p>
-      <w:pPr>
-        <w:pStyle w:val="Compact"/>
-        <w:numPr>
-          <w:ilvl w:val="0"/>
-          <w:numId w:val="1027"/>
-        </w:numPr>
-      </w:pPr>
-      <w:r>
-        <w:t xml:space="preserve">Αν ένας πολυήμερος όμιλος συγκρούεται με θέση που ο μαθητής ήδη κατέχει (κοινή ημέρα με πολυήμερο όμιλο προηγούμενης ημέρας), αφαιρείται κι αυτός από τη λίστα.</w:t>
-      </w:r>
-    </w:p>
-    <w:p>
-      <w:pPr>
-        <w:pStyle w:val="Compact"/>
-        <w:numPr>
-          <w:ilvl w:val="0"/>
-          <w:numId w:val="1027"/>
-        </w:numPr>
-      </w:pPr>
-      <w:r>
-        <w:rPr>
-          <w:b/>
-          <w:bCs/>
-        </w:rPr>
-        <w:t xml:space="preserve">Παρεμφερείς όμιλοι:</w:t>
-      </w:r>
-      <w:r>
-        <w:t xml:space="preserve"> </w:t>
-      </w:r>
-      <w:r>
-        <w:t xml:space="preserve">όμιλοι διαφορετικών ημερών που το σχολείο δηλώνει ως παρεμφερείς σχηματίζουν μια ομάδα από την οποία κάθε μαθητής παίρνει το πολύ έναν όμιλο την εβδομάδα. Μόλις ο μαθητής τοποθετηθεί σε έναν, οι υπόλοιποι της ομάδας αφαιρούνται από τις λίστες των επόμενων ημερών του. Είναι ένας περιορισμός «το πολύ ένα από κάθε κατηγορία» πάνω στο σύνολο των ομίλων της εβδομάδας, που η διαδοχική κατανομή εφαρμόζει με τη σειρά των ημερών.</w:t>
-      </w:r>
-    </w:p>
-    <w:p>
-      <w:pPr>
-        <w:pStyle w:val="FirstParagraph"/>
-      </w:pPr>
-      <w:r>
-        <w:t xml:space="preserve">Ιδιότητες και όρια:</w:t>
-      </w:r>
-    </w:p>
-    <w:p>
-      <w:pPr>
-        <w:pStyle w:val="Compact"/>
-        <w:numPr>
-          <w:ilvl w:val="0"/>
-          <w:numId w:val="1028"/>
-        </w:numPr>
-      </w:pPr>
-      <w:r>
-        <w:t xml:space="preserve">Η αντιστοίχιση</w:t>
-      </w:r>
-      <w:r>
-        <w:t xml:space="preserve"> </w:t>
-      </w:r>
-      <w:r>
-        <w:rPr>
-          <w:b/>
-          <w:bCs/>
-        </w:rPr>
-        <w:t xml:space="preserve">κάθε ημέρας</w:t>
-      </w:r>
-      <w:r>
-        <w:t xml:space="preserve"> </w:t>
-      </w:r>
-      <w:r>
-        <w:t xml:space="preserve">είναι ευσταθής ως προς τις λίστες και τις θέσεις που απομένουν εκείνη την ημέρα.</w:t>
-      </w:r>
-    </w:p>
-    <w:p>
-      <w:pPr>
-        <w:pStyle w:val="Compact"/>
-        <w:numPr>
-          <w:ilvl w:val="0"/>
-          <w:numId w:val="1028"/>
-        </w:numPr>
-      </w:pPr>
-      <w:r>
-        <w:t xml:space="preserve">Η</w:t>
-      </w:r>
-      <w:r>
-        <w:t xml:space="preserve"> </w:t>
-      </w:r>
-      <w:r>
-        <w:rPr>
-          <w:b/>
-          <w:bCs/>
-        </w:rPr>
-        <w:t xml:space="preserve">εβδομάδα ως σύνολο</w:t>
-      </w:r>
-      <w:r>
-        <w:t xml:space="preserve"> </w:t>
-      </w:r>
-      <w:r>
-        <w:t xml:space="preserve">δεν έχει εγγύηση ευστάθειας ή φιλαλήθειας: όπως δείχνουν οι Dur &amp; Kesten (2019), τα διαδοχικά συστήματα γενικά χάνουν αυτές τις ιδιότητες σε σχέση με ένα ενιαίο (ταυτόχρονο) σύστημα. Π.χ. ένας γονέας θα μπορούσε θεωρητικά να προτιμήσει να «θυσιάσει» έναν πολυήμερο όμιλο της Δευτέρας για να διεκδικήσει καλύτερα την Τετάρτη.</w:t>
-      </w:r>
-    </w:p>
-    <w:p>
-      <w:pPr>
-        <w:pStyle w:val="Compact"/>
-        <w:numPr>
-          <w:ilvl w:val="0"/>
-          <w:numId w:val="1028"/>
         </w:numPr>
       </w:pPr>
       <w:r>
@@ -5111,7 +5243,7 @@
         <w:pStyle w:val="Compact"/>
         <w:numPr>
           <w:ilvl w:val="0"/>
-          <w:numId w:val="1029"/>
+          <w:numId w:val="1028"/>
         </w:numPr>
       </w:pPr>
       <w:r>
@@ -5133,7 +5265,7 @@
         <w:pStyle w:val="Compact"/>
         <w:numPr>
           <w:ilvl w:val="0"/>
-          <w:numId w:val="1029"/>
+          <w:numId w:val="1028"/>
         </w:numPr>
       </w:pPr>
       <w:r>
@@ -5171,7 +5303,7 @@
         <w:pStyle w:val="Compact"/>
         <w:numPr>
           <w:ilvl w:val="0"/>
-          <w:numId w:val="1029"/>
+          <w:numId w:val="1028"/>
         </w:numPr>
       </w:pPr>
       <w:r>
@@ -5210,7 +5342,7 @@
         <w:pStyle w:val="Compact"/>
         <w:numPr>
           <w:ilvl w:val="0"/>
-          <w:numId w:val="1030"/>
+          <w:numId w:val="1029"/>
         </w:numPr>
       </w:pPr>
       <w:r>
@@ -5235,7 +5367,7 @@
         <w:pStyle w:val="Compact"/>
         <w:numPr>
           <w:ilvl w:val="0"/>
-          <w:numId w:val="1030"/>
+          <w:numId w:val="1029"/>
         </w:numPr>
       </w:pPr>
       <w:r>
@@ -5260,7 +5392,7 @@
         <w:pStyle w:val="Compact"/>
         <w:numPr>
           <w:ilvl w:val="0"/>
-          <w:numId w:val="1030"/>
+          <w:numId w:val="1029"/>
         </w:numPr>
       </w:pPr>
       <w:r>
@@ -5285,7 +5417,7 @@
         <w:pStyle w:val="Compact"/>
         <w:numPr>
           <w:ilvl w:val="0"/>
-          <w:numId w:val="1030"/>
+          <w:numId w:val="1029"/>
         </w:numPr>
       </w:pPr>
       <w:r>
@@ -5310,7 +5442,7 @@
         <w:pStyle w:val="Compact"/>
         <w:numPr>
           <w:ilvl w:val="0"/>
-          <w:numId w:val="1030"/>
+          <w:numId w:val="1029"/>
         </w:numPr>
       </w:pPr>
       <w:r>
@@ -5335,7 +5467,7 @@
         <w:pStyle w:val="Compact"/>
         <w:numPr>
           <w:ilvl w:val="0"/>
-          <w:numId w:val="1030"/>
+          <w:numId w:val="1029"/>
         </w:numPr>
       </w:pPr>
       <w:r>
@@ -5360,7 +5492,7 @@
         <w:pStyle w:val="Compact"/>
         <w:numPr>
           <w:ilvl w:val="0"/>
-          <w:numId w:val="1030"/>
+          <w:numId w:val="1029"/>
         </w:numPr>
       </w:pPr>
       <w:r>
@@ -5385,7 +5517,7 @@
         <w:pStyle w:val="Compact"/>
         <w:numPr>
           <w:ilvl w:val="0"/>
-          <w:numId w:val="1030"/>
+          <w:numId w:val="1029"/>
         </w:numPr>
       </w:pPr>
       <w:r>
@@ -5410,7 +5542,7 @@
         <w:pStyle w:val="Compact"/>
         <w:numPr>
           <w:ilvl w:val="0"/>
-          <w:numId w:val="1030"/>
+          <w:numId w:val="1029"/>
         </w:numPr>
       </w:pPr>
       <w:r>
@@ -5435,7 +5567,7 @@
         <w:pStyle w:val="Compact"/>
         <w:numPr>
           <w:ilvl w:val="0"/>
-          <w:numId w:val="1030"/>
+          <w:numId w:val="1029"/>
         </w:numPr>
       </w:pPr>
       <w:r>
@@ -5460,7 +5592,7 @@
         <w:pStyle w:val="Compact"/>
         <w:numPr>
           <w:ilvl w:val="0"/>
-          <w:numId w:val="1030"/>
+          <w:numId w:val="1029"/>
         </w:numPr>
       </w:pPr>
       <w:r>
@@ -5485,7 +5617,7 @@
         <w:pStyle w:val="Compact"/>
         <w:numPr>
           <w:ilvl w:val="0"/>
-          <w:numId w:val="1030"/>
+          <w:numId w:val="1029"/>
         </w:numPr>
       </w:pPr>
       <w:r>
@@ -5510,7 +5642,7 @@
         <w:pStyle w:val="Compact"/>
         <w:numPr>
           <w:ilvl w:val="0"/>
-          <w:numId w:val="1030"/>
+          <w:numId w:val="1029"/>
         </w:numPr>
       </w:pPr>
       <w:r>
@@ -5535,7 +5667,7 @@
         <w:pStyle w:val="Compact"/>
         <w:numPr>
           <w:ilvl w:val="0"/>
-          <w:numId w:val="1030"/>
+          <w:numId w:val="1029"/>
         </w:numPr>
       </w:pPr>
       <w:r>
@@ -5560,7 +5692,7 @@
         <w:pStyle w:val="Compact"/>
         <w:numPr>
           <w:ilvl w:val="0"/>
-          <w:numId w:val="1030"/>
+          <w:numId w:val="1029"/>
         </w:numPr>
       </w:pPr>
       <w:r>
@@ -5585,7 +5717,7 @@
         <w:pStyle w:val="Compact"/>
         <w:numPr>
           <w:ilvl w:val="0"/>
-          <w:numId w:val="1030"/>
+          <w:numId w:val="1029"/>
         </w:numPr>
       </w:pPr>
       <w:r>
@@ -5610,7 +5742,7 @@
         <w:pStyle w:val="Compact"/>
         <w:numPr>
           <w:ilvl w:val="0"/>
-          <w:numId w:val="1030"/>
+          <w:numId w:val="1029"/>
         </w:numPr>
       </w:pPr>
       <w:r>
@@ -5638,7 +5770,7 @@
         <w:pStyle w:val="Compact"/>
         <w:numPr>
           <w:ilvl w:val="0"/>
-          <w:numId w:val="1030"/>
+          <w:numId w:val="1029"/>
         </w:numPr>
       </w:pPr>
       <w:r>
@@ -5663,7 +5795,7 @@
         <w:pStyle w:val="Compact"/>
         <w:numPr>
           <w:ilvl w:val="0"/>
-          <w:numId w:val="1030"/>
+          <w:numId w:val="1029"/>
         </w:numPr>
       </w:pPr>
       <w:r>
@@ -5688,7 +5820,7 @@
         <w:pStyle w:val="Compact"/>
         <w:numPr>
           <w:ilvl w:val="0"/>
-          <w:numId w:val="1030"/>
+          <w:numId w:val="1029"/>
         </w:numPr>
       </w:pPr>
       <w:r>
@@ -5713,7 +5845,7 @@
         <w:pStyle w:val="Compact"/>
         <w:numPr>
           <w:ilvl w:val="0"/>
-          <w:numId w:val="1030"/>
+          <w:numId w:val="1029"/>
         </w:numPr>
       </w:pPr>
       <w:r>
@@ -5738,7 +5870,7 @@
         <w:pStyle w:val="Compact"/>
         <w:numPr>
           <w:ilvl w:val="0"/>
-          <w:numId w:val="1030"/>
+          <w:numId w:val="1029"/>
         </w:numPr>
       </w:pPr>
       <w:r>
@@ -5763,7 +5895,7 @@
         <w:pStyle w:val="Compact"/>
         <w:numPr>
           <w:ilvl w:val="0"/>
-          <w:numId w:val="1030"/>
+          <w:numId w:val="1029"/>
         </w:numPr>
       </w:pPr>
       <w:r>
@@ -5788,7 +5920,7 @@
         <w:pStyle w:val="Compact"/>
         <w:numPr>
           <w:ilvl w:val="0"/>
-          <w:numId w:val="1030"/>
+          <w:numId w:val="1029"/>
         </w:numPr>
       </w:pPr>
       <w:r>
@@ -5813,7 +5945,7 @@
         <w:pStyle w:val="Compact"/>
         <w:numPr>
           <w:ilvl w:val="0"/>
-          <w:numId w:val="1030"/>
+          <w:numId w:val="1029"/>
         </w:numPr>
       </w:pPr>
       <w:r>
@@ -5838,7 +5970,7 @@
         <w:pStyle w:val="Compact"/>
         <w:numPr>
           <w:ilvl w:val="0"/>
-          <w:numId w:val="1030"/>
+          <w:numId w:val="1029"/>
         </w:numPr>
       </w:pPr>
       <w:r>
@@ -5971,6 +6103,109 @@
       </w:pPr>
     </w:lvl>
   </w:abstractNum>
+  <w:abstractNum w:abstractNumId="991">
+    <w:nsid w:val="0000A991"/>
+    <w:multiLevelType w:val="multilevel"/>
+    <w:lvl w:ilvl="0">
+      <w:numFmt w:val="bullet"/>
+      <w:lvlText w:val=""/>
+      <w:lvlJc w:val="left"/>
+      <w:pPr>
+        <w:ind w:left="720" w:hanging="360"/>
+      </w:pPr>
+      <w:rPr>
+        <w:rFonts w:ascii="Symbol" w:hAnsi="Symbol" w:cs="Symbol" w:hint="default"/>
+      </w:rPr>
+    </w:lvl>
+    <w:lvl w:ilvl="1">
+      <w:numFmt w:val="bullet"/>
+      <w:lvlText w:val="o"/>
+      <w:lvlJc w:val="left"/>
+      <w:pPr>
+        <w:ind w:left="1440" w:hanging="360"/>
+      </w:pPr>
+      <w:rPr>
+        <w:rFonts w:ascii="Courier New" w:hAnsi="Courier New" w:cs="Courier New" w:hint="default"/>
+      </w:rPr>
+    </w:lvl>
+    <w:lvl w:ilvl="2">
+      <w:numFmt w:val="bullet"/>
+      <w:lvlText w:val=""/>
+      <w:lvlJc w:val="left"/>
+      <w:pPr>
+        <w:ind w:left="2160" w:hanging="360"/>
+      </w:pPr>
+      <w:rPr>
+        <w:rFonts w:ascii="Wingdings" w:hAnsi="Wingdings" w:cs="Wingdings" w:hint="default"/>
+      </w:rPr>
+    </w:lvl>
+    <w:lvl w:ilvl="3">
+      <w:numFmt w:val="bullet"/>
+      <w:lvlText w:val=""/>
+      <w:lvlJc w:val="left"/>
+      <w:pPr>
+        <w:ind w:left="2880" w:hanging="360"/>
+      </w:pPr>
+      <w:rPr>
+        <w:rFonts w:ascii="Symbol" w:hAnsi="Symbol" w:cs="Symbol" w:hint="default"/>
+      </w:rPr>
+    </w:lvl>
+    <w:lvl w:ilvl="4">
+      <w:numFmt w:val="bullet"/>
+      <w:lvlText w:val="o"/>
+      <w:lvlJc w:val="left"/>
+      <w:pPr>
+        <w:ind w:left="3600" w:hanging="360"/>
+      </w:pPr>
+      <w:rPr>
+        <w:rFonts w:ascii="Courier New" w:hAnsi="Courier New" w:cs="Courier New" w:hint="default"/>
+      </w:rPr>
+    </w:lvl>
+    <w:lvl w:ilvl="5">
+      <w:numFmt w:val="bullet"/>
+      <w:lvlText w:val=""/>
+      <w:lvlJc w:val="left"/>
+      <w:pPr>
+        <w:ind w:left="4320" w:hanging="360"/>
+      </w:pPr>
+      <w:rPr>
+        <w:rFonts w:ascii="Wingdings" w:hAnsi="Wingdings" w:cs="Wingdings" w:hint="default"/>
+      </w:rPr>
+    </w:lvl>
+    <w:lvl w:ilvl="6">
+      <w:numFmt w:val="bullet"/>
+      <w:lvlText w:val=""/>
+      <w:lvlJc w:val="left"/>
+      <w:pPr>
+        <w:ind w:left="5040" w:hanging="360"/>
+      </w:pPr>
+      <w:rPr>
+        <w:rFonts w:ascii="Symbol" w:hAnsi="Symbol" w:cs="Symbol" w:hint="default"/>
+      </w:rPr>
+    </w:lvl>
+    <w:lvl w:ilvl="7">
+      <w:numFmt w:val="bullet"/>
+      <w:lvlText w:val="o"/>
+      <w:lvlJc w:val="left"/>
+      <w:pPr>
+        <w:ind w:left="5760" w:hanging="360"/>
+      </w:pPr>
+      <w:rPr>
+        <w:rFonts w:ascii="Courier New" w:hAnsi="Courier New" w:cs="Courier New" w:hint="default"/>
+      </w:rPr>
+    </w:lvl>
+    <w:lvl w:ilvl="8">
+      <w:numFmt w:val="bullet"/>
+      <w:lvlText w:val=""/>
+      <w:lvlJc w:val="left"/>
+      <w:pPr>
+        <w:ind w:left="6480" w:hanging="360"/>
+      </w:pPr>
+      <w:rPr>
+        <w:rFonts w:ascii="Wingdings" w:hAnsi="Wingdings" w:cs="Wingdings" w:hint="default"/>
+      </w:rPr>
+    </w:lvl>
+  </w:abstractNum>
   <w:abstractNum w:abstractNumId="99411">
     <w:nsid w:val="00A99411"/>
     <w:multiLevelType w:val="multilevel"/>
@@ -6056,113 +6291,13 @@
       </w:pPr>
     </w:lvl>
   </w:abstractNum>
-  <w:abstractNum w:abstractNumId="991">
-    <w:nsid w:val="0000A991"/>
-    <w:multiLevelType w:val="multilevel"/>
-    <w:lvl w:ilvl="0">
-      <w:numFmt w:val="bullet"/>
-      <w:lvlText w:val=""/>
-      <w:lvlJc w:val="left"/>
-      <w:pPr>
-        <w:ind w:left="720" w:hanging="360"/>
-      </w:pPr>
-      <w:rPr>
-        <w:rFonts w:ascii="Symbol" w:hAnsi="Symbol" w:cs="Symbol" w:hint="default"/>
-      </w:rPr>
-    </w:lvl>
-    <w:lvl w:ilvl="1">
-      <w:numFmt w:val="bullet"/>
-      <w:lvlText w:val="o"/>
-      <w:lvlJc w:val="left"/>
-      <w:pPr>
-        <w:ind w:left="1440" w:hanging="360"/>
-      </w:pPr>
-      <w:rPr>
-        <w:rFonts w:ascii="Courier New" w:hAnsi="Courier New" w:cs="Courier New" w:hint="default"/>
-      </w:rPr>
-    </w:lvl>
-    <w:lvl w:ilvl="2">
-      <w:numFmt w:val="bullet"/>
-      <w:lvlText w:val=""/>
-      <w:lvlJc w:val="left"/>
-      <w:pPr>
-        <w:ind w:left="2160" w:hanging="360"/>
-      </w:pPr>
-      <w:rPr>
-        <w:rFonts w:ascii="Wingdings" w:hAnsi="Wingdings" w:cs="Wingdings" w:hint="default"/>
-      </w:rPr>
-    </w:lvl>
-    <w:lvl w:ilvl="3">
-      <w:numFmt w:val="bullet"/>
-      <w:lvlText w:val=""/>
-      <w:lvlJc w:val="left"/>
-      <w:pPr>
-        <w:ind w:left="2880" w:hanging="360"/>
-      </w:pPr>
-      <w:rPr>
-        <w:rFonts w:ascii="Symbol" w:hAnsi="Symbol" w:cs="Symbol" w:hint="default"/>
-      </w:rPr>
-    </w:lvl>
-    <w:lvl w:ilvl="4">
-      <w:numFmt w:val="bullet"/>
-      <w:lvlText w:val="o"/>
-      <w:lvlJc w:val="left"/>
-      <w:pPr>
-        <w:ind w:left="3600" w:hanging="360"/>
-      </w:pPr>
-      <w:rPr>
-        <w:rFonts w:ascii="Courier New" w:hAnsi="Courier New" w:cs="Courier New" w:hint="default"/>
-      </w:rPr>
-    </w:lvl>
-    <w:lvl w:ilvl="5">
-      <w:numFmt w:val="bullet"/>
-      <w:lvlText w:val=""/>
-      <w:lvlJc w:val="left"/>
-      <w:pPr>
-        <w:ind w:left="4320" w:hanging="360"/>
-      </w:pPr>
-      <w:rPr>
-        <w:rFonts w:ascii="Wingdings" w:hAnsi="Wingdings" w:cs="Wingdings" w:hint="default"/>
-      </w:rPr>
-    </w:lvl>
-    <w:lvl w:ilvl="6">
-      <w:numFmt w:val="bullet"/>
-      <w:lvlText w:val=""/>
-      <w:lvlJc w:val="left"/>
-      <w:pPr>
-        <w:ind w:left="5040" w:hanging="360"/>
-      </w:pPr>
-      <w:rPr>
-        <w:rFonts w:ascii="Symbol" w:hAnsi="Symbol" w:cs="Symbol" w:hint="default"/>
-      </w:rPr>
-    </w:lvl>
-    <w:lvl w:ilvl="7">
-      <w:numFmt w:val="bullet"/>
-      <w:lvlText w:val="o"/>
-      <w:lvlJc w:val="left"/>
-      <w:pPr>
-        <w:ind w:left="5760" w:hanging="360"/>
-      </w:pPr>
-      <w:rPr>
-        <w:rFonts w:ascii="Courier New" w:hAnsi="Courier New" w:cs="Courier New" w:hint="default"/>
-      </w:rPr>
-    </w:lvl>
-    <w:lvl w:ilvl="8">
-      <w:numFmt w:val="bullet"/>
-      <w:lvlText w:val=""/>
-      <w:lvlJc w:val="left"/>
-      <w:pPr>
-        <w:ind w:left="6480" w:hanging="360"/>
-      </w:pPr>
-      <w:rPr>
-        <w:rFonts w:ascii="Wingdings" w:hAnsi="Wingdings" w:cs="Wingdings" w:hint="default"/>
-      </w:rPr>
-    </w:lvl>
-  </w:abstractNum>
   <w:num w:numId="1000">
     <w:abstractNumId w:val="990"/>
   </w:num>
   <w:num w:numId="1001">
+    <w:abstractNumId w:val="991"/>
+  </w:num>
+  <w:num w:numId="1002">
     <w:abstractNumId w:val="99411"/>
     <w:lvlOverride w:ilvl="0">
       <w:startOverride w:val="1"/>
@@ -6192,10 +6327,16 @@
       <w:startOverride w:val="1"/>
     </w:lvlOverride>
   </w:num>
-  <w:num w:numId="1002">
+  <w:num w:numId="1003">
     <w:abstractNumId w:val="991"/>
   </w:num>
-  <w:num w:numId="1003">
+  <w:num w:numId="1004">
+    <w:abstractNumId w:val="991"/>
+  </w:num>
+  <w:num w:numId="1005">
+    <w:abstractNumId w:val="991"/>
+  </w:num>
+  <w:num w:numId="1006">
     <w:abstractNumId w:val="99411"/>
     <w:lvlOverride w:ilvl="0">
       <w:startOverride w:val="1"/>
@@ -6224,15 +6365,6 @@
     <w:lvlOverride w:ilvl="8">
       <w:startOverride w:val="1"/>
     </w:lvlOverride>
-  </w:num>
-  <w:num w:numId="1004">
-    <w:abstractNumId w:val="991"/>
-  </w:num>
-  <w:num w:numId="1005">
-    <w:abstractNumId w:val="991"/>
-  </w:num>
-  <w:num w:numId="1006">
-    <w:abstractNumId w:val="991"/>
   </w:num>
   <w:num w:numId="1007">
     <w:abstractNumId w:val="99411"/>
@@ -6265,34 +6397,7 @@
     </w:lvlOverride>
   </w:num>
   <w:num w:numId="1008">
-    <w:abstractNumId w:val="99411"/>
-    <w:lvlOverride w:ilvl="0">
-      <w:startOverride w:val="1"/>
-    </w:lvlOverride>
-    <w:lvlOverride w:ilvl="1">
-      <w:startOverride w:val="1"/>
-    </w:lvlOverride>
-    <w:lvlOverride w:ilvl="2">
-      <w:startOverride w:val="1"/>
-    </w:lvlOverride>
-    <w:lvlOverride w:ilvl="3">
-      <w:startOverride w:val="1"/>
-    </w:lvlOverride>
-    <w:lvlOverride w:ilvl="4">
-      <w:startOverride w:val="1"/>
-    </w:lvlOverride>
-    <w:lvlOverride w:ilvl="5">
-      <w:startOverride w:val="1"/>
-    </w:lvlOverride>
-    <w:lvlOverride w:ilvl="6">
-      <w:startOverride w:val="1"/>
-    </w:lvlOverride>
-    <w:lvlOverride w:ilvl="7">
-      <w:startOverride w:val="1"/>
-    </w:lvlOverride>
-    <w:lvlOverride w:ilvl="8">
-      <w:startOverride w:val="1"/>
-    </w:lvlOverride>
+    <w:abstractNumId w:val="991"/>
   </w:num>
   <w:num w:numId="1009">
     <w:abstractNumId w:val="991"/>
@@ -6334,9 +6439,6 @@
     <w:abstractNumId w:val="991"/>
   </w:num>
   <w:num w:numId="1022">
-    <w:abstractNumId w:val="991"/>
-  </w:num>
-  <w:num w:numId="1023">
     <w:abstractNumId w:val="99411"/>
     <w:lvlOverride w:ilvl="0">
       <w:startOverride w:val="1"/>
@@ -6366,6 +6468,9 @@
       <w:startOverride w:val="1"/>
     </w:lvlOverride>
   </w:num>
+  <w:num w:numId="1023">
+    <w:abstractNumId w:val="991"/>
+  </w:num>
   <w:num w:numId="1024">
     <w:abstractNumId w:val="991"/>
   </w:num>
@@ -6373,9 +6478,6 @@
     <w:abstractNumId w:val="991"/>
   </w:num>
   <w:num w:numId="1026">
-    <w:abstractNumId w:val="991"/>
-  </w:num>
-  <w:num w:numId="1027">
     <w:abstractNumId w:val="99411"/>
     <w:lvlOverride w:ilvl="0">
       <w:startOverride w:val="1"/>
@@ -6405,13 +6507,13 @@
       <w:startOverride w:val="1"/>
     </w:lvlOverride>
   </w:num>
+  <w:num w:numId="1027">
+    <w:abstractNumId w:val="991"/>
+  </w:num>
   <w:num w:numId="1028">
     <w:abstractNumId w:val="991"/>
   </w:num>
   <w:num w:numId="1029">
-    <w:abstractNumId w:val="991"/>
-  </w:num>
-  <w:num w:numId="1030">
     <w:abstractNumId w:val="991"/>
   </w:num>
 </w:numbering>

</xml_diff>

<commit_message>
Separate addresses per role; teachers' common code
- Parents' page at the site root; teachers' and admin's pages only at
  hidden paths from TEACHER_PATH / ADMIN_PATH (env, not in the repo).
  No links between the pages; per-role help; noindex.
- Build, Netlify function and production server require both paths.
- Teachers' common code set by the admin (like the parents' code): any
  club, chosen from a list; logged as "teacher-code"; a new code ends old
  sessions; rate-limited. Personal login links still work.
- Admin: «Διευθύνσεις» card and the code field; docs and tests updated.

Co-Authored-By: Claude Opus 5.5 <noreply@anthropic.com>
Claude-Session: https://claude.ai/code/session_014bv1rucCSvWvUULong8T8B
</commit_message>
<xml_diff>
--- a/docs/Egxeiridio_Ekpaideutikoi.docx
+++ b/docs/Egxeiridio_Ekpaideutikoi.docx
@@ -131,23 +131,55 @@
         </w:numPr>
       </w:pPr>
       <w:r>
-        <w:t xml:space="preserve">Τον</w:t>
-      </w:r>
-      <w:r>
-        <w:t xml:space="preserve"> </w:t>
-      </w:r>
-      <w:r>
-        <w:rPr>
-          <w:b/>
-          <w:bCs/>
-        </w:rPr>
-        <w:t xml:space="preserve">προσωπικό σύνδεσμο εισόδου</w:t>
-      </w:r>
-      <w:r>
-        <w:t xml:space="preserve"> </w:t>
-      </w:r>
-      <w:r>
-        <w:t xml:space="preserve">σας τον στέλνει ο υπεύθυνος των ομίλων (διαχειριστής της πλατφόρμας). Ανοίξτε τον από τον υπολογιστή ή το κινητό σας.</w:t>
+        <w:t xml:space="preserve">Τη</w:t>
+      </w:r>
+      <w:r>
+        <w:t xml:space="preserve"> </w:t>
+      </w:r>
+      <w:r>
+        <w:rPr>
+          <w:b/>
+          <w:bCs/>
+        </w:rPr>
+        <w:t xml:space="preserve">διεύθυνση της σελίδας των εκπαιδευτικών</w:t>
+      </w:r>
+      <w:r>
+        <w:t xml:space="preserve"> </w:t>
+      </w:r>
+      <w:r>
+        <w:t xml:space="preserve">και τον</w:t>
+      </w:r>
+      <w:r>
+        <w:t xml:space="preserve"> </w:t>
+      </w:r>
+      <w:r>
+        <w:rPr>
+          <w:b/>
+          <w:bCs/>
+        </w:rPr>
+        <w:t xml:space="preserve">κοινό κωδικό εκπαιδευτικών</w:t>
+      </w:r>
+      <w:r>
+        <w:t xml:space="preserve"> </w:t>
+      </w:r>
+      <w:r>
+        <w:t xml:space="preserve">σας τα δίνει ο υπεύθυνος των ομίλων (διαχειριστής της πλατφόρμας). Η σελίδα δεν είναι προσβάσιμη από τη σελίδα των γονέων.</w:t>
+      </w:r>
+      <w:r>
+        <w:t xml:space="preserve"> </w:t>
+      </w:r>
+      <w:r>
+        <w:rPr>
+          <w:b/>
+          <w:bCs/>
+        </w:rPr>
+        <w:t xml:space="preserve">Μην τα προωθείτε</w:t>
+      </w:r>
+      <w:r>
+        <w:t xml:space="preserve"> </w:t>
+      </w:r>
+      <w:r>
+        <w:t xml:space="preserve">σε άλλους (π.χ. σε γονείς).</w:t>
       </w:r>
     </w:p>
     <w:p>
@@ -159,36 +191,89 @@
         </w:numPr>
       </w:pPr>
       <w:r>
-        <w:t xml:space="preserve">Ο σύνδεσμος</w:t>
-      </w:r>
-      <w:r>
-        <w:t xml:space="preserve"> </w:t>
-      </w:r>
-      <w:r>
-        <w:rPr>
-          <w:b/>
-          <w:bCs/>
-        </w:rPr>
-        <w:t xml:space="preserve">ισχύει 7 ημέρες</w:t>
-      </w:r>
-      <w:r>
-        <w:t xml:space="preserve">. Αν έληξε, ζητήστε νέο.</w:t>
-      </w:r>
-      <w:r>
-        <w:t xml:space="preserve"> </w:t>
-      </w:r>
-      <w:r>
-        <w:rPr>
-          <w:b/>
-          <w:bCs/>
-        </w:rPr>
-        <w:t xml:space="preserve">Μην τον προωθείτε</w:t>
-      </w:r>
-      <w:r>
-        <w:t xml:space="preserve"> </w:t>
-      </w:r>
-      <w:r>
-        <w:t xml:space="preserve">σε άλλους: όποιος τον έχει μπορεί να αλλάξει τη λίστα του ομίλου σας.</w:t>
+        <w:t xml:space="preserve">Γράψτε τον κωδικό και πατήστε</w:t>
+      </w:r>
+      <w:r>
+        <w:t xml:space="preserve"> </w:t>
+      </w:r>
+      <w:r>
+        <w:rPr>
+          <w:b/>
+          <w:bCs/>
+        </w:rPr>
+        <w:t xml:space="preserve">«Σύνδεση»</w:t>
+      </w:r>
+      <w:r>
+        <w:t xml:space="preserve">. Μετά διαλέξτε</w:t>
+      </w:r>
+      <w:r>
+        <w:t xml:space="preserve"> </w:t>
+      </w:r>
+      <w:r>
+        <w:rPr>
+          <w:b/>
+          <w:bCs/>
+        </w:rPr>
+        <w:t xml:space="preserve">τον όμιλό σας</w:t>
+      </w:r>
+      <w:r>
+        <w:t xml:space="preserve"> </w:t>
+      </w:r>
+      <w:r>
+        <w:t xml:space="preserve">από τη λίστα «Ο όμιλός σας». Αλλάζετε μόνο τη λίστα του δικού σας ομίλου· κάθε αλλαγή καταγράφεται.</w:t>
+      </w:r>
+    </w:p>
+    <w:p>
+      <w:pPr>
+        <w:pStyle w:val="Compact"/>
+        <w:numPr>
+          <w:ilvl w:val="0"/>
+          <w:numId w:val="1001"/>
+        </w:numPr>
+      </w:pPr>
+      <w:r>
+        <w:t xml:space="preserve">Αν αντί για κωδικό σάς δόθηκε</w:t>
+      </w:r>
+      <w:r>
+        <w:t xml:space="preserve"> </w:t>
+      </w:r>
+      <w:r>
+        <w:rPr>
+          <w:b/>
+          <w:bCs/>
+        </w:rPr>
+        <w:t xml:space="preserve">προσωπικός σύνδεσμος εισόδου</w:t>
+      </w:r>
+      <w:r>
+        <w:t xml:space="preserve">, ανοίξτε τον: βλέπετε κατευθείαν τους ομίλους σας. Ισχύει 7 ημέρες.</w:t>
+      </w:r>
+    </w:p>
+    <w:p>
+      <w:pPr>
+        <w:pStyle w:val="Compact"/>
+        <w:numPr>
+          <w:ilvl w:val="0"/>
+          <w:numId w:val="1001"/>
+        </w:numPr>
+      </w:pPr>
+      <w:r>
+        <w:t xml:space="preserve">Βοήθεια: κουμπί</w:t>
+      </w:r>
+      <w:r>
+        <w:t xml:space="preserve"> </w:t>
+      </w:r>
+      <w:r>
+        <w:rPr>
+          <w:b/>
+          <w:bCs/>
+        </w:rPr>
+        <w:t xml:space="preserve">«Βοήθεια»</w:t>
+      </w:r>
+      <w:r>
+        <w:t xml:space="preserve"> </w:t>
+      </w:r>
+      <w:r>
+        <w:t xml:space="preserve">πάνω δεξιά στη σελίδα.</w:t>
       </w:r>
     </w:p>
     <w:p>

</xml_diff>

<commit_message>
Teachers: log in with the common code + own ΑΜ/ΑΦΜ; select/clear all; keep saved lists
- Clubs file, «Εκπαιδευτικοί»: optional «ΑΜ ή ΑΦΜ» column (digits, leading
  zeros dropped, one per teacher). Stored only as an HMAC; never sent back.
- Code login needs the teacher's ΑΜ/ΑΦΜ and shows only their own clubs;
  history names the teacher. Replaces the all-clubs common login.
- Teacher card: «Επιλογή όλων» (visible rows, if they fit), «Αποεπιλογή
  όλων», an unsaved-changes note, and the saved list is kept in the page
  (it was lost when switching clubs). Leaving or logging out with unsaved
  ticks asks first.
- Admin: ΑΜ/ΑΦΜ column in the teachers' table; template, help, docs, tests.

Co-Authored-By: Claude Opus 5.5 <noreply@anthropic.com>
Claude-Session: https://claude.ai/code/session_014bv1rucCSvWvUULong8T8B
</commit_message>
<xml_diff>
--- a/docs/Egxeiridio_Ekpaideutikoi.docx
+++ b/docs/Egxeiridio_Ekpaideutikoi.docx
@@ -191,7 +191,39 @@
         </w:numPr>
       </w:pPr>
       <w:r>
-        <w:t xml:space="preserve">Γράψτε τον κωδικό και πατήστε</w:t>
+        <w:t xml:space="preserve">Γράψτε τον κωδικό και τον</w:t>
+      </w:r>
+      <w:r>
+        <w:t xml:space="preserve"> </w:t>
+      </w:r>
+      <w:r>
+        <w:rPr>
+          <w:b/>
+          <w:bCs/>
+        </w:rPr>
+        <w:t xml:space="preserve">ΑΜ σας</w:t>
+      </w:r>
+      <w:r>
+        <w:t xml:space="preserve"> </w:t>
+      </w:r>
+      <w:r>
+        <w:t xml:space="preserve">(μόνιμοι) ή το</w:t>
+      </w:r>
+      <w:r>
+        <w:t xml:space="preserve"> </w:t>
+      </w:r>
+      <w:r>
+        <w:rPr>
+          <w:b/>
+          <w:bCs/>
+        </w:rPr>
+        <w:t xml:space="preserve">ΑΦΜ σας</w:t>
+      </w:r>
+      <w:r>
+        <w:t xml:space="preserve"> </w:t>
+      </w:r>
+      <w:r>
+        <w:t xml:space="preserve">(αναπληρωτές) και πατήστε</w:t>
       </w:r>
       <w:r>
         <w:t xml:space="preserve"> </w:t>
@@ -204,23 +236,7 @@
         <w:t xml:space="preserve">«Σύνδεση»</w:t>
       </w:r>
       <w:r>
-        <w:t xml:space="preserve">. Μετά διαλέξτε</w:t>
-      </w:r>
-      <w:r>
-        <w:t xml:space="preserve"> </w:t>
-      </w:r>
-      <w:r>
-        <w:rPr>
-          <w:b/>
-          <w:bCs/>
-        </w:rPr>
-        <w:t xml:space="preserve">τον όμιλό σας</w:t>
-      </w:r>
-      <w:r>
-        <w:t xml:space="preserve"> </w:t>
-      </w:r>
-      <w:r>
-        <w:t xml:space="preserve">από τη λίστα «Ο όμιλός σας». Αλλάζετε μόνο τη λίστα του δικού σας ομίλου· κάθε αλλαγή καταγράφεται.</w:t>
+        <w:t xml:space="preserve">. Βλέπετε μόνο τους δικούς σας ομίλους· κάθε αλλαγή καταγράφεται με το όνομά σας. (Η πλατφόρμα δεν κρατά τον αριθμό σας, μόνο ένα κρυπτογραφικό αποτύπωμα για να σας αναγνωρίζει.)</w:t>
       </w:r>
     </w:p>
     <w:p>
@@ -455,6 +471,38 @@
         </w:numPr>
       </w:pPr>
       <w:r>
+        <w:rPr>
+          <w:b/>
+          <w:bCs/>
+        </w:rPr>
+        <w:t xml:space="preserve">«Επιλογή όλων»</w:t>
+      </w:r>
+      <w:r>
+        <w:t xml:space="preserve">: τσεκάρει όσους εμφανίζονται με τα τρέχοντα φίλτρα, αν χωρούν στις θέσεις (π.χ. φίλτρο «Α τάξη» → όλοι της Α).</w:t>
+      </w:r>
+      <w:r>
+        <w:t xml:space="preserve"> </w:t>
+      </w:r>
+      <w:r>
+        <w:rPr>
+          <w:b/>
+          <w:bCs/>
+        </w:rPr>
+        <w:t xml:space="preserve">«Αποεπιλογή όλων»</w:t>
+      </w:r>
+      <w:r>
+        <w:t xml:space="preserve">: ξετσεκάρει όλους.</w:t>
+      </w:r>
+    </w:p>
+    <w:p>
+      <w:pPr>
+        <w:pStyle w:val="Compact"/>
+        <w:numPr>
+          <w:ilvl w:val="1"/>
+          <w:numId w:val="1003"/>
+        </w:numPr>
+      </w:pPr>
+      <w:r>
         <w:t xml:space="preserve">Η</w:t>
       </w:r>
       <w:r>
@@ -493,7 +541,26 @@
         <w:t xml:space="preserve">«Αποθήκευση»</w:t>
       </w:r>
       <w:r>
-        <w:t xml:space="preserve">.</w:t>
+        <w:t xml:space="preserve"> </w:t>
+      </w:r>
+      <w:r>
+        <w:t xml:space="preserve">— σε</w:t>
+      </w:r>
+      <w:r>
+        <w:t xml:space="preserve"> </w:t>
+      </w:r>
+      <w:r>
+        <w:rPr>
+          <w:b/>
+          <w:bCs/>
+        </w:rPr>
+        <w:t xml:space="preserve">κάθε</w:t>
+      </w:r>
+      <w:r>
+        <w:t xml:space="preserve"> </w:t>
+      </w:r>
+      <w:r>
+        <w:t xml:space="preserve">όμιλο ξεχωριστά. Όσο δεν έχετε αποθηκεύσει, δίπλα στο κουμπί γράφει «Μη αποθηκευμένες αλλαγές».</w:t>
       </w:r>
     </w:p>
     <w:p>

</xml_diff>

<commit_message>
Teachers' lists open while parents declare; week table per student; club rosters
- Teachers' lists stay open in the parents' phase, until the same deadline,
  and lock when declarations close. With deferred acceptance a parent's best
  ranking does not depend on the priorities, and teachers never see the
  declarations. Clubs still lock when declarations open; seats may then only
  grow (the seat check for mandatory grades was done at opening).
- Admin, results: «Ανά μαθητή» (every student's club per day, with father's
  and mother's names, search, grade filter, .xlsx) and «Παρουσιολόγια» (each
  club's members alphabetically; one .xlsx or all as .zip). The results
  workbook's «Ανά μαθητή» sheet gets the same columns and order.
- src/export/rosters.js with tests; help, manuals, SPEC and CLAUDE.md updated.

Co-Authored-By: Claude Opus 5.5 <noreply@anthropic.com>
Claude-Session: https://claude.ai/code/session_014bv1rucCSvWvUULong8T8B
</commit_message>
<xml_diff>
--- a/docs/Egxeiridio_Ekpaideutikoi.docx
+++ b/docs/Egxeiridio_Ekpaideutikoi.docx
@@ -54,7 +54,7 @@
           <w:b/>
           <w:bCs/>
         </w:rPr>
-        <w:t xml:space="preserve">πριν ανοίξουν οι δηλώσεις των γονέων</w:t>
+        <w:t xml:space="preserve">μέχρι να κλείσουν οι δηλώσεις των γονέων</w:t>
       </w:r>
       <w:r>
         <w:t xml:space="preserve">, προαιρετικά, τους</w:t>
@@ -612,7 +612,7 @@
         <w:t xml:space="preserve"> </w:t>
       </w:r>
       <w:r>
-        <w:t xml:space="preserve">οι αλλαγές γίνονται μέχρι να ανοίξουν οι δηλώσεις των γονέων· τότε η λίστα</w:t>
+        <w:t xml:space="preserve">οι αλλαγές γίνονται μέχρι να κλείσουν οι δηλώσεις των γονέων (η ίδια προθεσμία με τους γονείς)· τότε η λίστα</w:t>
       </w:r>
       <w:r>
         <w:t xml:space="preserve"> </w:t>
@@ -625,7 +625,7 @@
         <w:t xml:space="preserve">κλειδώνει</w:t>
       </w:r>
       <w:r>
-        <w:t xml:space="preserve">. Για διορθώσεις μετά από αυτό, επικοινωνήστε με τον υπεύθυνο των ομίλων.</w:t>
+        <w:t xml:space="preserve">. Δεν βλέπετε τις δηλώσεις των γονέων, και δεν χρειάζεται: η λίστα σας μετράει μόνο για όσους δηλώσουν τον όμιλο. Για διορθώσεις μετά από αυτό, επικοινωνήστε με τον υπεύθυνο των ομίλων.</w:t>
       </w:r>
     </w:p>
     <w:p>
@@ -4570,7 +4570,7 @@
         <w:t xml:space="preserve">κανένα κριτήριο δεν εξαρτάται από όσα δηλώνει ο μαθητής</w:t>
       </w:r>
       <w:r>
-        <w:t xml:space="preserve">: οι λίστες των εκπαιδευτικών κλειδώνουν πριν ανοίξουν οι δηλώσεις, η τάξη είναι δεδομένη και η κλήρωση προκύπτει από το seed. Άρα ισχύουν όλα τα αποτελέσματα του §2 — ευστάθεια, βελτιστότητα για τους μαθητές, ανεξαρτησία από τη σειρά και</w:t>
+        <w:t xml:space="preserve">: οι λίστες των εκπαιδευτικών δεν εξαρτώνται από τις δηλώσεις (οι εκπαιδευτικοί δεν τις βλέπουν· οι λίστες κλειδώνουν με το κλείσιμο των δηλώσεων), η τάξη είναι δεδομένη και η κλήρωση προκύπτει από το seed. Άρα ισχύουν όλα τα αποτελέσματα του §2 — ευστάθεια, βελτιστότητα για τους μαθητές, ανεξαρτησία από τη σειρά και</w:t>
       </w:r>
       <w:r>
         <w:t xml:space="preserve"> </w:t>

</xml_diff>

<commit_message>
Login: show-code button, Greek keyboard/Caps Lock warnings, failed logins in history
Teachers reported failing logins with the right code and ΑΜ. The code box
shows only dots, so a keyboard left in Greek, Caps Lock, a pasted space or
browser autofill go unnoticed.

- Parents' and teachers' code boxes: «Εμφάνιση» button and a warning when
  Greek letters are typed or Caps Lock is on
- Spaces around a common code are forgiven (and trimmed when it is set)
- Every failed parent/teacher login goes to the admin's history with the
  reason (wrong code, unknown ΑΜ/ΑΦΜ, names) and whether the code had Greek
  letters; nothing typed is kept
- No autofill on the teachers' code box
- Help, manuals (rebuilt), README, SPEC updated

Co-Authored-By: Claude Opus 5.5 <noreply@anthropic.com>
Claude-Session: https://claude.ai/code/session_01ML3izmwWU6pmPAU3JoUeWh
</commit_message>
<xml_diff>
--- a/docs/Egxeiridio_Ekpaideutikoi.docx
+++ b/docs/Egxeiridio_Ekpaideutikoi.docx
@@ -237,6 +237,73 @@
       </w:r>
       <w:r>
         <w:t xml:space="preserve">. Βλέπετε μόνο τους δικούς σας ομίλους· κάθε αλλαγή καταγράφεται με το όνομά σας. (Η πλατφόρμα δεν κρατά τον αριθμό σας, μόνο ένα κρυπτογραφικό αποτύπωμα για να σας αναγνωρίζει.)</w:t>
+      </w:r>
+    </w:p>
+    <w:p>
+      <w:pPr>
+        <w:pStyle w:val="Compact"/>
+        <w:numPr>
+          <w:ilvl w:val="0"/>
+          <w:numId w:val="1001"/>
+        </w:numPr>
+      </w:pPr>
+      <w:r>
+        <w:rPr>
+          <w:b/>
+          <w:bCs/>
+        </w:rPr>
+        <w:t xml:space="preserve">Αν η σύνδεση αποτυγχάνει</w:t>
+      </w:r>
+      <w:r>
+        <w:t xml:space="preserve"> </w:t>
+      </w:r>
+      <w:r>
+        <w:t xml:space="preserve">ενώ τα στοιχεία είναι σωστά, πατήστε</w:t>
+      </w:r>
+      <w:r>
+        <w:t xml:space="preserve"> </w:t>
+      </w:r>
+      <w:r>
+        <w:rPr>
+          <w:b/>
+          <w:bCs/>
+        </w:rPr>
+        <w:t xml:space="preserve">«Εμφάνιση»</w:t>
+      </w:r>
+      <w:r>
+        <w:t xml:space="preserve"> </w:t>
+      </w:r>
+      <w:r>
+        <w:t xml:space="preserve">δίπλα στον κωδικό για να δείτε τι γράψατε. Η συνηθισμένη αιτία είναι το</w:t>
+      </w:r>
+      <w:r>
+        <w:t xml:space="preserve"> </w:t>
+      </w:r>
+      <w:r>
+        <w:rPr>
+          <w:b/>
+          <w:bCs/>
+        </w:rPr>
+        <w:t xml:space="preserve">πληκτρολόγιο στα ελληνικά</w:t>
+      </w:r>
+      <w:r>
+        <w:t xml:space="preserve"> </w:t>
+      </w:r>
+      <w:r>
+        <w:t xml:space="preserve">(αλλάζει με Alt+Shift· η σελίδα το επισημαίνει) ή το</w:t>
+      </w:r>
+      <w:r>
+        <w:t xml:space="preserve"> </w:t>
+      </w:r>
+      <w:r>
+        <w:rPr>
+          <w:b/>
+          <w:bCs/>
+        </w:rPr>
+        <w:t xml:space="preserve">Caps Lock</w:t>
+      </w:r>
+      <w:r>
+        <w:t xml:space="preserve">. Κενά πριν ή μετά τον κωδικό (π.χ. από αντιγραφή) δεν πειράζουν.</w:t>
       </w:r>
     </w:p>
     <w:p>

</xml_diff>

<commit_message>
Exclusions may also be added while parents declare
Decided 15/10/2026 («(β)»): teachers (and the admin, and the Excel import)
can add ⛔ during the parents' phase too. A declaration that already ranks
the club stays as it is; the allocation skips the club, as before for any
excluded club. The parent sees a note on that day and «δεν ισχύει πια» on
the receipt (new `withdrawn` per day in /api/parent/me). After saving,
the teacher is told how many students with a declaration were affected
(`excludedAfterSubmission`); the Excel preview warns likewise.

Docs: help, manuals (rebuilt), SPEC, CLAUDE.md.

Co-Authored-By: Claude Opus 5.5 <noreply@anthropic.com>
Claude-Session: https://claude.ai/code/session_0169rp8ke2vSPvUgMddkhEjx
</commit_message>
<xml_diff>
--- a/docs/Egxeiridio_Ekpaideutikoi.docx
+++ b/docs/Egxeiridio_Ekpaideutikoi.docx
@@ -969,29 +969,97 @@
           <w:b/>
           <w:bCs/>
         </w:rPr>
-        <w:t xml:space="preserve">Αποκλεισμοί μόνο πριν ανοίξουν οι δηλώσεις:</w:t>
-      </w:r>
-      <w:r>
-        <w:t xml:space="preserve"> </w:t>
-      </w:r>
-      <w:r>
-        <w:t xml:space="preserve">όταν οι γονείς δηλώνουν, μπορείτε να</w:t>
-      </w:r>
-      <w:r>
-        <w:t xml:space="preserve"> </w:t>
-      </w:r>
-      <w:r>
-        <w:rPr>
-          <w:b/>
-          <w:bCs/>
-        </w:rPr>
-        <w:t xml:space="preserve">αφαιρέσετε</w:t>
-      </w:r>
-      <w:r>
-        <w:t xml:space="preserve"> </w:t>
-      </w:r>
-      <w:r>
-        <w:t xml:space="preserve">αποκλεισμούς (⛔ → ○ ή ⭐), όχι να προσθέσετε, γιατί οι γονείς έχουν ήδη δει τη φόρμα τους. Αν αφαιρέσετε αποκλεισμό από μαθητή που έχει ήδη δήλωση, ο όμιλος μετράει μόνο αν ο γονέας ξαναμπεί και αποθηκεύσει τη δήλωση (η πλατφόρμα του τον δείχνει στο τέλος της σειράς).</w:t>
+        <w:t xml:space="preserve">Αποκλεισμοί ενώ οι γονείς δηλώνουν:</w:t>
+      </w:r>
+      <w:r>
+        <w:t xml:space="preserve"> </w:t>
+      </w:r>
+      <w:r>
+        <w:t xml:space="preserve">μπορείτε να προσθέσετε ή να αφαιρέσετε αποκλεισμούς μέχρι την προθεσμία.</w:t>
+      </w:r>
+    </w:p>
+    <w:p>
+      <w:pPr>
+        <w:pStyle w:val="Compact"/>
+        <w:numPr>
+          <w:ilvl w:val="0"/>
+          <w:numId w:val="1005"/>
+        </w:numPr>
+      </w:pPr>
+      <w:r>
+        <w:t xml:space="preserve">Αν</w:t>
+      </w:r>
+      <w:r>
+        <w:t xml:space="preserve"> </w:t>
+      </w:r>
+      <w:r>
+        <w:rPr>
+          <w:b/>
+          <w:bCs/>
+        </w:rPr>
+        <w:t xml:space="preserve">αποκλείσετε</w:t>
+      </w:r>
+      <w:r>
+        <w:t xml:space="preserve"> </w:t>
+      </w:r>
+      <w:r>
+        <w:t xml:space="preserve">μαθητή που έχει ήδη δηλώσει τον όμιλο, ο όμιλος</w:t>
+      </w:r>
+      <w:r>
+        <w:t xml:space="preserve"> </w:t>
+      </w:r>
+      <w:r>
+        <w:rPr>
+          <w:b/>
+          <w:bCs/>
+        </w:rPr>
+        <w:t xml:space="preserve">παραλείπεται</w:t>
+      </w:r>
+      <w:r>
+        <w:t xml:space="preserve"> </w:t>
+      </w:r>
+      <w:r>
+        <w:t xml:space="preserve">από τη δήλωσή του στην κατανομή· η σειρά των υπόλοιπων ομίλων μένει ίδια. Ο γονέας βλέπει σχετικό μήνυμα όταν συνδεθεί.</w:t>
+      </w:r>
+    </w:p>
+    <w:p>
+      <w:pPr>
+        <w:pStyle w:val="Compact"/>
+        <w:numPr>
+          <w:ilvl w:val="0"/>
+          <w:numId w:val="1005"/>
+        </w:numPr>
+      </w:pPr>
+      <w:r>
+        <w:t xml:space="preserve">Αν</w:t>
+      </w:r>
+      <w:r>
+        <w:t xml:space="preserve"> </w:t>
+      </w:r>
+      <w:r>
+        <w:rPr>
+          <w:b/>
+          <w:bCs/>
+        </w:rPr>
+        <w:t xml:space="preserve">άρετε</w:t>
+      </w:r>
+      <w:r>
+        <w:t xml:space="preserve"> </w:t>
+      </w:r>
+      <w:r>
+        <w:t xml:space="preserve">έναν αποκλεισμό από μαθητή που έχει ήδη δήλωση, ο όμιλος μετράει μόνο αν ο γονέας ξαναμπεί και αποθηκεύσει τη δήλωση (η πλατφόρμα του τον δείχνει στο τέλος της σειράς).</w:t>
+      </w:r>
+    </w:p>
+    <w:p>
+      <w:pPr>
+        <w:pStyle w:val="Compact"/>
+        <w:numPr>
+          <w:ilvl w:val="0"/>
+          <w:numId w:val="1005"/>
+        </w:numPr>
+      </w:pPr>
+      <w:r>
+        <w:t xml:space="preserve">Μετά την αποθήκευση, η πλατφόρμα σας λέει πόσοι μαθητές με δήλωση επηρεάστηκαν.</w:t>
       </w:r>
     </w:p>
     <w:p>
@@ -1016,7 +1084,7 @@
         <w:pStyle w:val="Compact"/>
         <w:numPr>
           <w:ilvl w:val="0"/>
-          <w:numId w:val="1005"/>
+          <w:numId w:val="1006"/>
         </w:numPr>
       </w:pPr>
       <w:r>
@@ -1057,7 +1125,7 @@
         <w:pStyle w:val="Compact"/>
         <w:numPr>
           <w:ilvl w:val="0"/>
-          <w:numId w:val="1005"/>
+          <w:numId w:val="1006"/>
         </w:numPr>
       </w:pPr>
       <w:r>
@@ -1085,7 +1153,7 @@
         <w:pStyle w:val="Compact"/>
         <w:numPr>
           <w:ilvl w:val="0"/>
-          <w:numId w:val="1005"/>
+          <w:numId w:val="1006"/>
         </w:numPr>
       </w:pPr>
       <w:r>
@@ -1113,7 +1181,7 @@
         <w:pStyle w:val="Compact"/>
         <w:numPr>
           <w:ilvl w:val="0"/>
-          <w:numId w:val="1005"/>
+          <w:numId w:val="1006"/>
         </w:numPr>
       </w:pPr>
       <w:r>
@@ -1138,7 +1206,7 @@
         <w:pStyle w:val="Compact"/>
         <w:numPr>
           <w:ilvl w:val="0"/>
-          <w:numId w:val="1005"/>
+          <w:numId w:val="1006"/>
         </w:numPr>
       </w:pPr>
       <w:r>
@@ -1166,7 +1234,7 @@
         <w:pStyle w:val="Compact"/>
         <w:numPr>
           <w:ilvl w:val="0"/>
-          <w:numId w:val="1005"/>
+          <w:numId w:val="1006"/>
         </w:numPr>
       </w:pPr>
       <w:r>
@@ -1277,7 +1345,7 @@
         <w:pStyle w:val="Compact"/>
         <w:numPr>
           <w:ilvl w:val="0"/>
-          <w:numId w:val="1006"/>
+          <w:numId w:val="1007"/>
         </w:numPr>
       </w:pPr>
       <w:r>
@@ -1305,7 +1373,7 @@
         <w:pStyle w:val="Compact"/>
         <w:numPr>
           <w:ilvl w:val="0"/>
-          <w:numId w:val="1006"/>
+          <w:numId w:val="1007"/>
         </w:numPr>
       </w:pPr>
       <w:r>
@@ -1857,7 +1925,7 @@
         <w:pStyle w:val="Compact"/>
         <w:numPr>
           <w:ilvl w:val="0"/>
-          <w:numId w:val="1007"/>
+          <w:numId w:val="1008"/>
         </w:numPr>
       </w:pPr>
       <w:r>
@@ -1885,7 +1953,7 @@
         <w:pStyle w:val="Compact"/>
         <w:numPr>
           <w:ilvl w:val="0"/>
-          <w:numId w:val="1007"/>
+          <w:numId w:val="1008"/>
         </w:numPr>
       </w:pPr>
       <w:r>
@@ -1913,7 +1981,7 @@
         <w:pStyle w:val="Compact"/>
         <w:numPr>
           <w:ilvl w:val="0"/>
-          <w:numId w:val="1007"/>
+          <w:numId w:val="1008"/>
         </w:numPr>
       </w:pPr>
       <w:r>
@@ -2054,7 +2122,7 @@
         <w:pStyle w:val="Compact"/>
         <w:numPr>
           <w:ilvl w:val="0"/>
-          <w:numId w:val="1008"/>
+          <w:numId w:val="1009"/>
         </w:numPr>
       </w:pPr>
       <w:r>
@@ -2076,7 +2144,7 @@
         <w:pStyle w:val="Compact"/>
         <w:numPr>
           <w:ilvl w:val="0"/>
-          <w:numId w:val="1008"/>
+          <w:numId w:val="1009"/>
         </w:numPr>
       </w:pPr>
       <w:r>
@@ -2098,7 +2166,7 @@
         <w:pStyle w:val="Compact"/>
         <w:numPr>
           <w:ilvl w:val="0"/>
-          <w:numId w:val="1008"/>
+          <w:numId w:val="1009"/>
         </w:numPr>
       </w:pPr>
       <w:r>
@@ -2478,7 +2546,7 @@
         <w:pStyle w:val="Compact"/>
         <w:numPr>
           <w:ilvl w:val="0"/>
-          <w:numId w:val="1009"/>
+          <w:numId w:val="1010"/>
         </w:numPr>
       </w:pPr>
       <w:r>
@@ -2500,7 +2568,7 @@
         <w:pStyle w:val="Compact"/>
         <w:numPr>
           <w:ilvl w:val="0"/>
-          <w:numId w:val="1009"/>
+          <w:numId w:val="1010"/>
         </w:numPr>
       </w:pPr>
       <w:r>
@@ -2522,7 +2590,7 @@
         <w:pStyle w:val="Compact"/>
         <w:numPr>
           <w:ilvl w:val="0"/>
-          <w:numId w:val="1009"/>
+          <w:numId w:val="1010"/>
         </w:numPr>
       </w:pPr>
       <w:r>
@@ -3046,7 +3114,7 @@
         <w:pStyle w:val="Compact"/>
         <w:numPr>
           <w:ilvl w:val="0"/>
-          <w:numId w:val="1010"/>
+          <w:numId w:val="1011"/>
         </w:numPr>
       </w:pPr>
       <w:r>
@@ -3071,7 +3139,7 @@
         <w:pStyle w:val="Compact"/>
         <w:numPr>
           <w:ilvl w:val="0"/>
-          <w:numId w:val="1010"/>
+          <w:numId w:val="1011"/>
         </w:numPr>
       </w:pPr>
       <w:r>
@@ -3114,7 +3182,7 @@
         <w:pStyle w:val="Compact"/>
         <w:numPr>
           <w:ilvl w:val="0"/>
-          <w:numId w:val="1011"/>
+          <w:numId w:val="1012"/>
         </w:numPr>
       </w:pPr>
       <w:r>
@@ -3149,7 +3217,7 @@
         <w:pStyle w:val="Compact"/>
         <w:numPr>
           <w:ilvl w:val="0"/>
-          <w:numId w:val="1011"/>
+          <w:numId w:val="1012"/>
         </w:numPr>
       </w:pPr>
       <w:r>
@@ -3192,7 +3260,7 @@
         <w:pStyle w:val="Compact"/>
         <w:numPr>
           <w:ilvl w:val="0"/>
-          <w:numId w:val="1012"/>
+          <w:numId w:val="1013"/>
         </w:numPr>
       </w:pPr>
       <w:r>
@@ -3232,7 +3300,7 @@
         <w:pStyle w:val="Compact"/>
         <w:numPr>
           <w:ilvl w:val="0"/>
-          <w:numId w:val="1013"/>
+          <w:numId w:val="1014"/>
         </w:numPr>
       </w:pPr>
       <w:r>
@@ -3269,7 +3337,7 @@
         <w:pStyle w:val="Compact"/>
         <w:numPr>
           <w:ilvl w:val="0"/>
-          <w:numId w:val="1014"/>
+          <w:numId w:val="1015"/>
         </w:numPr>
       </w:pPr>
       <w:r>
@@ -3539,7 +3607,7 @@
         <w:pStyle w:val="Compact"/>
         <w:numPr>
           <w:ilvl w:val="0"/>
-          <w:numId w:val="1015"/>
+          <w:numId w:val="1016"/>
         </w:numPr>
       </w:pPr>
       <w:r>
@@ -3577,7 +3645,7 @@
         <w:pStyle w:val="Compact"/>
         <w:numPr>
           <w:ilvl w:val="0"/>
-          <w:numId w:val="1015"/>
+          <w:numId w:val="1016"/>
         </w:numPr>
       </w:pPr>
       <w:r>
@@ -3599,7 +3667,7 @@
         <w:pStyle w:val="Compact"/>
         <w:numPr>
           <w:ilvl w:val="0"/>
-          <w:numId w:val="1015"/>
+          <w:numId w:val="1016"/>
         </w:numPr>
       </w:pPr>
       <w:r>
@@ -3621,7 +3689,7 @@
         <w:pStyle w:val="Compact"/>
         <w:numPr>
           <w:ilvl w:val="0"/>
-          <w:numId w:val="1015"/>
+          <w:numId w:val="1016"/>
         </w:numPr>
       </w:pPr>
       <w:r>
@@ -3643,7 +3711,7 @@
         <w:pStyle w:val="Compact"/>
         <w:numPr>
           <w:ilvl w:val="0"/>
-          <w:numId w:val="1015"/>
+          <w:numId w:val="1016"/>
         </w:numPr>
       </w:pPr>
       <w:r>
@@ -3675,7 +3743,7 @@
         <w:pStyle w:val="Compact"/>
         <w:numPr>
           <w:ilvl w:val="0"/>
-          <w:numId w:val="1016"/>
+          <w:numId w:val="1017"/>
         </w:numPr>
       </w:pPr>
       <w:r>
@@ -3700,7 +3768,7 @@
         <w:pStyle w:val="Compact"/>
         <w:numPr>
           <w:ilvl w:val="0"/>
-          <w:numId w:val="1016"/>
+          <w:numId w:val="1017"/>
         </w:numPr>
       </w:pPr>
       <w:r>
@@ -3759,7 +3827,7 @@
         <w:pStyle w:val="Compact"/>
         <w:numPr>
           <w:ilvl w:val="0"/>
-          <w:numId w:val="1017"/>
+          <w:numId w:val="1018"/>
         </w:numPr>
       </w:pPr>
       <w:r>
@@ -3787,7 +3855,7 @@
         <w:pStyle w:val="Compact"/>
         <w:numPr>
           <w:ilvl w:val="0"/>
-          <w:numId w:val="1017"/>
+          <w:numId w:val="1018"/>
         </w:numPr>
       </w:pPr>
       <w:r>
@@ -3799,7 +3867,7 @@
         <w:pStyle w:val="Compact"/>
         <w:numPr>
           <w:ilvl w:val="0"/>
-          <w:numId w:val="1017"/>
+          <w:numId w:val="1018"/>
         </w:numPr>
       </w:pPr>
       <w:r>
@@ -3887,7 +3955,7 @@
         <w:pStyle w:val="Compact"/>
         <w:numPr>
           <w:ilvl w:val="0"/>
-          <w:numId w:val="1018"/>
+          <w:numId w:val="1019"/>
         </w:numPr>
       </w:pPr>
       <w:r>
@@ -3915,7 +3983,7 @@
         <w:pStyle w:val="Compact"/>
         <w:numPr>
           <w:ilvl w:val="0"/>
-          <w:numId w:val="1018"/>
+          <w:numId w:val="1019"/>
         </w:numPr>
       </w:pPr>
       <w:r>
@@ -3943,7 +4011,7 @@
         <w:pStyle w:val="Compact"/>
         <w:numPr>
           <w:ilvl w:val="0"/>
-          <w:numId w:val="1018"/>
+          <w:numId w:val="1019"/>
         </w:numPr>
       </w:pPr>
       <w:r>
@@ -3973,7 +4041,7 @@
         <w:pStyle w:val="Compact"/>
         <w:numPr>
           <w:ilvl w:val="0"/>
-          <w:numId w:val="1019"/>
+          <w:numId w:val="1020"/>
         </w:numPr>
       </w:pPr>
       <w:r>
@@ -4014,7 +4082,7 @@
         <w:pStyle w:val="Compact"/>
         <w:numPr>
           <w:ilvl w:val="0"/>
-          <w:numId w:val="1019"/>
+          <w:numId w:val="1020"/>
         </w:numPr>
       </w:pPr>
       <w:r>
@@ -4026,7 +4094,7 @@
         <w:pStyle w:val="Compact"/>
         <w:numPr>
           <w:ilvl w:val="0"/>
-          <w:numId w:val="1019"/>
+          <w:numId w:val="1020"/>
         </w:numPr>
       </w:pPr>
       <w:r>
@@ -4038,7 +4106,7 @@
         <w:pStyle w:val="Compact"/>
         <w:numPr>
           <w:ilvl w:val="0"/>
-          <w:numId w:val="1019"/>
+          <w:numId w:val="1020"/>
         </w:numPr>
       </w:pPr>
       <w:r>
@@ -4101,7 +4169,7 @@
         <w:pStyle w:val="Compact"/>
         <w:numPr>
           <w:ilvl w:val="0"/>
-          <w:numId w:val="1020"/>
+          <w:numId w:val="1021"/>
         </w:numPr>
       </w:pPr>
       <w:r>
@@ -4126,7 +4194,7 @@
         <w:pStyle w:val="Compact"/>
         <w:numPr>
           <w:ilvl w:val="0"/>
-          <w:numId w:val="1020"/>
+          <w:numId w:val="1021"/>
         </w:numPr>
       </w:pPr>
       <w:r>
@@ -4421,7 +4489,7 @@
         <w:pStyle w:val="Compact"/>
         <w:numPr>
           <w:ilvl w:val="0"/>
-          <w:numId w:val="1021"/>
+          <w:numId w:val="1022"/>
         </w:numPr>
       </w:pPr>
       <w:r>
@@ -4469,7 +4537,7 @@
         <w:pStyle w:val="Compact"/>
         <w:numPr>
           <w:ilvl w:val="0"/>
-          <w:numId w:val="1021"/>
+          <w:numId w:val="1022"/>
         </w:numPr>
       </w:pPr>
       <w:r>
@@ -4497,7 +4565,7 @@
         <w:pStyle w:val="Compact"/>
         <w:numPr>
           <w:ilvl w:val="0"/>
-          <w:numId w:val="1021"/>
+          <w:numId w:val="1022"/>
         </w:numPr>
       </w:pPr>
       <w:r>
@@ -4525,7 +4593,7 @@
         <w:pStyle w:val="Compact"/>
         <w:numPr>
           <w:ilvl w:val="0"/>
-          <w:numId w:val="1021"/>
+          <w:numId w:val="1022"/>
         </w:numPr>
       </w:pPr>
       <w:r>
@@ -4580,7 +4648,7 @@
         <w:pStyle w:val="Compact"/>
         <w:numPr>
           <w:ilvl w:val="0"/>
-          <w:numId w:val="1022"/>
+          <w:numId w:val="1023"/>
         </w:numPr>
       </w:pPr>
       <w:r>
@@ -4602,7 +4670,7 @@
         <w:pStyle w:val="Compact"/>
         <w:numPr>
           <w:ilvl w:val="0"/>
-          <w:numId w:val="1022"/>
+          <w:numId w:val="1023"/>
         </w:numPr>
       </w:pPr>
       <w:r>
@@ -4624,7 +4692,7 @@
         <w:pStyle w:val="Compact"/>
         <w:numPr>
           <w:ilvl w:val="0"/>
-          <w:numId w:val="1022"/>
+          <w:numId w:val="1023"/>
         </w:numPr>
       </w:pPr>
       <w:r>
@@ -4741,7 +4809,7 @@
         <w:pStyle w:val="Compact"/>
         <w:numPr>
           <w:ilvl w:val="0"/>
-          <w:numId w:val="1023"/>
+          <w:numId w:val="1024"/>
         </w:numPr>
       </w:pPr>
       <w:r>
@@ -4779,7 +4847,7 @@
         <w:pStyle w:val="Compact"/>
         <w:numPr>
           <w:ilvl w:val="0"/>
-          <w:numId w:val="1023"/>
+          <w:numId w:val="1024"/>
         </w:numPr>
       </w:pPr>
       <w:r>
@@ -4817,7 +4885,7 @@
         <w:pStyle w:val="Compact"/>
         <w:numPr>
           <w:ilvl w:val="0"/>
-          <w:numId w:val="1023"/>
+          <w:numId w:val="1024"/>
         </w:numPr>
       </w:pPr>
       <w:r>
@@ -4837,7 +4905,7 @@
         <w:pStyle w:val="Compact"/>
         <w:numPr>
           <w:ilvl w:val="0"/>
-          <w:numId w:val="1024"/>
+          <w:numId w:val="1025"/>
         </w:numPr>
       </w:pPr>
       <w:r>
@@ -4859,7 +4927,7 @@
         <w:pStyle w:val="Compact"/>
         <w:numPr>
           <w:ilvl w:val="0"/>
-          <w:numId w:val="1024"/>
+          <w:numId w:val="1025"/>
         </w:numPr>
       </w:pPr>
       <w:r>
@@ -4897,7 +4965,7 @@
         <w:pStyle w:val="Compact"/>
         <w:numPr>
           <w:ilvl w:val="0"/>
-          <w:numId w:val="1024"/>
+          <w:numId w:val="1025"/>
         </w:numPr>
       </w:pPr>
       <w:r>
@@ -4919,7 +4987,7 @@
         <w:pStyle w:val="Compact"/>
         <w:numPr>
           <w:ilvl w:val="0"/>
-          <w:numId w:val="1024"/>
+          <w:numId w:val="1025"/>
         </w:numPr>
       </w:pPr>
       <w:r>
@@ -4941,7 +5009,7 @@
         <w:pStyle w:val="Compact"/>
         <w:numPr>
           <w:ilvl w:val="0"/>
-          <w:numId w:val="1024"/>
+          <w:numId w:val="1025"/>
         </w:numPr>
       </w:pPr>
       <w:r>
@@ -5363,7 +5431,7 @@
         <w:pStyle w:val="Compact"/>
         <w:numPr>
           <w:ilvl w:val="0"/>
-          <w:numId w:val="1025"/>
+          <w:numId w:val="1026"/>
         </w:numPr>
       </w:pPr>
       <w:r>
@@ -5391,7 +5459,7 @@
         <w:pStyle w:val="Compact"/>
         <w:numPr>
           <w:ilvl w:val="0"/>
-          <w:numId w:val="1025"/>
+          <w:numId w:val="1026"/>
         </w:numPr>
       </w:pPr>
       <w:r>
@@ -5416,7 +5484,7 @@
         <w:pStyle w:val="Compact"/>
         <w:numPr>
           <w:ilvl w:val="0"/>
-          <w:numId w:val="1025"/>
+          <w:numId w:val="1026"/>
         </w:numPr>
       </w:pPr>
       <w:r>
@@ -5622,7 +5690,7 @@
         <w:pStyle w:val="Compact"/>
         <w:numPr>
           <w:ilvl w:val="0"/>
-          <w:numId w:val="1026"/>
+          <w:numId w:val="1027"/>
         </w:numPr>
       </w:pPr>
       <w:r>
@@ -5644,7 +5712,7 @@
         <w:pStyle w:val="Compact"/>
         <w:numPr>
           <w:ilvl w:val="0"/>
-          <w:numId w:val="1026"/>
+          <w:numId w:val="1027"/>
         </w:numPr>
       </w:pPr>
       <w:r>
@@ -5669,7 +5737,7 @@
         <w:pStyle w:val="Compact"/>
         <w:numPr>
           <w:ilvl w:val="0"/>
-          <w:numId w:val="1026"/>
+          <w:numId w:val="1027"/>
         </w:numPr>
       </w:pPr>
       <w:r>
@@ -5720,7 +5788,7 @@
         <w:pStyle w:val="Compact"/>
         <w:numPr>
           <w:ilvl w:val="0"/>
-          <w:numId w:val="1026"/>
+          <w:numId w:val="1027"/>
         </w:numPr>
       </w:pPr>
       <w:r>
@@ -5826,7 +5894,7 @@
         <w:pStyle w:val="Compact"/>
         <w:numPr>
           <w:ilvl w:val="0"/>
-          <w:numId w:val="1027"/>
+          <w:numId w:val="1028"/>
         </w:numPr>
       </w:pPr>
       <w:r>
@@ -5838,7 +5906,7 @@
         <w:pStyle w:val="Compact"/>
         <w:numPr>
           <w:ilvl w:val="0"/>
-          <w:numId w:val="1027"/>
+          <w:numId w:val="1028"/>
         </w:numPr>
       </w:pPr>
       <w:r>
@@ -5866,7 +5934,7 @@
         <w:pStyle w:val="Compact"/>
         <w:numPr>
           <w:ilvl w:val="0"/>
-          <w:numId w:val="1027"/>
+          <w:numId w:val="1028"/>
         </w:numPr>
       </w:pPr>
       <w:r>
@@ -5878,7 +5946,7 @@
         <w:pStyle w:val="Compact"/>
         <w:numPr>
           <w:ilvl w:val="0"/>
-          <w:numId w:val="1027"/>
+          <w:numId w:val="1028"/>
         </w:numPr>
       </w:pPr>
       <w:r>
@@ -5890,7 +5958,7 @@
         <w:pStyle w:val="Compact"/>
         <w:numPr>
           <w:ilvl w:val="0"/>
-          <w:numId w:val="1027"/>
+          <w:numId w:val="1028"/>
         </w:numPr>
       </w:pPr>
       <w:r>
@@ -5920,7 +5988,7 @@
         <w:pStyle w:val="Compact"/>
         <w:numPr>
           <w:ilvl w:val="0"/>
-          <w:numId w:val="1028"/>
+          <w:numId w:val="1029"/>
         </w:numPr>
       </w:pPr>
       <w:r>
@@ -5948,7 +6016,7 @@
         <w:pStyle w:val="Compact"/>
         <w:numPr>
           <w:ilvl w:val="0"/>
-          <w:numId w:val="1028"/>
+          <w:numId w:val="1029"/>
         </w:numPr>
       </w:pPr>
       <w:r>
@@ -5976,7 +6044,7 @@
         <w:pStyle w:val="Compact"/>
         <w:numPr>
           <w:ilvl w:val="0"/>
-          <w:numId w:val="1028"/>
+          <w:numId w:val="1029"/>
         </w:numPr>
       </w:pPr>
       <w:r>
@@ -6018,7 +6086,7 @@
         <w:pStyle w:val="Compact"/>
         <w:numPr>
           <w:ilvl w:val="0"/>
-          <w:numId w:val="1029"/>
+          <w:numId w:val="1030"/>
         </w:numPr>
       </w:pPr>
       <w:r>
@@ -6040,7 +6108,7 @@
         <w:pStyle w:val="Compact"/>
         <w:numPr>
           <w:ilvl w:val="0"/>
-          <w:numId w:val="1029"/>
+          <w:numId w:val="1030"/>
         </w:numPr>
       </w:pPr>
       <w:r>
@@ -6078,7 +6146,7 @@
         <w:pStyle w:val="Compact"/>
         <w:numPr>
           <w:ilvl w:val="0"/>
-          <w:numId w:val="1029"/>
+          <w:numId w:val="1030"/>
         </w:numPr>
       </w:pPr>
       <w:r>
@@ -6117,7 +6185,7 @@
         <w:pStyle w:val="Compact"/>
         <w:numPr>
           <w:ilvl w:val="0"/>
-          <w:numId w:val="1030"/>
+          <w:numId w:val="1031"/>
         </w:numPr>
       </w:pPr>
       <w:r>
@@ -6142,7 +6210,7 @@
         <w:pStyle w:val="Compact"/>
         <w:numPr>
           <w:ilvl w:val="0"/>
-          <w:numId w:val="1030"/>
+          <w:numId w:val="1031"/>
         </w:numPr>
       </w:pPr>
       <w:r>
@@ -6167,7 +6235,7 @@
         <w:pStyle w:val="Compact"/>
         <w:numPr>
           <w:ilvl w:val="0"/>
-          <w:numId w:val="1030"/>
+          <w:numId w:val="1031"/>
         </w:numPr>
       </w:pPr>
       <w:r>
@@ -6192,7 +6260,7 @@
         <w:pStyle w:val="Compact"/>
         <w:numPr>
           <w:ilvl w:val="0"/>
-          <w:numId w:val="1030"/>
+          <w:numId w:val="1031"/>
         </w:numPr>
       </w:pPr>
       <w:r>
@@ -6217,7 +6285,7 @@
         <w:pStyle w:val="Compact"/>
         <w:numPr>
           <w:ilvl w:val="0"/>
-          <w:numId w:val="1030"/>
+          <w:numId w:val="1031"/>
         </w:numPr>
       </w:pPr>
       <w:r>
@@ -6242,7 +6310,7 @@
         <w:pStyle w:val="Compact"/>
         <w:numPr>
           <w:ilvl w:val="0"/>
-          <w:numId w:val="1030"/>
+          <w:numId w:val="1031"/>
         </w:numPr>
       </w:pPr>
       <w:r>
@@ -6267,7 +6335,7 @@
         <w:pStyle w:val="Compact"/>
         <w:numPr>
           <w:ilvl w:val="0"/>
-          <w:numId w:val="1030"/>
+          <w:numId w:val="1031"/>
         </w:numPr>
       </w:pPr>
       <w:r>
@@ -6292,7 +6360,7 @@
         <w:pStyle w:val="Compact"/>
         <w:numPr>
           <w:ilvl w:val="0"/>
-          <w:numId w:val="1030"/>
+          <w:numId w:val="1031"/>
         </w:numPr>
       </w:pPr>
       <w:r>
@@ -6317,7 +6385,7 @@
         <w:pStyle w:val="Compact"/>
         <w:numPr>
           <w:ilvl w:val="0"/>
-          <w:numId w:val="1030"/>
+          <w:numId w:val="1031"/>
         </w:numPr>
       </w:pPr>
       <w:r>
@@ -6342,7 +6410,7 @@
         <w:pStyle w:val="Compact"/>
         <w:numPr>
           <w:ilvl w:val="0"/>
-          <w:numId w:val="1030"/>
+          <w:numId w:val="1031"/>
         </w:numPr>
       </w:pPr>
       <w:r>
@@ -6367,7 +6435,7 @@
         <w:pStyle w:val="Compact"/>
         <w:numPr>
           <w:ilvl w:val="0"/>
-          <w:numId w:val="1030"/>
+          <w:numId w:val="1031"/>
         </w:numPr>
       </w:pPr>
       <w:r>
@@ -6392,7 +6460,7 @@
         <w:pStyle w:val="Compact"/>
         <w:numPr>
           <w:ilvl w:val="0"/>
-          <w:numId w:val="1030"/>
+          <w:numId w:val="1031"/>
         </w:numPr>
       </w:pPr>
       <w:r>
@@ -6417,7 +6485,7 @@
         <w:pStyle w:val="Compact"/>
         <w:numPr>
           <w:ilvl w:val="0"/>
-          <w:numId w:val="1030"/>
+          <w:numId w:val="1031"/>
         </w:numPr>
       </w:pPr>
       <w:r>
@@ -6442,7 +6510,7 @@
         <w:pStyle w:val="Compact"/>
         <w:numPr>
           <w:ilvl w:val="0"/>
-          <w:numId w:val="1030"/>
+          <w:numId w:val="1031"/>
         </w:numPr>
       </w:pPr>
       <w:r>
@@ -6467,7 +6535,7 @@
         <w:pStyle w:val="Compact"/>
         <w:numPr>
           <w:ilvl w:val="0"/>
-          <w:numId w:val="1030"/>
+          <w:numId w:val="1031"/>
         </w:numPr>
       </w:pPr>
       <w:r>
@@ -6492,7 +6560,7 @@
         <w:pStyle w:val="Compact"/>
         <w:numPr>
           <w:ilvl w:val="0"/>
-          <w:numId w:val="1030"/>
+          <w:numId w:val="1031"/>
         </w:numPr>
       </w:pPr>
       <w:r>
@@ -6517,7 +6585,7 @@
         <w:pStyle w:val="Compact"/>
         <w:numPr>
           <w:ilvl w:val="0"/>
-          <w:numId w:val="1030"/>
+          <w:numId w:val="1031"/>
         </w:numPr>
       </w:pPr>
       <w:r>
@@ -6545,7 +6613,7 @@
         <w:pStyle w:val="Compact"/>
         <w:numPr>
           <w:ilvl w:val="0"/>
-          <w:numId w:val="1030"/>
+          <w:numId w:val="1031"/>
         </w:numPr>
       </w:pPr>
       <w:r>
@@ -6570,7 +6638,7 @@
         <w:pStyle w:val="Compact"/>
         <w:numPr>
           <w:ilvl w:val="0"/>
-          <w:numId w:val="1030"/>
+          <w:numId w:val="1031"/>
         </w:numPr>
       </w:pPr>
       <w:r>
@@ -6595,7 +6663,7 @@
         <w:pStyle w:val="Compact"/>
         <w:numPr>
           <w:ilvl w:val="0"/>
-          <w:numId w:val="1030"/>
+          <w:numId w:val="1031"/>
         </w:numPr>
       </w:pPr>
       <w:r>
@@ -6620,7 +6688,7 @@
         <w:pStyle w:val="Compact"/>
         <w:numPr>
           <w:ilvl w:val="0"/>
-          <w:numId w:val="1030"/>
+          <w:numId w:val="1031"/>
         </w:numPr>
       </w:pPr>
       <w:r>
@@ -6645,7 +6713,7 @@
         <w:pStyle w:val="Compact"/>
         <w:numPr>
           <w:ilvl w:val="0"/>
-          <w:numId w:val="1030"/>
+          <w:numId w:val="1031"/>
         </w:numPr>
       </w:pPr>
       <w:r>
@@ -6670,7 +6738,7 @@
         <w:pStyle w:val="Compact"/>
         <w:numPr>
           <w:ilvl w:val="0"/>
-          <w:numId w:val="1030"/>
+          <w:numId w:val="1031"/>
         </w:numPr>
       </w:pPr>
       <w:r>
@@ -6695,7 +6763,7 @@
         <w:pStyle w:val="Compact"/>
         <w:numPr>
           <w:ilvl w:val="0"/>
-          <w:numId w:val="1030"/>
+          <w:numId w:val="1031"/>
         </w:numPr>
       </w:pPr>
       <w:r>
@@ -6720,7 +6788,7 @@
         <w:pStyle w:val="Compact"/>
         <w:numPr>
           <w:ilvl w:val="0"/>
-          <w:numId w:val="1030"/>
+          <w:numId w:val="1031"/>
         </w:numPr>
       </w:pPr>
       <w:r>
@@ -6745,7 +6813,7 @@
         <w:pStyle w:val="Compact"/>
         <w:numPr>
           <w:ilvl w:val="0"/>
-          <w:numId w:val="1030"/>
+          <w:numId w:val="1031"/>
         </w:numPr>
       </w:pPr>
       <w:r>
@@ -7115,34 +7183,7 @@
     <w:abstractNumId w:val="991"/>
   </w:num>
   <w:num w:numId="1007">
-    <w:abstractNumId w:val="99411"/>
-    <w:lvlOverride w:ilvl="0">
-      <w:startOverride w:val="1"/>
-    </w:lvlOverride>
-    <w:lvlOverride w:ilvl="1">
-      <w:startOverride w:val="1"/>
-    </w:lvlOverride>
-    <w:lvlOverride w:ilvl="2">
-      <w:startOverride w:val="1"/>
-    </w:lvlOverride>
-    <w:lvlOverride w:ilvl="3">
-      <w:startOverride w:val="1"/>
-    </w:lvlOverride>
-    <w:lvlOverride w:ilvl="4">
-      <w:startOverride w:val="1"/>
-    </w:lvlOverride>
-    <w:lvlOverride w:ilvl="5">
-      <w:startOverride w:val="1"/>
-    </w:lvlOverride>
-    <w:lvlOverride w:ilvl="6">
-      <w:startOverride w:val="1"/>
-    </w:lvlOverride>
-    <w:lvlOverride w:ilvl="7">
-      <w:startOverride w:val="1"/>
-    </w:lvlOverride>
-    <w:lvlOverride w:ilvl="8">
-      <w:startOverride w:val="1"/>
-    </w:lvlOverride>
+    <w:abstractNumId w:val="991"/>
   </w:num>
   <w:num w:numId="1008">
     <w:abstractNumId w:val="99411"/>
@@ -7175,7 +7216,34 @@
     </w:lvlOverride>
   </w:num>
   <w:num w:numId="1009">
-    <w:abstractNumId w:val="991"/>
+    <w:abstractNumId w:val="99411"/>
+    <w:lvlOverride w:ilvl="0">
+      <w:startOverride w:val="1"/>
+    </w:lvlOverride>
+    <w:lvlOverride w:ilvl="1">
+      <w:startOverride w:val="1"/>
+    </w:lvlOverride>
+    <w:lvlOverride w:ilvl="2">
+      <w:startOverride w:val="1"/>
+    </w:lvlOverride>
+    <w:lvlOverride w:ilvl="3">
+      <w:startOverride w:val="1"/>
+    </w:lvlOverride>
+    <w:lvlOverride w:ilvl="4">
+      <w:startOverride w:val="1"/>
+    </w:lvlOverride>
+    <w:lvlOverride w:ilvl="5">
+      <w:startOverride w:val="1"/>
+    </w:lvlOverride>
+    <w:lvlOverride w:ilvl="6">
+      <w:startOverride w:val="1"/>
+    </w:lvlOverride>
+    <w:lvlOverride w:ilvl="7">
+      <w:startOverride w:val="1"/>
+    </w:lvlOverride>
+    <w:lvlOverride w:ilvl="8">
+      <w:startOverride w:val="1"/>
+    </w:lvlOverride>
   </w:num>
   <w:num w:numId="1010">
     <w:abstractNumId w:val="991"/>
@@ -7217,6 +7285,9 @@
     <w:abstractNumId w:val="991"/>
   </w:num>
   <w:num w:numId="1023">
+    <w:abstractNumId w:val="991"/>
+  </w:num>
+  <w:num w:numId="1024">
     <w:abstractNumId w:val="99411"/>
     <w:lvlOverride w:ilvl="0">
       <w:startOverride w:val="1"/>
@@ -7246,9 +7317,6 @@
       <w:startOverride w:val="1"/>
     </w:lvlOverride>
   </w:num>
-  <w:num w:numId="1024">
-    <w:abstractNumId w:val="991"/>
-  </w:num>
   <w:num w:numId="1025">
     <w:abstractNumId w:val="991"/>
   </w:num>
@@ -7256,6 +7324,9 @@
     <w:abstractNumId w:val="991"/>
   </w:num>
   <w:num w:numId="1027">
+    <w:abstractNumId w:val="991"/>
+  </w:num>
+  <w:num w:numId="1028">
     <w:abstractNumId w:val="99411"/>
     <w:lvlOverride w:ilvl="0">
       <w:startOverride w:val="1"/>
@@ -7285,13 +7356,13 @@
       <w:startOverride w:val="1"/>
     </w:lvlOverride>
   </w:num>
-  <w:num w:numId="1028">
-    <w:abstractNumId w:val="991"/>
-  </w:num>
   <w:num w:numId="1029">
     <w:abstractNumId w:val="991"/>
   </w:num>
   <w:num w:numId="1030">
+    <w:abstractNumId w:val="991"/>
+  </w:num>
+  <w:num w:numId="1031">
     <w:abstractNumId w:val="991"/>
   </w:num>
 </w:numbering>

</xml_diff>

<commit_message>
List editor: «Προβολή:» before the counters; clearer bulk-change wording
The owner asked what «Αλλαγή σε όλους τους N που φαίνονται» does. It now
reads «Μαζική αλλαγή: οι N μαθητές που βλέπετε τώρα γίνονται ⭐ / ○ / ⛔»,
and the counters that filter the rows are labelled «Προβολή:». Help,
teachers' manual (rebuilt) and SPEC follow.

Co-Authored-By: Claude Opus 5.5 <noreply@anthropic.com>
Claude-Session: https://claude.ai/code/session_0169rp8ke2vSPvUgMddkhEjx
</commit_message>
<xml_diff>
--- a/docs/Egxeiridio_Ekpaideutikoi.docx
+++ b/docs/Egxeiridio_Ekpaideutikoi.docx
@@ -621,6 +621,22 @@
         <w:t xml:space="preserve"> </w:t>
       </w:r>
       <w:r>
+        <w:t xml:space="preserve">στη γραμμή</w:t>
+      </w:r>
+      <w:r>
+        <w:t xml:space="preserve"> </w:t>
+      </w:r>
+      <w:r>
+        <w:rPr>
+          <w:b/>
+          <w:bCs/>
+        </w:rPr>
+        <w:t xml:space="preserve">«Προβολή»</w:t>
+      </w:r>
+      <w:r>
+        <w:t xml:space="preserve"> </w:t>
+      </w:r>
+      <w:r>
         <w:t xml:space="preserve">πάνω από τη λίστα (</w:t>
       </w:r>
       <w:r>
@@ -703,23 +719,30 @@
         </w:numPr>
       </w:pPr>
       <w:r>
-        <w:t xml:space="preserve">Όταν τα φίλτρα δείχνουν μέρος των μαθητών, εμφανίζεται το πλαίσιο</w:t>
-      </w:r>
-      <w:r>
-        <w:t xml:space="preserve"> </w:t>
-      </w:r>
-      <w:r>
-        <w:rPr>
-          <w:b/>
-          <w:bCs/>
-        </w:rPr>
-        <w:t xml:space="preserve">«Αλλαγή σε όλους τους … που φαίνονται: ⭐ / ○ / ⛔»</w:t>
-      </w:r>
-      <w:r>
-        <w:t xml:space="preserve"> </w:t>
-      </w:r>
-      <w:r>
-        <w:t xml:space="preserve">(π.χ. φίλτρο «Τμήμα Β2» → ⛔ σε όλο το τμήμα). Πριν αλλάξει κάτι, ρωτά.</w:t>
+        <w:rPr>
+          <w:b/>
+          <w:bCs/>
+        </w:rPr>
+        <w:t xml:space="preserve">Μαζική αλλαγή:</w:t>
+      </w:r>
+      <w:r>
+        <w:t xml:space="preserve"> </w:t>
+      </w:r>
+      <w:r>
+        <w:t xml:space="preserve">όταν τα φίλτρα δείχνουν μέρος των μαθητών, εμφανίζεται το πλαίσιο</w:t>
+      </w:r>
+      <w:r>
+        <w:t xml:space="preserve"> </w:t>
+      </w:r>
+      <w:r>
+        <w:rPr>
+          <w:b/>
+          <w:bCs/>
+        </w:rPr>
+        <w:t xml:space="preserve">«Μαζική αλλαγή: οι … μαθητές που βλέπετε τώρα γίνονται ⭐ / ○ / ⛔»</w:t>
+      </w:r>
+      <w:r>
+        <w:t xml:space="preserve">. Αλλάζει με ένα κλικ όλους όσους βλέπετε, π.χ. φίλτρο «Τμήμα Β2» → ⛔ σε όλο το τμήμα. Πριν αλλάξει κάτι, ρωτά.</w:t>
       </w:r>
     </w:p>
     <w:p>

</xml_diff>

<commit_message>
Add allocation verification workbook and lottery/priority in audit log
- Audit log CSV: new columns «Αριθμός κλήρωσης» and «Προτεραιότητα στον
  όμιλο» (teacher's ⭐ / mandatory grade / —).
- New admin export «Επαλήθευση κατανομής (.xlsx)»: cut-offs per club,
  every student's choices with the outcome of each and the rounds,
  round-by-round per club with priorities, and the lottery by number.
  Automatic checks (capacity, exclusions, multi-day, similar clubs,
  dropped clubs vs audit log, stability) rebuild each day's lists from
  the rules instead of reusing allocate.js.
- Random-instance generator moved to a test helper and reused.
- ROADMAP: interactive viewer of the real allocation; docs, help, SPEC.

Co-Authored-By: Claude Opus 5.5 <noreply@anthropic.com>
Claude-Session: https://claude.ai/code/session_01CpCVP2vkz5zM25QbU3BTXj
</commit_message>
<xml_diff>
--- a/docs/Egxeiridio_Ekpaideutikoi.docx
+++ b/docs/Egxeiridio_Ekpaideutikoi.docx
@@ -6217,7 +6217,65 @@
         <w:t xml:space="preserve"> </w:t>
       </w:r>
       <w:r>
-        <w:t xml:space="preserve">κάθε αίτηση, προσωρινή αποδοχή, απόρριψη, εκτόπιση, μεταφορά πολυήμερου ομίλου και αφαίρεση λόγω σύγκρουσης καταγράφεται ανά γύρο. Από αυτό παράγεται η αναφορά κάθε μαθητή που βλέπει ο γονέας.</w:t>
+        <w:t xml:space="preserve">κάθε αίτηση, προσωρινή αποδοχή, απόρριψη, εκτόπιση, μεταφορά πολυήμερου ομίλου και αφαίρεση λόγω σύγκρουσης καταγράφεται ανά γύρο, με τον αριθμό κλήρωσης του μαθητή και την προτεραιότητά του στον όμιλο. Από αυτό παράγεται η αναφορά κάθε μαθητή που βλέπει ο γονέας.</w:t>
+      </w:r>
+    </w:p>
+    <w:p>
+      <w:pPr>
+        <w:pStyle w:val="Compact"/>
+        <w:numPr>
+          <w:ilvl w:val="0"/>
+          <w:numId w:val="1030"/>
+        </w:numPr>
+      </w:pPr>
+      <w:r>
+        <w:rPr>
+          <w:b/>
+          <w:bCs/>
+        </w:rPr>
+        <w:t xml:space="preserve">Επαλήθευση με το χέρι:</w:t>
+      </w:r>
+      <w:r>
+        <w:t xml:space="preserve"> </w:t>
+      </w:r>
+      <w:r>
+        <w:t xml:space="preserve">ο διαχειριστής κατεβάζει το αρχείο «Επαλήθευση κατανομής» (Excel). Η ευστάθεια ελέγχεται χωρίς να ξαναπαιχτούν οι γύροι:</w:t>
+      </w:r>
+    </w:p>
+    <w:p>
+      <w:pPr>
+        <w:pStyle w:val="Compact"/>
+        <w:numPr>
+          <w:ilvl w:val="1"/>
+          <w:numId w:val="1031"/>
+        </w:numPr>
+      </w:pPr>
+      <w:r>
+        <w:t xml:space="preserve">για κάθε όμιλο, η «βάση» (ο τελευταίος που μπήκε) έχει καλύτερη προτεραιότητα από τον πρώτο που έμεινε έξω·</w:t>
+      </w:r>
+    </w:p>
+    <w:p>
+      <w:pPr>
+        <w:pStyle w:val="Compact"/>
+        <w:numPr>
+          <w:ilvl w:val="1"/>
+          <w:numId w:val="1031"/>
+        </w:numPr>
+      </w:pPr>
+      <w:r>
+        <w:t xml:space="preserve">για κάθε μαθητή, κάθε όμιλος που έβαλε πιο ψηλά από αυτόν που πήρε ήταν γεμάτος με μαθητές καλύτερης προτεραιότητας.</w:t>
+      </w:r>
+    </w:p>
+    <w:p>
+      <w:pPr>
+        <w:pStyle w:val="Compact"/>
+        <w:numPr>
+          <w:ilvl w:val="1"/>
+          <w:numId w:val="1031"/>
+        </w:numPr>
+      </w:pPr>
+      <w:r>
+        <w:t xml:space="preserve">Το αρχείο δείχνει και τους γύρους, ανά όμιλο και ανά μαθητή, για όποιον θέλει να ξαναπαίξει την κατανομή με χαρτί και μολύβι. Οι ίδιοι έλεγχοι γίνονται και αυτόματα, ανεξάρτητα από τον κώδικα της κατανομής.</w:t>
       </w:r>
     </w:p>
     <w:p>
@@ -6302,7 +6360,7 @@
         <w:pStyle w:val="Compact"/>
         <w:numPr>
           <w:ilvl w:val="0"/>
-          <w:numId w:val="1031"/>
+          <w:numId w:val="1032"/>
         </w:numPr>
       </w:pPr>
       <w:r>
@@ -6327,7 +6385,7 @@
         <w:pStyle w:val="Compact"/>
         <w:numPr>
           <w:ilvl w:val="0"/>
-          <w:numId w:val="1031"/>
+          <w:numId w:val="1032"/>
         </w:numPr>
       </w:pPr>
       <w:r>
@@ -6352,7 +6410,7 @@
         <w:pStyle w:val="Compact"/>
         <w:numPr>
           <w:ilvl w:val="0"/>
-          <w:numId w:val="1031"/>
+          <w:numId w:val="1032"/>
         </w:numPr>
       </w:pPr>
       <w:r>
@@ -6377,7 +6435,7 @@
         <w:pStyle w:val="Compact"/>
         <w:numPr>
           <w:ilvl w:val="0"/>
-          <w:numId w:val="1031"/>
+          <w:numId w:val="1032"/>
         </w:numPr>
       </w:pPr>
       <w:r>
@@ -6402,7 +6460,7 @@
         <w:pStyle w:val="Compact"/>
         <w:numPr>
           <w:ilvl w:val="0"/>
-          <w:numId w:val="1031"/>
+          <w:numId w:val="1032"/>
         </w:numPr>
       </w:pPr>
       <w:r>
@@ -6427,7 +6485,7 @@
         <w:pStyle w:val="Compact"/>
         <w:numPr>
           <w:ilvl w:val="0"/>
-          <w:numId w:val="1031"/>
+          <w:numId w:val="1032"/>
         </w:numPr>
       </w:pPr>
       <w:r>
@@ -6452,7 +6510,7 @@
         <w:pStyle w:val="Compact"/>
         <w:numPr>
           <w:ilvl w:val="0"/>
-          <w:numId w:val="1031"/>
+          <w:numId w:val="1032"/>
         </w:numPr>
       </w:pPr>
       <w:r>
@@ -6477,7 +6535,7 @@
         <w:pStyle w:val="Compact"/>
         <w:numPr>
           <w:ilvl w:val="0"/>
-          <w:numId w:val="1031"/>
+          <w:numId w:val="1032"/>
         </w:numPr>
       </w:pPr>
       <w:r>
@@ -6502,7 +6560,7 @@
         <w:pStyle w:val="Compact"/>
         <w:numPr>
           <w:ilvl w:val="0"/>
-          <w:numId w:val="1031"/>
+          <w:numId w:val="1032"/>
         </w:numPr>
       </w:pPr>
       <w:r>
@@ -6527,7 +6585,7 @@
         <w:pStyle w:val="Compact"/>
         <w:numPr>
           <w:ilvl w:val="0"/>
-          <w:numId w:val="1031"/>
+          <w:numId w:val="1032"/>
         </w:numPr>
       </w:pPr>
       <w:r>
@@ -6552,7 +6610,7 @@
         <w:pStyle w:val="Compact"/>
         <w:numPr>
           <w:ilvl w:val="0"/>
-          <w:numId w:val="1031"/>
+          <w:numId w:val="1032"/>
         </w:numPr>
       </w:pPr>
       <w:r>
@@ -6577,7 +6635,7 @@
         <w:pStyle w:val="Compact"/>
         <w:numPr>
           <w:ilvl w:val="0"/>
-          <w:numId w:val="1031"/>
+          <w:numId w:val="1032"/>
         </w:numPr>
       </w:pPr>
       <w:r>
@@ -6602,7 +6660,7 @@
         <w:pStyle w:val="Compact"/>
         <w:numPr>
           <w:ilvl w:val="0"/>
-          <w:numId w:val="1031"/>
+          <w:numId w:val="1032"/>
         </w:numPr>
       </w:pPr>
       <w:r>
@@ -6627,7 +6685,7 @@
         <w:pStyle w:val="Compact"/>
         <w:numPr>
           <w:ilvl w:val="0"/>
-          <w:numId w:val="1031"/>
+          <w:numId w:val="1032"/>
         </w:numPr>
       </w:pPr>
       <w:r>
@@ -6652,7 +6710,7 @@
         <w:pStyle w:val="Compact"/>
         <w:numPr>
           <w:ilvl w:val="0"/>
-          <w:numId w:val="1031"/>
+          <w:numId w:val="1032"/>
         </w:numPr>
       </w:pPr>
       <w:r>
@@ -6677,7 +6735,7 @@
         <w:pStyle w:val="Compact"/>
         <w:numPr>
           <w:ilvl w:val="0"/>
-          <w:numId w:val="1031"/>
+          <w:numId w:val="1032"/>
         </w:numPr>
       </w:pPr>
       <w:r>
@@ -6702,7 +6760,7 @@
         <w:pStyle w:val="Compact"/>
         <w:numPr>
           <w:ilvl w:val="0"/>
-          <w:numId w:val="1031"/>
+          <w:numId w:val="1032"/>
         </w:numPr>
       </w:pPr>
       <w:r>
@@ -6730,7 +6788,7 @@
         <w:pStyle w:val="Compact"/>
         <w:numPr>
           <w:ilvl w:val="0"/>
-          <w:numId w:val="1031"/>
+          <w:numId w:val="1032"/>
         </w:numPr>
       </w:pPr>
       <w:r>
@@ -6755,7 +6813,7 @@
         <w:pStyle w:val="Compact"/>
         <w:numPr>
           <w:ilvl w:val="0"/>
-          <w:numId w:val="1031"/>
+          <w:numId w:val="1032"/>
         </w:numPr>
       </w:pPr>
       <w:r>
@@ -6780,7 +6838,7 @@
         <w:pStyle w:val="Compact"/>
         <w:numPr>
           <w:ilvl w:val="0"/>
-          <w:numId w:val="1031"/>
+          <w:numId w:val="1032"/>
         </w:numPr>
       </w:pPr>
       <w:r>
@@ -6805,7 +6863,7 @@
         <w:pStyle w:val="Compact"/>
         <w:numPr>
           <w:ilvl w:val="0"/>
-          <w:numId w:val="1031"/>
+          <w:numId w:val="1032"/>
         </w:numPr>
       </w:pPr>
       <w:r>
@@ -6830,7 +6888,7 @@
         <w:pStyle w:val="Compact"/>
         <w:numPr>
           <w:ilvl w:val="0"/>
-          <w:numId w:val="1031"/>
+          <w:numId w:val="1032"/>
         </w:numPr>
       </w:pPr>
       <w:r>
@@ -6855,7 +6913,7 @@
         <w:pStyle w:val="Compact"/>
         <w:numPr>
           <w:ilvl w:val="0"/>
-          <w:numId w:val="1031"/>
+          <w:numId w:val="1032"/>
         </w:numPr>
       </w:pPr>
       <w:r>
@@ -6880,7 +6938,7 @@
         <w:pStyle w:val="Compact"/>
         <w:numPr>
           <w:ilvl w:val="0"/>
-          <w:numId w:val="1031"/>
+          <w:numId w:val="1032"/>
         </w:numPr>
       </w:pPr>
       <w:r>
@@ -6905,7 +6963,7 @@
         <w:pStyle w:val="Compact"/>
         <w:numPr>
           <w:ilvl w:val="0"/>
-          <w:numId w:val="1031"/>
+          <w:numId w:val="1032"/>
         </w:numPr>
       </w:pPr>
       <w:r>
@@ -6930,7 +6988,7 @@
         <w:pStyle w:val="Compact"/>
         <w:numPr>
           <w:ilvl w:val="0"/>
-          <w:numId w:val="1031"/>
+          <w:numId w:val="1032"/>
         </w:numPr>
       </w:pPr>
       <w:r>
@@ -7480,6 +7538,9 @@
     <w:abstractNumId w:val="991"/>
   </w:num>
   <w:num w:numId="1031">
+    <w:abstractNumId w:val="991"/>
+  </w:num>
+  <w:num w:numId="1032">
     <w:abstractNumId w:val="991"/>
   </w:num>
 </w:numbering>

</xml_diff>

<commit_message>
Cut-off in the student's report; empty a teacher's ⭐ when seats drop
- Student's report (admin and parent): each «Δεν χώρεσε» / «Έχασε τη
  θέση» step adds what the last student admitted had: ⭐, mandatory
  grade, or both lottery numbers. No name or ΑΜ (cutoffNotes()).
- A clubs file giving a club fewer seats than its ⭐ list empties the ⭐.
  ⛔ stay; a closed list keeps its intent (former ⭐ become ○, the rest
  ⛔). The admin gets a warning, a mark in the clubs table and a history
  event. The club's teachers get an email (when mail works) and a notice
  on the club's card until they save the list again.
- Help, manuals (rebuilt), README, SPEC.

Co-Authored-By: Claude Opus 5.5 <noreply@anthropic.com>
Claude-Session: https://claude.ai/code/session_01CpCVP2vkz5zM25QbU3BTXj
</commit_message>
<xml_diff>
--- a/docs/Egxeiridio_Ekpaideutikoi.docx
+++ b/docs/Egxeiridio_Ekpaideutikoi.docx
@@ -768,6 +768,34 @@
       </w:r>
       <w:r>
         <w:t xml:space="preserve">: αφού οι ⭐ δεν ξεπερνούν τις θέσεις, όσοι από αυτούς δηλώσουν τον όμιλο χωρούν όλοι.</w:t>
+      </w:r>
+    </w:p>
+    <w:p>
+      <w:pPr>
+        <w:pStyle w:val="Compact"/>
+        <w:numPr>
+          <w:ilvl w:val="1"/>
+          <w:numId w:val="1003"/>
+        </w:numPr>
+      </w:pPr>
+      <w:r>
+        <w:t xml:space="preserve">Αν ο υπεύθυνος μειώσει αργότερα τις θέσεις κάτω από τους ⭐ σας, οι ⭐</w:t>
+      </w:r>
+      <w:r>
+        <w:t xml:space="preserve"> </w:t>
+      </w:r>
+      <w:r>
+        <w:rPr>
+          <w:b/>
+          <w:bCs/>
+        </w:rPr>
+        <w:t xml:space="preserve">μηδενίζονται</w:t>
+      </w:r>
+      <w:r>
+        <w:t xml:space="preserve"> </w:t>
+      </w:r>
+      <w:r>
+        <w:t xml:space="preserve">και η κάρτα του ομίλου γράφει μήνυμα μέχρι να ορίσετε ξανά τη λίστα και να την αποθηκεύσετε. Οι ⛔ μένουν. Αν η λίστα ήταν κλειστή, όσοι ήταν ⭐ γίνονται ○ (κλήρωση) και όλοι οι άλλοι ⛔.</w:t>
       </w:r>
     </w:p>
     <w:p>

</xml_diff>

<commit_message>
Add «Ακύρωση αλλαγών» for every role and ask before leaving unsaved edits
- Parents: when a declaration exists, «Ακύρωση αλλαγών» brings back the
  saved order of every day and the parent's details; «Μη αποθηκευμένες
  αλλαγές» is shown. Logging out, «Δήλωση για άλλο παιδί» and closing the
  page ask first when the form has unsaved (or unsubmitted) changes.
- Teachers: «Αναίρεση αλλαγών» is renamed «Ακύρωση αλλαγών».
- Admin: settings get «Ακύρωση αλλαγών» and the unsaved note; in
  «Διόρθωση» the cancel and the unsaved note also cover the seats, and
  «Κλείσιμο» asks first; the teacher-list import preview gets «Ακύρωση».
  Changing tab or phase, logging out and leaving ask when there are
  unsaved settings or list edits.
- e2e covers the three cancels and the leave prompts; help, manuals and
  SPEC updated; previews before file uploads go to the ROADMAP.

Co-Authored-By: Claude Opus 5.5 <noreply@anthropic.com>
Claude-Session: https://claude.ai/code/session_017dNztAGzZpDK9mFLgtBaNP
</commit_message>
<xml_diff>
--- a/docs/Egxeiridio_Ekpaideutikoi.docx
+++ b/docs/Egxeiridio_Ekpaideutikoi.docx
@@ -1034,10 +1034,10 @@
           <w:b/>
           <w:bCs/>
         </w:rPr>
-        <w:t xml:space="preserve">«Αναίρεση αλλαγών»</w:t>
-      </w:r>
-      <w:r>
-        <w:t xml:space="preserve">, που γυρίζει στην τελευταία αποθήκευση.</w:t>
+        <w:t xml:space="preserve">«Ακύρωση αλλαγών»</w:t>
+      </w:r>
+      <w:r>
+        <w:t xml:space="preserve">, που γυρίζει στην τελευταία αποθήκευση. Αν πατήσετε «Αποσύνδεση εκπαιδευτικού» ή κλείσετε τη σελίδα χωρίς αποθήκευση, η πλατφόρμα ρωτά πρώτα.</w:t>
       </w:r>
     </w:p>
     <w:p>

</xml_diff>

<commit_message>
Show one tab per club on the teachers' page
A teacher with several clubs saw every club's full student list on one
page (3 clubs x 360 students = 1,080 rows), which made it easy to lose
track of which club was being edited. Now each club has its own tab and
only the chosen club's list is shown. Hidden cards stay in the page, so
unsaved ticks survive a tab switch; their tab is marked with " ●". The
chosen tab is kept across a reload (sessionStorage). One club: no tabs.

Help, teachers' manual (Word/PDF rebuilt), SPEC and e2e updated.

Co-Authored-By: Claude Opus 5.5 <noreply@anthropic.com>
Claude-Session: https://claude.ai/code/session_01MGtHuscWvex8JbpGDJWPuy
</commit_message>
<xml_diff>
--- a/docs/Egxeiridio_Ekpaideutikoi.docx
+++ b/docs/Egxeiridio_Ekpaideutikoi.docx
@@ -425,7 +425,28 @@
         <w:pStyle w:val="FirstParagraph"/>
       </w:pPr>
       <w:r>
-        <w:t xml:space="preserve">Για κάθε όμιλό σας εμφανίζεται μια κάρτα με τις ημέρες, τις τάξεις και τις θέσεις του, και από κάτω οι μαθητές των τάξεων του ομίλου. Κάθε μαθητής έχει τρία κουμπιά:</w:t>
+        <w:t xml:space="preserve">Για κάθε όμιλό σας εμφανίζεται μια κάρτα με τις ημέρες, τις τάξεις και τις θέσεις του, και από κάτω οι μαθητές των τάξεων του ομίλου. Αν έχετε περισσότερους από έναν ομίλους, πάνω από την κάρτα υπάρχει μία</w:t>
+      </w:r>
+      <w:r>
+        <w:t xml:space="preserve"> </w:t>
+      </w:r>
+      <w:r>
+        <w:rPr>
+          <w:b/>
+          <w:bCs/>
+        </w:rPr>
+        <w:t xml:space="preserve">καρτέλα για κάθε όμιλο</w:t>
+      </w:r>
+      <w:r>
+        <w:t xml:space="preserve">: πατήστε το όνομα του ομίλου για να δείτε τη λίστα του. Όμιλος με αλλαγές που δεν έχετε αποθηκεύσει έχει « ●» στην καρτέλα του· οι αλλαγές δεν χάνονται όταν πηγαίνετε σε άλλη καρτέλα.</w:t>
+      </w:r>
+    </w:p>
+    <w:p>
+      <w:pPr>
+        <w:pStyle w:val="BodyText"/>
+      </w:pPr>
+      <w:r>
+        <w:t xml:space="preserve">Κάθε μαθητής έχει τρία κουμπιά:</w:t>
       </w:r>
     </w:p>
     <w:tbl>

</xml_diff>

<commit_message>
Tests and docs for the list editor, opening check and teacher results
- server tests: forced opening (and reopening) with missing seats is
  logged; teachers see their clubs' allocation only once announced,
  without the parents' rankings or the others' names.
- e2e: no «Κλειστή λίστα» with a search, kept with the ⭐ chip alone,
  asked before closing and before saving new ⛔; the opening check lists
  the exclusions; the teacher sees who got in after the announcement.
- Help, teachers' manual (+ Word/PDF), SPEC (decisions of 19/10/2026),
  README.

Co-Authored-By: Claude Opus 5.5 <noreply@anthropic.com>
Claude-Session: https://claude.ai/code/session_01QMQaXT43LSBbUNjXkSg6UG
</commit_message>
<xml_diff>
--- a/docs/Egxeiridio_Ekpaideutikoi.docx
+++ b/docs/Egxeiridio_Ekpaideutikoi.docx
@@ -626,49 +626,81 @@
         </w:numPr>
       </w:pPr>
       <w:r>
-        <w:t xml:space="preserve">Οι</w:t>
-      </w:r>
-      <w:r>
-        <w:t xml:space="preserve"> </w:t>
-      </w:r>
-      <w:r>
-        <w:rPr>
-          <w:b/>
-          <w:bCs/>
-        </w:rPr>
-        <w:t xml:space="preserve">μετρητές</w:t>
-      </w:r>
-      <w:r>
-        <w:t xml:space="preserve"> </w:t>
-      </w:r>
-      <w:r>
-        <w:t xml:space="preserve">στη γραμμή</w:t>
-      </w:r>
-      <w:r>
-        <w:t xml:space="preserve"> </w:t>
-      </w:r>
-      <w:r>
-        <w:rPr>
-          <w:b/>
-          <w:bCs/>
-        </w:rPr>
-        <w:t xml:space="preserve">«Προβολή»</w:t>
-      </w:r>
-      <w:r>
-        <w:t xml:space="preserve"> </w:t>
-      </w:r>
-      <w:r>
-        <w:t xml:space="preserve">πάνω από τη λίστα (</w:t>
-      </w:r>
-      <w:r>
-        <w:rPr>
-          <w:b/>
-          <w:bCs/>
-        </w:rPr>
-        <w:t xml:space="preserve">Όλοι · ⭐ · ○ · ⛔</w:t>
-      </w:r>
-      <w:r>
-        <w:t xml:space="preserve">) δείχνουν πόσους έχετε σε κάθε κατάσταση. Πατώντας έναν βλέπετε μόνο αυτούς (π.χ. «⭐» για όσους έχετε ήδη επιλέξει)· ξαναπατώντας τον, βλέπετε πάλι όλους.</w:t>
+        <w:t xml:space="preserve">Η οθόνη έχει</w:t>
+      </w:r>
+      <w:r>
+        <w:t xml:space="preserve"> </w:t>
+      </w:r>
+      <w:r>
+        <w:rPr>
+          <w:b/>
+          <w:bCs/>
+        </w:rPr>
+        <w:t xml:space="preserve">δύο είδη κουμπιών</w:t>
+      </w:r>
+      <w:r>
+        <w:t xml:space="preserve">: τα</w:t>
+      </w:r>
+      <w:r>
+        <w:t xml:space="preserve"> </w:t>
+      </w:r>
+      <w:r>
+        <w:rPr>
+          <w:b/>
+          <w:bCs/>
+        </w:rPr>
+        <w:t xml:space="preserve">φίλτρα</w:t>
+      </w:r>
+      <w:r>
+        <w:t xml:space="preserve"> </w:t>
+      </w:r>
+      <w:r>
+        <w:t xml:space="preserve">(γκρι, με χωνί, στρογγυλά) αλλάζουν</w:t>
+      </w:r>
+      <w:r>
+        <w:t xml:space="preserve"> </w:t>
+      </w:r>
+      <w:r>
+        <w:rPr>
+          <w:b/>
+          <w:bCs/>
+        </w:rPr>
+        <w:t xml:space="preserve">μόνο ποιους βλέπετε</w:t>
+      </w:r>
+      <w:r>
+        <w:t xml:space="preserve">· οι</w:t>
+      </w:r>
+      <w:r>
+        <w:t xml:space="preserve"> </w:t>
+      </w:r>
+      <w:r>
+        <w:rPr>
+          <w:b/>
+          <w:bCs/>
+        </w:rPr>
+        <w:t xml:space="preserve">αλλαγές</w:t>
+      </w:r>
+      <w:r>
+        <w:t xml:space="preserve"> </w:t>
+      </w:r>
+      <w:r>
+        <w:t xml:space="preserve">(κίτρινο πλαίσιο με ✎, τετράγωνα κουμπιά)</w:t>
+      </w:r>
+      <w:r>
+        <w:t xml:space="preserve"> </w:t>
+      </w:r>
+      <w:r>
+        <w:rPr>
+          <w:b/>
+          <w:bCs/>
+        </w:rPr>
+        <w:t xml:space="preserve">αλλάζουν τη λίστα</w:t>
+      </w:r>
+      <w:r>
+        <w:t xml:space="preserve"> </w:t>
+      </w:r>
+      <w:r>
+        <w:t xml:space="preserve">και ισχύουν με «Αποθήκευση».</w:t>
       </w:r>
     </w:p>
     <w:p>
@@ -680,55 +712,49 @@
         </w:numPr>
       </w:pPr>
       <w:r>
-        <w:t xml:space="preserve">Για να βρείτε γρήγορα μαθητές:</w:t>
-      </w:r>
-      <w:r>
-        <w:t xml:space="preserve"> </w:t>
-      </w:r>
-      <w:r>
-        <w:rPr>
-          <w:b/>
-          <w:bCs/>
-        </w:rPr>
-        <w:t xml:space="preserve">αναζήτηση</w:t>
-      </w:r>
-      <w:r>
-        <w:t xml:space="preserve"> </w:t>
-      </w:r>
-      <w:r>
-        <w:t xml:space="preserve">με όνομα ή ΑΜ, φίλτρο</w:t>
-      </w:r>
-      <w:r>
-        <w:t xml:space="preserve"> </w:t>
-      </w:r>
-      <w:r>
-        <w:rPr>
-          <w:b/>
-          <w:bCs/>
-        </w:rPr>
-        <w:t xml:space="preserve">τάξης</w:t>
-      </w:r>
-      <w:r>
-        <w:t xml:space="preserve"> </w:t>
-      </w:r>
-      <w:r>
-        <w:t xml:space="preserve">και φίλτρο</w:t>
-      </w:r>
-      <w:r>
-        <w:t xml:space="preserve"> </w:t>
-      </w:r>
-      <w:r>
-        <w:rPr>
-          <w:b/>
-          <w:bCs/>
-        </w:rPr>
-        <w:t xml:space="preserve">τμήματος</w:t>
-      </w:r>
-      <w:r>
-        <w:t xml:space="preserve"> </w:t>
-      </w:r>
-      <w:r>
-        <w:t xml:space="preserve">(αν το σχολείο έχει ανεβάσει τα τμήματα).</w:t>
+        <w:t xml:space="preserve">Οι</w:t>
+      </w:r>
+      <w:r>
+        <w:t xml:space="preserve"> </w:t>
+      </w:r>
+      <w:r>
+        <w:rPr>
+          <w:b/>
+          <w:bCs/>
+        </w:rPr>
+        <w:t xml:space="preserve">μετρητές</w:t>
+      </w:r>
+      <w:r>
+        <w:t xml:space="preserve"> </w:t>
+      </w:r>
+      <w:r>
+        <w:t xml:space="preserve">στη γραμμή</w:t>
+      </w:r>
+      <w:r>
+        <w:t xml:space="preserve"> </w:t>
+      </w:r>
+      <w:r>
+        <w:rPr>
+          <w:b/>
+          <w:bCs/>
+        </w:rPr>
+        <w:t xml:space="preserve">«Προβολή»</w:t>
+      </w:r>
+      <w:r>
+        <w:t xml:space="preserve"> </w:t>
+      </w:r>
+      <w:r>
+        <w:t xml:space="preserve">πάνω από τη λίστα (</w:t>
+      </w:r>
+      <w:r>
+        <w:rPr>
+          <w:b/>
+          <w:bCs/>
+        </w:rPr>
+        <w:t xml:space="preserve">Όλοι · ⭐ · ○ · ⛔</w:t>
+      </w:r>
+      <w:r>
+        <w:t xml:space="preserve">) δείχνουν πόσους έχετε σε κάθε κατάσταση. Πατώντας έναν βλέπετε μόνο αυτούς (π.χ. «⭐» για όσους έχετε ήδη επιλέξει)· ξαναπατώντας τον, βλέπετε πάλι όλους.</w:t>
       </w:r>
     </w:p>
     <w:p>
@@ -740,30 +766,55 @@
         </w:numPr>
       </w:pPr>
       <w:r>
-        <w:rPr>
-          <w:b/>
-          <w:bCs/>
-        </w:rPr>
-        <w:t xml:space="preserve">Μαζική αλλαγή:</w:t>
-      </w:r>
-      <w:r>
-        <w:t xml:space="preserve"> </w:t>
-      </w:r>
-      <w:r>
-        <w:t xml:space="preserve">όταν τα φίλτρα δείχνουν μέρος των μαθητών, εμφανίζεται το πλαίσιο</w:t>
-      </w:r>
-      <w:r>
-        <w:t xml:space="preserve"> </w:t>
-      </w:r>
-      <w:r>
-        <w:rPr>
-          <w:b/>
-          <w:bCs/>
-        </w:rPr>
-        <w:t xml:space="preserve">«Μαζική αλλαγή: οι … μαθητές που βλέπετε τώρα γίνονται ⭐ / ○ / ⛔»</w:t>
-      </w:r>
-      <w:r>
-        <w:t xml:space="preserve">. Αλλάζει με ένα κλικ όλους όσους βλέπετε, π.χ. φίλτρο «Τμήμα Β2» → ⛔ σε όλο το τμήμα. Πριν αλλάξει κάτι, ρωτά.</w:t>
+        <w:t xml:space="preserve">Για να βρείτε γρήγορα μαθητές:</w:t>
+      </w:r>
+      <w:r>
+        <w:t xml:space="preserve"> </w:t>
+      </w:r>
+      <w:r>
+        <w:rPr>
+          <w:b/>
+          <w:bCs/>
+        </w:rPr>
+        <w:t xml:space="preserve">αναζήτηση</w:t>
+      </w:r>
+      <w:r>
+        <w:t xml:space="preserve"> </w:t>
+      </w:r>
+      <w:r>
+        <w:t xml:space="preserve">με όνομα ή ΑΜ, φίλτρο</w:t>
+      </w:r>
+      <w:r>
+        <w:t xml:space="preserve"> </w:t>
+      </w:r>
+      <w:r>
+        <w:rPr>
+          <w:b/>
+          <w:bCs/>
+        </w:rPr>
+        <w:t xml:space="preserve">τάξης</w:t>
+      </w:r>
+      <w:r>
+        <w:t xml:space="preserve"> </w:t>
+      </w:r>
+      <w:r>
+        <w:t xml:space="preserve">και φίλτρο</w:t>
+      </w:r>
+      <w:r>
+        <w:t xml:space="preserve"> </w:t>
+      </w:r>
+      <w:r>
+        <w:rPr>
+          <w:b/>
+          <w:bCs/>
+        </w:rPr>
+        <w:t xml:space="preserve">τμήματος</w:t>
+      </w:r>
+      <w:r>
+        <w:t xml:space="preserve"> </w:t>
+      </w:r>
+      <w:r>
+        <w:t xml:space="preserve">(αν το σχολείο έχει ανεβάσει τα τμήματα).</w:t>
       </w:r>
     </w:p>
     <w:p>
@@ -775,20 +826,30 @@
         </w:numPr>
       </w:pPr>
       <w:r>
-        <w:t xml:space="preserve">Η</w:t>
-      </w:r>
-      <w:r>
-        <w:t xml:space="preserve"> </w:t>
-      </w:r>
-      <w:r>
-        <w:rPr>
-          <w:b/>
-          <w:bCs/>
-        </w:rPr>
-        <w:t xml:space="preserve">σειρά δεν έχει σημασία</w:t>
-      </w:r>
-      <w:r>
-        <w:t xml:space="preserve">: αφού οι ⭐ δεν ξεπερνούν τις θέσεις, όσοι από αυτούς δηλώσουν τον όμιλο χωρούν όλοι.</w:t>
+        <w:rPr>
+          <w:b/>
+          <w:bCs/>
+        </w:rPr>
+        <w:t xml:space="preserve">Αλλαγή για όσους βλέπετε:</w:t>
+      </w:r>
+      <w:r>
+        <w:t xml:space="preserve"> </w:t>
+      </w:r>
+      <w:r>
+        <w:t xml:space="preserve">όταν τα φίλτρα δείχνουν μέρος των μαθητών, το κίτρινο πλαίσιο γράφει</w:t>
+      </w:r>
+      <w:r>
+        <w:t xml:space="preserve"> </w:t>
+      </w:r>
+      <w:r>
+        <w:rPr>
+          <w:b/>
+          <w:bCs/>
+        </w:rPr>
+        <w:t xml:space="preserve">«Αλλαγή μόνο για τους … μαθητές που βλέπετε τώρα»</w:t>
+      </w:r>
+      <w:r>
+        <w:t xml:space="preserve">, με τα κουμπιά ⭐ / ○ / ⛔. Αλλάζει με ένα κλικ όλους όσους βλέπετε, π.χ. φίλτρο «Τμήμα Β2» → ⛔ σε όλο το τμήμα. Πριν αλλάξει κάτι, ρωτά.</w:t>
       </w:r>
     </w:p>
     <w:p>
@@ -800,6 +861,31 @@
         </w:numPr>
       </w:pPr>
       <w:r>
+        <w:t xml:space="preserve">Η</w:t>
+      </w:r>
+      <w:r>
+        <w:t xml:space="preserve"> </w:t>
+      </w:r>
+      <w:r>
+        <w:rPr>
+          <w:b/>
+          <w:bCs/>
+        </w:rPr>
+        <w:t xml:space="preserve">σειρά δεν έχει σημασία</w:t>
+      </w:r>
+      <w:r>
+        <w:t xml:space="preserve">: αφού οι ⭐ δεν ξεπερνούν τις θέσεις, όσοι από αυτούς δηλώσουν τον όμιλο χωρούν όλοι.</w:t>
+      </w:r>
+    </w:p>
+    <w:p>
+      <w:pPr>
+        <w:pStyle w:val="Compact"/>
+        <w:numPr>
+          <w:ilvl w:val="1"/>
+          <w:numId w:val="1003"/>
+        </w:numPr>
+      </w:pPr>
+      <w:r>
         <w:t xml:space="preserve">Αν ο υπεύθυνος μειώσει αργότερα τις θέσεις κάτω από τους ⭐ σας, οι ⭐</w:t>
       </w:r>
       <w:r>
@@ -941,33 +1027,49 @@
         </w:numPr>
       </w:pPr>
       <w:r>
-        <w:t xml:space="preserve">Συντομεύσεις:</w:t>
-      </w:r>
-      <w:r>
-        <w:t xml:space="preserve"> </w:t>
-      </w:r>
-      <w:r>
-        <w:rPr>
-          <w:b/>
-          <w:bCs/>
-        </w:rPr>
-        <w:t xml:space="preserve">«Μόνο οι ⭐ — οι άλλοι ⛔»</w:t>
-      </w:r>
-      <w:r>
-        <w:t xml:space="preserve"> </w:t>
-      </w:r>
-      <w:r>
-        <w:t xml:space="preserve">κάνει τη λίστα κλειστή με ένα κλικ.</w:t>
-      </w:r>
-      <w:r>
-        <w:t xml:space="preserve"> </w:t>
-      </w:r>
-      <w:r>
-        <w:rPr>
-          <w:b/>
-          <w:bCs/>
-        </w:rPr>
-        <w:t xml:space="preserve">«Όλοι οι μη αποκλεισμένοι → ⭐»</w:t>
+        <w:t xml:space="preserve">Συντομεύσεις στο κίτρινο πλαίσιο</w:t>
+      </w:r>
+      <w:r>
+        <w:t xml:space="preserve"> </w:t>
+      </w:r>
+      <w:r>
+        <w:rPr>
+          <w:b/>
+          <w:bCs/>
+        </w:rPr>
+        <w:t xml:space="preserve">«Αλλαγή σε όλη τη λίστα»</w:t>
+      </w:r>
+      <w:r>
+        <w:t xml:space="preserve"> </w:t>
+      </w:r>
+      <w:r>
+        <w:t xml:space="preserve">(χωρίς φίλτρο):</w:t>
+      </w:r>
+      <w:r>
+        <w:t xml:space="preserve"> </w:t>
+      </w:r>
+      <w:r>
+        <w:rPr>
+          <w:b/>
+          <w:bCs/>
+        </w:rPr>
+        <w:t xml:space="preserve">«🔒 Κλειστή λίστα: μόνο οι ⭐»</w:t>
+      </w:r>
+      <w:r>
+        <w:t xml:space="preserve"> </w:t>
+      </w:r>
+      <w:r>
+        <w:t xml:space="preserve">κάνει τη λίστα κλειστή με ένα κλικ, αφού ρωτήσει. Εμφανίζεται και όταν βλέπετε μόνο τους ⭐ (μετρητής «⭐»), όχι όμως με αναζήτηση ή άλλο φίλτρο.</w:t>
+      </w:r>
+      <w:r>
+        <w:t xml:space="preserve"> </w:t>
+      </w:r>
+      <w:r>
+        <w:rPr>
+          <w:b/>
+          <w:bCs/>
+        </w:rPr>
+        <w:t xml:space="preserve">«⭐ σε όλους τους μη αποκλεισμένους»</w:t>
       </w:r>
       <w:r>
         <w:t xml:space="preserve"> </w:t>
@@ -983,7 +1085,7 @@
           <w:b/>
           <w:bCs/>
         </w:rPr>
-        <w:t xml:space="preserve">«Καθαρισμός: όλοι ○»</w:t>
+        <w:t xml:space="preserve">«○ Καθαρισμός: όλοι ουδέτεροι»</w:t>
       </w:r>
       <w:r>
         <w:t xml:space="preserve"> </w:t>
@@ -1045,7 +1147,7 @@
         <w:t xml:space="preserve"> </w:t>
       </w:r>
       <w:r>
-        <w:t xml:space="preserve">όμιλο ξεχωριστά. Η γραμμή με τον τύπο, τους μετρητές και το «Αποθήκευση» μένει στην οθόνη καθώς κυλάτε τη λίστα. Όσο δεν έχετε αποθηκεύσει, γράφει «Μη αποθηκευμένες αλλαγές» και εμφανίζεται το</w:t>
+        <w:t xml:space="preserve">όμιλο ξεχωριστά. Αν η λίστα γίνεται κλειστή ή βάλατε νέους ⛔, η πλατφόρμα ρωτά πρώτα, δείχνοντας πόσοι μαθητές δεν θα βλέπουν τον όμιλο. Η γραμμή με τον τύπο, τους μετρητές και το «Αποθήκευση» μένει στην οθόνη καθώς κυλάτε τη λίστα. Όσο δεν έχετε αποθηκεύσει, γράφει «Μη αποθηκευμένες αλλαγές» και εμφανίζεται το</w:t>
       </w:r>
       <w:r>
         <w:t xml:space="preserve"> </w:t>
@@ -1449,7 +1551,121 @@
         <w:pStyle w:val="FirstParagraph"/>
       </w:pPr>
       <w:r>
-        <w:t xml:space="preserve">Η πλατφόρμα δεν δείχνει τα αποτελέσματα στους εκπαιδευτικούς. Τη</w:t>
+        <w:t xml:space="preserve">Όταν ο υπεύθυνος</w:t>
+      </w:r>
+      <w:r>
+        <w:t xml:space="preserve"> </w:t>
+      </w:r>
+      <w:r>
+        <w:rPr>
+          <w:b/>
+          <w:bCs/>
+        </w:rPr>
+        <w:t xml:space="preserve">ανακοινώσει</w:t>
+      </w:r>
+      <w:r>
+        <w:t xml:space="preserve"> </w:t>
+      </w:r>
+      <w:r>
+        <w:t xml:space="preserve">την κατανομή, συνδεθείτε ξανά: στην κάρτα κάθε ομίλου σας εμφανίζεται</w:t>
+      </w:r>
+      <w:r>
+        <w:t xml:space="preserve"> </w:t>
+      </w:r>
+      <w:r>
+        <w:rPr>
+          <w:b/>
+          <w:bCs/>
+        </w:rPr>
+        <w:t xml:space="preserve">«Η κατανομή του ομίλου»</w:t>
+      </w:r>
+      <w:r>
+        <w:t xml:space="preserve">.</w:t>
+      </w:r>
+    </w:p>
+    <w:p>
+      <w:pPr>
+        <w:pStyle w:val="Compact"/>
+        <w:numPr>
+          <w:ilvl w:val="0"/>
+          <w:numId w:val="1007"/>
+        </w:numPr>
+      </w:pPr>
+      <w:r>
+        <w:t xml:space="preserve">Πόσοι τον ζήτησαν, για πόσες θέσεις, πόσοι μπήκαν και πόσοι δεν χώρεσαν.</w:t>
+      </w:r>
+    </w:p>
+    <w:p>
+      <w:pPr>
+        <w:pStyle w:val="Compact"/>
+        <w:numPr>
+          <w:ilvl w:val="0"/>
+          <w:numId w:val="1007"/>
+        </w:numPr>
+      </w:pPr>
+      <w:r>
+        <w:t xml:space="preserve">Ποιοι μαθητές μπήκαν και</w:t>
+      </w:r>
+      <w:r>
+        <w:t xml:space="preserve"> </w:t>
+      </w:r>
+      <w:r>
+        <w:rPr>
+          <w:b/>
+          <w:bCs/>
+        </w:rPr>
+        <w:t xml:space="preserve">πώς</w:t>
+      </w:r>
+      <w:r>
+        <w:t xml:space="preserve">: ⭐ από τη λίστα σας, τάξη με υποχρεωτική ένταξη, κλήρωση (με τον αριθμό κλήρωσης· μικρότερος προηγείται) ή «Υπήρχε θέση», όταν ο όμιλος δεν γέμισε.</w:t>
+      </w:r>
+    </w:p>
+    <w:p>
+      <w:pPr>
+        <w:pStyle w:val="Compact"/>
+        <w:numPr>
+          <w:ilvl w:val="0"/>
+          <w:numId w:val="1007"/>
+        </w:numPr>
+      </w:pPr>
+      <w:r>
+        <w:t xml:space="preserve">Για όσους</w:t>
+      </w:r>
+      <w:r>
+        <w:t xml:space="preserve"> </w:t>
+      </w:r>
+      <w:r>
+        <w:rPr>
+          <w:b/>
+          <w:bCs/>
+        </w:rPr>
+        <w:t xml:space="preserve">δεν</w:t>
+      </w:r>
+      <w:r>
+        <w:t xml:space="preserve"> </w:t>
+      </w:r>
+      <w:r>
+        <w:t xml:space="preserve">μπήκαν βλέπετε μόνο τον αριθμό τους. Οι δηλώσεις των γονέων (η σειρά των ομίλων τους) δεν εμφανίζονται.</w:t>
+      </w:r>
+    </w:p>
+    <w:p>
+      <w:pPr>
+        <w:pStyle w:val="Compact"/>
+        <w:numPr>
+          <w:ilvl w:val="0"/>
+          <w:numId w:val="1007"/>
+        </w:numPr>
+      </w:pPr>
+      <w:r>
+        <w:t xml:space="preserve">Η λίστα σας μένει κλειδωμένη, στο «Η λίστα σας (κλειδωμένη)» κάτω από τον πίνακα.</w:t>
+      </w:r>
+    </w:p>
+    <w:p>
+      <w:pPr>
+        <w:pStyle w:val="FirstParagraph"/>
+      </w:pPr>
+      <w:r>
+        <w:t xml:space="preserve">Τη</w:t>
       </w:r>
       <w:r>
         <w:t xml:space="preserve"> </w:t>
@@ -1465,7 +1681,7 @@
         <w:t xml:space="preserve"> </w:t>
       </w:r>
       <w:r>
-        <w:t xml:space="preserve">του ομίλου σας (ανά ημέρα) θα σας τη δώσει ο υπεύθυνος των ομίλων — η πλατφόρμα την εξάγει σε Excel.</w:t>
+        <w:t xml:space="preserve">ανά ημέρα, σε Excel, μπορεί επίσης να σας τη δώσει ο υπεύθυνος των ομίλων.</w:t>
       </w:r>
     </w:p>
     <w:p>
@@ -1511,7 +1727,7 @@
         <w:pStyle w:val="Compact"/>
         <w:numPr>
           <w:ilvl w:val="0"/>
-          <w:numId w:val="1007"/>
+          <w:numId w:val="1008"/>
         </w:numPr>
       </w:pPr>
       <w:r>
@@ -1539,7 +1755,7 @@
         <w:pStyle w:val="Compact"/>
         <w:numPr>
           <w:ilvl w:val="0"/>
-          <w:numId w:val="1007"/>
+          <w:numId w:val="1008"/>
         </w:numPr>
       </w:pPr>
       <w:r>
@@ -2091,7 +2307,7 @@
         <w:pStyle w:val="Compact"/>
         <w:numPr>
           <w:ilvl w:val="0"/>
-          <w:numId w:val="1008"/>
+          <w:numId w:val="1009"/>
         </w:numPr>
       </w:pPr>
       <w:r>
@@ -2119,7 +2335,7 @@
         <w:pStyle w:val="Compact"/>
         <w:numPr>
           <w:ilvl w:val="0"/>
-          <w:numId w:val="1008"/>
+          <w:numId w:val="1009"/>
         </w:numPr>
       </w:pPr>
       <w:r>
@@ -2147,7 +2363,7 @@
         <w:pStyle w:val="Compact"/>
         <w:numPr>
           <w:ilvl w:val="0"/>
-          <w:numId w:val="1008"/>
+          <w:numId w:val="1009"/>
         </w:numPr>
       </w:pPr>
       <w:r>
@@ -2288,7 +2504,7 @@
         <w:pStyle w:val="Compact"/>
         <w:numPr>
           <w:ilvl w:val="0"/>
-          <w:numId w:val="1009"/>
+          <w:numId w:val="1010"/>
         </w:numPr>
       </w:pPr>
       <w:r>
@@ -2310,7 +2526,7 @@
         <w:pStyle w:val="Compact"/>
         <w:numPr>
           <w:ilvl w:val="0"/>
-          <w:numId w:val="1009"/>
+          <w:numId w:val="1010"/>
         </w:numPr>
       </w:pPr>
       <w:r>
@@ -2332,7 +2548,7 @@
         <w:pStyle w:val="Compact"/>
         <w:numPr>
           <w:ilvl w:val="0"/>
-          <w:numId w:val="1009"/>
+          <w:numId w:val="1010"/>
         </w:numPr>
       </w:pPr>
       <w:r>
@@ -2712,7 +2928,7 @@
         <w:pStyle w:val="Compact"/>
         <w:numPr>
           <w:ilvl w:val="0"/>
-          <w:numId w:val="1010"/>
+          <w:numId w:val="1011"/>
         </w:numPr>
       </w:pPr>
       <w:r>
@@ -2734,7 +2950,7 @@
         <w:pStyle w:val="Compact"/>
         <w:numPr>
           <w:ilvl w:val="0"/>
-          <w:numId w:val="1010"/>
+          <w:numId w:val="1011"/>
         </w:numPr>
       </w:pPr>
       <w:r>
@@ -2756,7 +2972,7 @@
         <w:pStyle w:val="Compact"/>
         <w:numPr>
           <w:ilvl w:val="0"/>
-          <w:numId w:val="1010"/>
+          <w:numId w:val="1011"/>
         </w:numPr>
       </w:pPr>
       <w:r>
@@ -3280,7 +3496,7 @@
         <w:pStyle w:val="Compact"/>
         <w:numPr>
           <w:ilvl w:val="0"/>
-          <w:numId w:val="1011"/>
+          <w:numId w:val="1012"/>
         </w:numPr>
       </w:pPr>
       <w:r>
@@ -3305,7 +3521,7 @@
         <w:pStyle w:val="Compact"/>
         <w:numPr>
           <w:ilvl w:val="0"/>
-          <w:numId w:val="1011"/>
+          <w:numId w:val="1012"/>
         </w:numPr>
       </w:pPr>
       <w:r>
@@ -3348,7 +3564,7 @@
         <w:pStyle w:val="Compact"/>
         <w:numPr>
           <w:ilvl w:val="0"/>
-          <w:numId w:val="1012"/>
+          <w:numId w:val="1013"/>
         </w:numPr>
       </w:pPr>
       <w:r>
@@ -3383,7 +3599,7 @@
         <w:pStyle w:val="Compact"/>
         <w:numPr>
           <w:ilvl w:val="0"/>
-          <w:numId w:val="1012"/>
+          <w:numId w:val="1013"/>
         </w:numPr>
       </w:pPr>
       <w:r>
@@ -3426,7 +3642,7 @@
         <w:pStyle w:val="Compact"/>
         <w:numPr>
           <w:ilvl w:val="0"/>
-          <w:numId w:val="1013"/>
+          <w:numId w:val="1014"/>
         </w:numPr>
       </w:pPr>
       <w:r>
@@ -3466,7 +3682,7 @@
         <w:pStyle w:val="Compact"/>
         <w:numPr>
           <w:ilvl w:val="0"/>
-          <w:numId w:val="1014"/>
+          <w:numId w:val="1015"/>
         </w:numPr>
       </w:pPr>
       <w:r>
@@ -3503,7 +3719,7 @@
         <w:pStyle w:val="Compact"/>
         <w:numPr>
           <w:ilvl w:val="0"/>
-          <w:numId w:val="1015"/>
+          <w:numId w:val="1016"/>
         </w:numPr>
       </w:pPr>
       <w:r>
@@ -3773,7 +3989,7 @@
         <w:pStyle w:val="Compact"/>
         <w:numPr>
           <w:ilvl w:val="0"/>
-          <w:numId w:val="1016"/>
+          <w:numId w:val="1017"/>
         </w:numPr>
       </w:pPr>
       <w:r>
@@ -3811,7 +4027,7 @@
         <w:pStyle w:val="Compact"/>
         <w:numPr>
           <w:ilvl w:val="0"/>
-          <w:numId w:val="1016"/>
+          <w:numId w:val="1017"/>
         </w:numPr>
       </w:pPr>
       <w:r>
@@ -3833,7 +4049,7 @@
         <w:pStyle w:val="Compact"/>
         <w:numPr>
           <w:ilvl w:val="0"/>
-          <w:numId w:val="1016"/>
+          <w:numId w:val="1017"/>
         </w:numPr>
       </w:pPr>
       <w:r>
@@ -3855,7 +4071,7 @@
         <w:pStyle w:val="Compact"/>
         <w:numPr>
           <w:ilvl w:val="0"/>
-          <w:numId w:val="1016"/>
+          <w:numId w:val="1017"/>
         </w:numPr>
       </w:pPr>
       <w:r>
@@ -3877,7 +4093,7 @@
         <w:pStyle w:val="Compact"/>
         <w:numPr>
           <w:ilvl w:val="0"/>
-          <w:numId w:val="1016"/>
+          <w:numId w:val="1017"/>
         </w:numPr>
       </w:pPr>
       <w:r>
@@ -3909,7 +4125,7 @@
         <w:pStyle w:val="Compact"/>
         <w:numPr>
           <w:ilvl w:val="0"/>
-          <w:numId w:val="1017"/>
+          <w:numId w:val="1018"/>
         </w:numPr>
       </w:pPr>
       <w:r>
@@ -3934,7 +4150,7 @@
         <w:pStyle w:val="Compact"/>
         <w:numPr>
           <w:ilvl w:val="0"/>
-          <w:numId w:val="1017"/>
+          <w:numId w:val="1018"/>
         </w:numPr>
       </w:pPr>
       <w:r>
@@ -3993,7 +4209,7 @@
         <w:pStyle w:val="Compact"/>
         <w:numPr>
           <w:ilvl w:val="0"/>
-          <w:numId w:val="1018"/>
+          <w:numId w:val="1019"/>
         </w:numPr>
       </w:pPr>
       <w:r>
@@ -4021,7 +4237,7 @@
         <w:pStyle w:val="Compact"/>
         <w:numPr>
           <w:ilvl w:val="0"/>
-          <w:numId w:val="1018"/>
+          <w:numId w:val="1019"/>
         </w:numPr>
       </w:pPr>
       <w:r>
@@ -4033,7 +4249,7 @@
         <w:pStyle w:val="Compact"/>
         <w:numPr>
           <w:ilvl w:val="0"/>
-          <w:numId w:val="1018"/>
+          <w:numId w:val="1019"/>
         </w:numPr>
       </w:pPr>
       <w:r>
@@ -4121,7 +4337,7 @@
         <w:pStyle w:val="Compact"/>
         <w:numPr>
           <w:ilvl w:val="0"/>
-          <w:numId w:val="1019"/>
+          <w:numId w:val="1020"/>
         </w:numPr>
       </w:pPr>
       <w:r>
@@ -4149,7 +4365,7 @@
         <w:pStyle w:val="Compact"/>
         <w:numPr>
           <w:ilvl w:val="0"/>
-          <w:numId w:val="1019"/>
+          <w:numId w:val="1020"/>
         </w:numPr>
       </w:pPr>
       <w:r>
@@ -4177,7 +4393,7 @@
         <w:pStyle w:val="Compact"/>
         <w:numPr>
           <w:ilvl w:val="0"/>
-          <w:numId w:val="1019"/>
+          <w:numId w:val="1020"/>
         </w:numPr>
       </w:pPr>
       <w:r>
@@ -4207,7 +4423,7 @@
         <w:pStyle w:val="Compact"/>
         <w:numPr>
           <w:ilvl w:val="0"/>
-          <w:numId w:val="1020"/>
+          <w:numId w:val="1021"/>
         </w:numPr>
       </w:pPr>
       <w:r>
@@ -4248,7 +4464,7 @@
         <w:pStyle w:val="Compact"/>
         <w:numPr>
           <w:ilvl w:val="0"/>
-          <w:numId w:val="1020"/>
+          <w:numId w:val="1021"/>
         </w:numPr>
       </w:pPr>
       <w:r>
@@ -4260,7 +4476,7 @@
         <w:pStyle w:val="Compact"/>
         <w:numPr>
           <w:ilvl w:val="0"/>
-          <w:numId w:val="1020"/>
+          <w:numId w:val="1021"/>
         </w:numPr>
       </w:pPr>
       <w:r>
@@ -4272,7 +4488,7 @@
         <w:pStyle w:val="Compact"/>
         <w:numPr>
           <w:ilvl w:val="0"/>
-          <w:numId w:val="1020"/>
+          <w:numId w:val="1021"/>
         </w:numPr>
       </w:pPr>
       <w:r>
@@ -4335,7 +4551,7 @@
         <w:pStyle w:val="Compact"/>
         <w:numPr>
           <w:ilvl w:val="0"/>
-          <w:numId w:val="1021"/>
+          <w:numId w:val="1022"/>
         </w:numPr>
       </w:pPr>
       <w:r>
@@ -4360,7 +4576,7 @@
         <w:pStyle w:val="Compact"/>
         <w:numPr>
           <w:ilvl w:val="0"/>
-          <w:numId w:val="1021"/>
+          <w:numId w:val="1022"/>
         </w:numPr>
       </w:pPr>
       <w:r>
@@ -4655,7 +4871,7 @@
         <w:pStyle w:val="Compact"/>
         <w:numPr>
           <w:ilvl w:val="0"/>
-          <w:numId w:val="1022"/>
+          <w:numId w:val="1023"/>
         </w:numPr>
       </w:pPr>
       <w:r>
@@ -4703,7 +4919,7 @@
         <w:pStyle w:val="Compact"/>
         <w:numPr>
           <w:ilvl w:val="0"/>
-          <w:numId w:val="1022"/>
+          <w:numId w:val="1023"/>
         </w:numPr>
       </w:pPr>
       <w:r>
@@ -4731,7 +4947,7 @@
         <w:pStyle w:val="Compact"/>
         <w:numPr>
           <w:ilvl w:val="0"/>
-          <w:numId w:val="1022"/>
+          <w:numId w:val="1023"/>
         </w:numPr>
       </w:pPr>
       <w:r>
@@ -4759,7 +4975,7 @@
         <w:pStyle w:val="Compact"/>
         <w:numPr>
           <w:ilvl w:val="0"/>
-          <w:numId w:val="1022"/>
+          <w:numId w:val="1023"/>
         </w:numPr>
       </w:pPr>
       <w:r>
@@ -4814,7 +5030,7 @@
         <w:pStyle w:val="Compact"/>
         <w:numPr>
           <w:ilvl w:val="0"/>
-          <w:numId w:val="1023"/>
+          <w:numId w:val="1024"/>
         </w:numPr>
       </w:pPr>
       <w:r>
@@ -4836,7 +5052,7 @@
         <w:pStyle w:val="Compact"/>
         <w:numPr>
           <w:ilvl w:val="0"/>
-          <w:numId w:val="1023"/>
+          <w:numId w:val="1024"/>
         </w:numPr>
       </w:pPr>
       <w:r>
@@ -4858,7 +5074,7 @@
         <w:pStyle w:val="Compact"/>
         <w:numPr>
           <w:ilvl w:val="0"/>
-          <w:numId w:val="1023"/>
+          <w:numId w:val="1024"/>
         </w:numPr>
       </w:pPr>
       <w:r>
@@ -4975,7 +5191,7 @@
         <w:pStyle w:val="Compact"/>
         <w:numPr>
           <w:ilvl w:val="0"/>
-          <w:numId w:val="1024"/>
+          <w:numId w:val="1025"/>
         </w:numPr>
       </w:pPr>
       <w:r>
@@ -5013,7 +5229,7 @@
         <w:pStyle w:val="Compact"/>
         <w:numPr>
           <w:ilvl w:val="0"/>
-          <w:numId w:val="1024"/>
+          <w:numId w:val="1025"/>
         </w:numPr>
       </w:pPr>
       <w:r>
@@ -5051,7 +5267,7 @@
         <w:pStyle w:val="Compact"/>
         <w:numPr>
           <w:ilvl w:val="0"/>
-          <w:numId w:val="1024"/>
+          <w:numId w:val="1025"/>
         </w:numPr>
       </w:pPr>
       <w:r>
@@ -5071,7 +5287,7 @@
         <w:pStyle w:val="Compact"/>
         <w:numPr>
           <w:ilvl w:val="0"/>
-          <w:numId w:val="1025"/>
+          <w:numId w:val="1026"/>
         </w:numPr>
       </w:pPr>
       <w:r>
@@ -5093,7 +5309,7 @@
         <w:pStyle w:val="Compact"/>
         <w:numPr>
           <w:ilvl w:val="0"/>
-          <w:numId w:val="1025"/>
+          <w:numId w:val="1026"/>
         </w:numPr>
       </w:pPr>
       <w:r>
@@ -5131,7 +5347,7 @@
         <w:pStyle w:val="Compact"/>
         <w:numPr>
           <w:ilvl w:val="0"/>
-          <w:numId w:val="1025"/>
+          <w:numId w:val="1026"/>
         </w:numPr>
       </w:pPr>
       <w:r>
@@ -5153,7 +5369,7 @@
         <w:pStyle w:val="Compact"/>
         <w:numPr>
           <w:ilvl w:val="0"/>
-          <w:numId w:val="1025"/>
+          <w:numId w:val="1026"/>
         </w:numPr>
       </w:pPr>
       <w:r>
@@ -5175,7 +5391,7 @@
         <w:pStyle w:val="Compact"/>
         <w:numPr>
           <w:ilvl w:val="0"/>
-          <w:numId w:val="1025"/>
+          <w:numId w:val="1026"/>
         </w:numPr>
       </w:pPr>
       <w:r>
@@ -5597,7 +5813,7 @@
         <w:pStyle w:val="Compact"/>
         <w:numPr>
           <w:ilvl w:val="0"/>
-          <w:numId w:val="1026"/>
+          <w:numId w:val="1027"/>
         </w:numPr>
       </w:pPr>
       <w:r>
@@ -5625,7 +5841,7 @@
         <w:pStyle w:val="Compact"/>
         <w:numPr>
           <w:ilvl w:val="0"/>
-          <w:numId w:val="1026"/>
+          <w:numId w:val="1027"/>
         </w:numPr>
       </w:pPr>
       <w:r>
@@ -5650,7 +5866,7 @@
         <w:pStyle w:val="Compact"/>
         <w:numPr>
           <w:ilvl w:val="0"/>
-          <w:numId w:val="1026"/>
+          <w:numId w:val="1027"/>
         </w:numPr>
       </w:pPr>
       <w:r>
@@ -5856,7 +6072,7 @@
         <w:pStyle w:val="Compact"/>
         <w:numPr>
           <w:ilvl w:val="0"/>
-          <w:numId w:val="1027"/>
+          <w:numId w:val="1028"/>
         </w:numPr>
       </w:pPr>
       <w:r>
@@ -5878,7 +6094,7 @@
         <w:pStyle w:val="Compact"/>
         <w:numPr>
           <w:ilvl w:val="0"/>
-          <w:numId w:val="1027"/>
+          <w:numId w:val="1028"/>
         </w:numPr>
       </w:pPr>
       <w:r>
@@ -5903,7 +6119,7 @@
         <w:pStyle w:val="Compact"/>
         <w:numPr>
           <w:ilvl w:val="0"/>
-          <w:numId w:val="1027"/>
+          <w:numId w:val="1028"/>
         </w:numPr>
       </w:pPr>
       <w:r>
@@ -5954,7 +6170,7 @@
         <w:pStyle w:val="Compact"/>
         <w:numPr>
           <w:ilvl w:val="0"/>
-          <w:numId w:val="1027"/>
+          <w:numId w:val="1028"/>
         </w:numPr>
       </w:pPr>
       <w:r>
@@ -6060,7 +6276,7 @@
         <w:pStyle w:val="Compact"/>
         <w:numPr>
           <w:ilvl w:val="0"/>
-          <w:numId w:val="1028"/>
+          <w:numId w:val="1029"/>
         </w:numPr>
       </w:pPr>
       <w:r>
@@ -6072,7 +6288,7 @@
         <w:pStyle w:val="Compact"/>
         <w:numPr>
           <w:ilvl w:val="0"/>
-          <w:numId w:val="1028"/>
+          <w:numId w:val="1029"/>
         </w:numPr>
       </w:pPr>
       <w:r>
@@ -6100,7 +6316,7 @@
         <w:pStyle w:val="Compact"/>
         <w:numPr>
           <w:ilvl w:val="0"/>
-          <w:numId w:val="1028"/>
+          <w:numId w:val="1029"/>
         </w:numPr>
       </w:pPr>
       <w:r>
@@ -6112,7 +6328,7 @@
         <w:pStyle w:val="Compact"/>
         <w:numPr>
           <w:ilvl w:val="0"/>
-          <w:numId w:val="1028"/>
+          <w:numId w:val="1029"/>
         </w:numPr>
       </w:pPr>
       <w:r>
@@ -6124,7 +6340,7 @@
         <w:pStyle w:val="Compact"/>
         <w:numPr>
           <w:ilvl w:val="0"/>
-          <w:numId w:val="1028"/>
+          <w:numId w:val="1029"/>
         </w:numPr>
       </w:pPr>
       <w:r>
@@ -6154,7 +6370,7 @@
         <w:pStyle w:val="Compact"/>
         <w:numPr>
           <w:ilvl w:val="0"/>
-          <w:numId w:val="1029"/>
+          <w:numId w:val="1030"/>
         </w:numPr>
       </w:pPr>
       <w:r>
@@ -6182,7 +6398,7 @@
         <w:pStyle w:val="Compact"/>
         <w:numPr>
           <w:ilvl w:val="0"/>
-          <w:numId w:val="1029"/>
+          <w:numId w:val="1030"/>
         </w:numPr>
       </w:pPr>
       <w:r>
@@ -6210,7 +6426,7 @@
         <w:pStyle w:val="Compact"/>
         <w:numPr>
           <w:ilvl w:val="0"/>
-          <w:numId w:val="1029"/>
+          <w:numId w:val="1030"/>
         </w:numPr>
       </w:pPr>
       <w:r>
@@ -6252,7 +6468,7 @@
         <w:pStyle w:val="Compact"/>
         <w:numPr>
           <w:ilvl w:val="0"/>
-          <w:numId w:val="1030"/>
+          <w:numId w:val="1031"/>
         </w:numPr>
       </w:pPr>
       <w:r>
@@ -6274,7 +6490,7 @@
         <w:pStyle w:val="Compact"/>
         <w:numPr>
           <w:ilvl w:val="0"/>
-          <w:numId w:val="1030"/>
+          <w:numId w:val="1031"/>
         </w:numPr>
       </w:pPr>
       <w:r>
@@ -6296,81 +6512,81 @@
         <w:pStyle w:val="Compact"/>
         <w:numPr>
           <w:ilvl w:val="1"/>
+          <w:numId w:val="1032"/>
+        </w:numPr>
+      </w:pPr>
+      <w:r>
+        <w:t xml:space="preserve">για κάθε όμιλο, η «βάση» (ο τελευταίος που μπήκε) έχει καλύτερη προτεραιότητα από τον πρώτο που έμεινε έξω·</w:t>
+      </w:r>
+    </w:p>
+    <w:p>
+      <w:pPr>
+        <w:pStyle w:val="Compact"/>
+        <w:numPr>
+          <w:ilvl w:val="1"/>
+          <w:numId w:val="1032"/>
+        </w:numPr>
+      </w:pPr>
+      <w:r>
+        <w:t xml:space="preserve">για κάθε μαθητή, κάθε όμιλος που έβαλε πιο ψηλά από αυτόν που πήρε ήταν γεμάτος με μαθητές καλύτερης προτεραιότητας.</w:t>
+      </w:r>
+    </w:p>
+    <w:p>
+      <w:pPr>
+        <w:pStyle w:val="Compact"/>
+        <w:numPr>
+          <w:ilvl w:val="1"/>
+          <w:numId w:val="1032"/>
+        </w:numPr>
+      </w:pPr>
+      <w:r>
+        <w:t xml:space="preserve">Το αρχείο δείχνει και τους γύρους, ανά όμιλο και ανά μαθητή, για όποιον θέλει να ξαναπαίξει την κατανομή με χαρτί και μολύβι. Οι ίδιοι έλεγχοι γίνονται και αυτόματα, ανεξάρτητα από τον κώδικα της κατανομής.</w:t>
+      </w:r>
+    </w:p>
+    <w:p>
+      <w:pPr>
+        <w:pStyle w:val="Compact"/>
+        <w:numPr>
+          <w:ilvl w:val="0"/>
           <w:numId w:val="1031"/>
         </w:numPr>
       </w:pPr>
       <w:r>
-        <w:t xml:space="preserve">για κάθε όμιλο, η «βάση» (ο τελευταίος που μπήκε) έχει καλύτερη προτεραιότητα από τον πρώτο που έμεινε έξω·</w:t>
-      </w:r>
-    </w:p>
-    <w:p>
-      <w:pPr>
-        <w:pStyle w:val="Compact"/>
-        <w:numPr>
-          <w:ilvl w:val="1"/>
+        <w:rPr>
+          <w:b/>
+          <w:bCs/>
+        </w:rPr>
+        <w:t xml:space="preserve">Ανεξάρτητη υλοποίηση:</w:t>
+      </w:r>
+      <w:r>
+        <w:t xml:space="preserve"> </w:t>
+      </w:r>
+      <w:r>
+        <w:t xml:space="preserve">ο ίδιος αλγόριθμος υπάρχει σε JavaScript (πλατφόρμα) και σε R (offline). Σε κάθε αλλαγή του κώδικα οι δύο υλοποιήσεις τρέχουν σε τυχαία σενάρια και πρέπει να δίνουν</w:t>
+      </w:r>
+      <w:r>
+        <w:t xml:space="preserve"> </w:t>
+      </w:r>
+      <w:r>
+        <w:rPr>
+          <w:b/>
+          <w:bCs/>
+        </w:rPr>
+        <w:t xml:space="preserve">ταυτόσημα</w:t>
+      </w:r>
+      <w:r>
+        <w:t xml:space="preserve"> </w:t>
+      </w:r>
+      <w:r>
+        <w:t xml:space="preserve">αποτελέσματα και ταυτόσημη κλήρωση.</w:t>
+      </w:r>
+    </w:p>
+    <w:p>
+      <w:pPr>
+        <w:pStyle w:val="Compact"/>
+        <w:numPr>
+          <w:ilvl w:val="0"/>
           <w:numId w:val="1031"/>
-        </w:numPr>
-      </w:pPr>
-      <w:r>
-        <w:t xml:space="preserve">για κάθε μαθητή, κάθε όμιλος που έβαλε πιο ψηλά από αυτόν που πήρε ήταν γεμάτος με μαθητές καλύτερης προτεραιότητας.</w:t>
-      </w:r>
-    </w:p>
-    <w:p>
-      <w:pPr>
-        <w:pStyle w:val="Compact"/>
-        <w:numPr>
-          <w:ilvl w:val="1"/>
-          <w:numId w:val="1031"/>
-        </w:numPr>
-      </w:pPr>
-      <w:r>
-        <w:t xml:space="preserve">Το αρχείο δείχνει και τους γύρους, ανά όμιλο και ανά μαθητή, για όποιον θέλει να ξαναπαίξει την κατανομή με χαρτί και μολύβι. Οι ίδιοι έλεγχοι γίνονται και αυτόματα, ανεξάρτητα από τον κώδικα της κατανομής.</w:t>
-      </w:r>
-    </w:p>
-    <w:p>
-      <w:pPr>
-        <w:pStyle w:val="Compact"/>
-        <w:numPr>
-          <w:ilvl w:val="0"/>
-          <w:numId w:val="1030"/>
-        </w:numPr>
-      </w:pPr>
-      <w:r>
-        <w:rPr>
-          <w:b/>
-          <w:bCs/>
-        </w:rPr>
-        <w:t xml:space="preserve">Ανεξάρτητη υλοποίηση:</w:t>
-      </w:r>
-      <w:r>
-        <w:t xml:space="preserve"> </w:t>
-      </w:r>
-      <w:r>
-        <w:t xml:space="preserve">ο ίδιος αλγόριθμος υπάρχει σε JavaScript (πλατφόρμα) και σε R (offline). Σε κάθε αλλαγή του κώδικα οι δύο υλοποιήσεις τρέχουν σε τυχαία σενάρια και πρέπει να δίνουν</w:t>
-      </w:r>
-      <w:r>
-        <w:t xml:space="preserve"> </w:t>
-      </w:r>
-      <w:r>
-        <w:rPr>
-          <w:b/>
-          <w:bCs/>
-        </w:rPr>
-        <w:t xml:space="preserve">ταυτόσημα</w:t>
-      </w:r>
-      <w:r>
-        <w:t xml:space="preserve"> </w:t>
-      </w:r>
-      <w:r>
-        <w:t xml:space="preserve">αποτελέσματα και ταυτόσημη κλήρωση.</w:t>
-      </w:r>
-    </w:p>
-    <w:p>
-      <w:pPr>
-        <w:pStyle w:val="Compact"/>
-        <w:numPr>
-          <w:ilvl w:val="0"/>
-          <w:numId w:val="1030"/>
         </w:numPr>
       </w:pPr>
       <w:r>
@@ -6409,7 +6625,7 @@
         <w:pStyle w:val="Compact"/>
         <w:numPr>
           <w:ilvl w:val="0"/>
-          <w:numId w:val="1032"/>
+          <w:numId w:val="1033"/>
         </w:numPr>
       </w:pPr>
       <w:r>
@@ -6434,7 +6650,7 @@
         <w:pStyle w:val="Compact"/>
         <w:numPr>
           <w:ilvl w:val="0"/>
-          <w:numId w:val="1032"/>
+          <w:numId w:val="1033"/>
         </w:numPr>
       </w:pPr>
       <w:r>
@@ -6459,7 +6675,7 @@
         <w:pStyle w:val="Compact"/>
         <w:numPr>
           <w:ilvl w:val="0"/>
-          <w:numId w:val="1032"/>
+          <w:numId w:val="1033"/>
         </w:numPr>
       </w:pPr>
       <w:r>
@@ -6484,7 +6700,7 @@
         <w:pStyle w:val="Compact"/>
         <w:numPr>
           <w:ilvl w:val="0"/>
-          <w:numId w:val="1032"/>
+          <w:numId w:val="1033"/>
         </w:numPr>
       </w:pPr>
       <w:r>
@@ -6509,7 +6725,7 @@
         <w:pStyle w:val="Compact"/>
         <w:numPr>
           <w:ilvl w:val="0"/>
-          <w:numId w:val="1032"/>
+          <w:numId w:val="1033"/>
         </w:numPr>
       </w:pPr>
       <w:r>
@@ -6534,7 +6750,7 @@
         <w:pStyle w:val="Compact"/>
         <w:numPr>
           <w:ilvl w:val="0"/>
-          <w:numId w:val="1032"/>
+          <w:numId w:val="1033"/>
         </w:numPr>
       </w:pPr>
       <w:r>
@@ -6559,7 +6775,7 @@
         <w:pStyle w:val="Compact"/>
         <w:numPr>
           <w:ilvl w:val="0"/>
-          <w:numId w:val="1032"/>
+          <w:numId w:val="1033"/>
         </w:numPr>
       </w:pPr>
       <w:r>
@@ -6584,7 +6800,7 @@
         <w:pStyle w:val="Compact"/>
         <w:numPr>
           <w:ilvl w:val="0"/>
-          <w:numId w:val="1032"/>
+          <w:numId w:val="1033"/>
         </w:numPr>
       </w:pPr>
       <w:r>
@@ -6609,7 +6825,7 @@
         <w:pStyle w:val="Compact"/>
         <w:numPr>
           <w:ilvl w:val="0"/>
-          <w:numId w:val="1032"/>
+          <w:numId w:val="1033"/>
         </w:numPr>
       </w:pPr>
       <w:r>
@@ -6634,7 +6850,7 @@
         <w:pStyle w:val="Compact"/>
         <w:numPr>
           <w:ilvl w:val="0"/>
-          <w:numId w:val="1032"/>
+          <w:numId w:val="1033"/>
         </w:numPr>
       </w:pPr>
       <w:r>
@@ -6659,7 +6875,7 @@
         <w:pStyle w:val="Compact"/>
         <w:numPr>
           <w:ilvl w:val="0"/>
-          <w:numId w:val="1032"/>
+          <w:numId w:val="1033"/>
         </w:numPr>
       </w:pPr>
       <w:r>
@@ -6684,7 +6900,7 @@
         <w:pStyle w:val="Compact"/>
         <w:numPr>
           <w:ilvl w:val="0"/>
-          <w:numId w:val="1032"/>
+          <w:numId w:val="1033"/>
         </w:numPr>
       </w:pPr>
       <w:r>
@@ -6709,7 +6925,7 @@
         <w:pStyle w:val="Compact"/>
         <w:numPr>
           <w:ilvl w:val="0"/>
-          <w:numId w:val="1032"/>
+          <w:numId w:val="1033"/>
         </w:numPr>
       </w:pPr>
       <w:r>
@@ -6734,7 +6950,7 @@
         <w:pStyle w:val="Compact"/>
         <w:numPr>
           <w:ilvl w:val="0"/>
-          <w:numId w:val="1032"/>
+          <w:numId w:val="1033"/>
         </w:numPr>
       </w:pPr>
       <w:r>
@@ -6759,7 +6975,7 @@
         <w:pStyle w:val="Compact"/>
         <w:numPr>
           <w:ilvl w:val="0"/>
-          <w:numId w:val="1032"/>
+          <w:numId w:val="1033"/>
         </w:numPr>
       </w:pPr>
       <w:r>
@@ -6784,7 +7000,7 @@
         <w:pStyle w:val="Compact"/>
         <w:numPr>
           <w:ilvl w:val="0"/>
-          <w:numId w:val="1032"/>
+          <w:numId w:val="1033"/>
         </w:numPr>
       </w:pPr>
       <w:r>
@@ -6809,7 +7025,7 @@
         <w:pStyle w:val="Compact"/>
         <w:numPr>
           <w:ilvl w:val="0"/>
-          <w:numId w:val="1032"/>
+          <w:numId w:val="1033"/>
         </w:numPr>
       </w:pPr>
       <w:r>
@@ -6837,7 +7053,7 @@
         <w:pStyle w:val="Compact"/>
         <w:numPr>
           <w:ilvl w:val="0"/>
-          <w:numId w:val="1032"/>
+          <w:numId w:val="1033"/>
         </w:numPr>
       </w:pPr>
       <w:r>
@@ -6862,7 +7078,7 @@
         <w:pStyle w:val="Compact"/>
         <w:numPr>
           <w:ilvl w:val="0"/>
-          <w:numId w:val="1032"/>
+          <w:numId w:val="1033"/>
         </w:numPr>
       </w:pPr>
       <w:r>
@@ -6887,7 +7103,7 @@
         <w:pStyle w:val="Compact"/>
         <w:numPr>
           <w:ilvl w:val="0"/>
-          <w:numId w:val="1032"/>
+          <w:numId w:val="1033"/>
         </w:numPr>
       </w:pPr>
       <w:r>
@@ -6912,7 +7128,7 @@
         <w:pStyle w:val="Compact"/>
         <w:numPr>
           <w:ilvl w:val="0"/>
-          <w:numId w:val="1032"/>
+          <w:numId w:val="1033"/>
         </w:numPr>
       </w:pPr>
       <w:r>
@@ -6937,7 +7153,7 @@
         <w:pStyle w:val="Compact"/>
         <w:numPr>
           <w:ilvl w:val="0"/>
-          <w:numId w:val="1032"/>
+          <w:numId w:val="1033"/>
         </w:numPr>
       </w:pPr>
       <w:r>
@@ -6962,7 +7178,7 @@
         <w:pStyle w:val="Compact"/>
         <w:numPr>
           <w:ilvl w:val="0"/>
-          <w:numId w:val="1032"/>
+          <w:numId w:val="1033"/>
         </w:numPr>
       </w:pPr>
       <w:r>
@@ -6987,7 +7203,7 @@
         <w:pStyle w:val="Compact"/>
         <w:numPr>
           <w:ilvl w:val="0"/>
-          <w:numId w:val="1032"/>
+          <w:numId w:val="1033"/>
         </w:numPr>
       </w:pPr>
       <w:r>
@@ -7012,7 +7228,7 @@
         <w:pStyle w:val="Compact"/>
         <w:numPr>
           <w:ilvl w:val="0"/>
-          <w:numId w:val="1032"/>
+          <w:numId w:val="1033"/>
         </w:numPr>
       </w:pPr>
       <w:r>
@@ -7037,7 +7253,7 @@
         <w:pStyle w:val="Compact"/>
         <w:numPr>
           <w:ilvl w:val="0"/>
-          <w:numId w:val="1032"/>
+          <w:numId w:val="1033"/>
         </w:numPr>
       </w:pPr>
       <w:r>
@@ -7410,34 +7626,7 @@
     <w:abstractNumId w:val="991"/>
   </w:num>
   <w:num w:numId="1008">
-    <w:abstractNumId w:val="99411"/>
-    <w:lvlOverride w:ilvl="0">
-      <w:startOverride w:val="1"/>
-    </w:lvlOverride>
-    <w:lvlOverride w:ilvl="1">
-      <w:startOverride w:val="1"/>
-    </w:lvlOverride>
-    <w:lvlOverride w:ilvl="2">
-      <w:startOverride w:val="1"/>
-    </w:lvlOverride>
-    <w:lvlOverride w:ilvl="3">
-      <w:startOverride w:val="1"/>
-    </w:lvlOverride>
-    <w:lvlOverride w:ilvl="4">
-      <w:startOverride w:val="1"/>
-    </w:lvlOverride>
-    <w:lvlOverride w:ilvl="5">
-      <w:startOverride w:val="1"/>
-    </w:lvlOverride>
-    <w:lvlOverride w:ilvl="6">
-      <w:startOverride w:val="1"/>
-    </w:lvlOverride>
-    <w:lvlOverride w:ilvl="7">
-      <w:startOverride w:val="1"/>
-    </w:lvlOverride>
-    <w:lvlOverride w:ilvl="8">
-      <w:startOverride w:val="1"/>
-    </w:lvlOverride>
+    <w:abstractNumId w:val="991"/>
   </w:num>
   <w:num w:numId="1009">
     <w:abstractNumId w:val="99411"/>
@@ -7470,7 +7659,34 @@
     </w:lvlOverride>
   </w:num>
   <w:num w:numId="1010">
-    <w:abstractNumId w:val="991"/>
+    <w:abstractNumId w:val="99411"/>
+    <w:lvlOverride w:ilvl="0">
+      <w:startOverride w:val="1"/>
+    </w:lvlOverride>
+    <w:lvlOverride w:ilvl="1">
+      <w:startOverride w:val="1"/>
+    </w:lvlOverride>
+    <w:lvlOverride w:ilvl="2">
+      <w:startOverride w:val="1"/>
+    </w:lvlOverride>
+    <w:lvlOverride w:ilvl="3">
+      <w:startOverride w:val="1"/>
+    </w:lvlOverride>
+    <w:lvlOverride w:ilvl="4">
+      <w:startOverride w:val="1"/>
+    </w:lvlOverride>
+    <w:lvlOverride w:ilvl="5">
+      <w:startOverride w:val="1"/>
+    </w:lvlOverride>
+    <w:lvlOverride w:ilvl="6">
+      <w:startOverride w:val="1"/>
+    </w:lvlOverride>
+    <w:lvlOverride w:ilvl="7">
+      <w:startOverride w:val="1"/>
+    </w:lvlOverride>
+    <w:lvlOverride w:ilvl="8">
+      <w:startOverride w:val="1"/>
+    </w:lvlOverride>
   </w:num>
   <w:num w:numId="1011">
     <w:abstractNumId w:val="991"/>
@@ -7512,6 +7728,9 @@
     <w:abstractNumId w:val="991"/>
   </w:num>
   <w:num w:numId="1024">
+    <w:abstractNumId w:val="991"/>
+  </w:num>
+  <w:num w:numId="1025">
     <w:abstractNumId w:val="99411"/>
     <w:lvlOverride w:ilvl="0">
       <w:startOverride w:val="1"/>
@@ -7541,9 +7760,6 @@
       <w:startOverride w:val="1"/>
     </w:lvlOverride>
   </w:num>
-  <w:num w:numId="1025">
-    <w:abstractNumId w:val="991"/>
-  </w:num>
   <w:num w:numId="1026">
     <w:abstractNumId w:val="991"/>
   </w:num>
@@ -7551,6 +7767,9 @@
     <w:abstractNumId w:val="991"/>
   </w:num>
   <w:num w:numId="1028">
+    <w:abstractNumId w:val="991"/>
+  </w:num>
+  <w:num w:numId="1029">
     <w:abstractNumId w:val="99411"/>
     <w:lvlOverride w:ilvl="0">
       <w:startOverride w:val="1"/>
@@ -7580,9 +7799,6 @@
       <w:startOverride w:val="1"/>
     </w:lvlOverride>
   </w:num>
-  <w:num w:numId="1029">
-    <w:abstractNumId w:val="991"/>
-  </w:num>
   <w:num w:numId="1030">
     <w:abstractNumId w:val="991"/>
   </w:num>
@@ -7590,6 +7806,9 @@
     <w:abstractNumId w:val="991"/>
   </w:num>
   <w:num w:numId="1032">
+    <w:abstractNumId w:val="991"/>
+  </w:num>
+  <w:num w:numId="1033">
     <w:abstractNumId w:val="991"/>
   </w:num>
 </w:numbering>

</xml_diff>